<commit_message>
Add IMS StepUp SA project to portfolio
</commit_message>
<xml_diff>
--- a/public/Sihle_Kalolo_CV.docx
+++ b/public/Sihle_Kalolo_CV.docx
@@ -1,136 +1,106 @@
 
 <file path=word/document.xml><?xml version="1.0" encoding="utf-8"?>
-<w:document xmlns:mc="http://schemas.openxmlformats.org/markup-compatibility/2006" xmlns:o="urn:schemas-microsoft-com:office:office" xmlns:r="http://schemas.openxmlformats.org/officeDocument/2006/relationships" xmlns:m="http://schemas.openxmlformats.org/officeDocument/2006/math" xmlns:v="urn:schemas-microsoft-com:vml" xmlns:wp="http://schemas.openxmlformats.org/drawingml/2006/wordprocessingDrawing" xmlns:w10="urn:schemas-microsoft-com:office:word" xmlns:w="http://schemas.openxmlformats.org/wordprocessingml/2006/main" xmlns:wne="http://schemas.microsoft.com/office/word/2006/wordml" xmlns:sl="http://schemas.openxmlformats.org/schemaLibrary/2006/main" xmlns:a="http://schemas.openxmlformats.org/drawingml/2006/main" xmlns:pic="http://schemas.openxmlformats.org/drawingml/2006/picture" xmlns:c="http://schemas.openxmlformats.org/drawingml/2006/chart" xmlns:lc="http://schemas.openxmlformats.org/drawingml/2006/lockedCanvas" xmlns:dgm="http://schemas.openxmlformats.org/drawingml/2006/diagram" xmlns:wps="http://schemas.microsoft.com/office/word/2010/wordprocessingShape" xmlns:wpg="http://schemas.microsoft.com/office/word/2010/wordprocessingGroup" xmlns:w14="http://schemas.microsoft.com/office/word/2010/wordml" xmlns:w15="http://schemas.microsoft.com/office/word/2012/wordml" xmlns:w16="http://schemas.microsoft.com/office/word/2018/wordml" xmlns:w16cex="http://schemas.microsoft.com/office/word/2018/wordml/cex" xmlns:w16cid="http://schemas.microsoft.com/office/word/2016/wordml/cid" xmlns="http://schemas.microsoft.com/office/tasks/2019/documenttasks" xmlns:cr="http://schemas.microsoft.com/office/comments/2020/reactions">
+<w:document xmlns:wpc="http://schemas.microsoft.com/office/word/2010/wordprocessingCanvas" xmlns:cx="http://schemas.microsoft.com/office/drawing/2014/chartex" xmlns:cx1="http://schemas.microsoft.com/office/drawing/2015/9/8/chartex" xmlns:cx2="http://schemas.microsoft.com/office/drawing/2015/10/21/chartex" xmlns:cx3="http://schemas.microsoft.com/office/drawing/2016/5/9/chartex" xmlns:cx4="http://schemas.microsoft.com/office/drawing/2016/5/10/chartex" xmlns:cx5="http://schemas.microsoft.com/office/drawing/2016/5/11/chartex" xmlns:cx6="http://schemas.microsoft.com/office/drawing/2016/5/12/chartex" xmlns:cx7="http://schemas.microsoft.com/office/drawing/2016/5/13/chartex" xmlns:cx8="http://schemas.microsoft.com/office/drawing/2016/5/14/chartex" xmlns:mc="http://schemas.openxmlformats.org/markup-compatibility/2006" xmlns:aink="http://schemas.microsoft.com/office/drawing/2016/ink" xmlns:am3d="http://schemas.microsoft.com/office/drawing/2017/model3d" xmlns:o="urn:schemas-microsoft-com:office:office" xmlns:oel="http://schemas.microsoft.com/office/2019/extlst" xmlns:r="http://schemas.openxmlformats.org/officeDocument/2006/relationships" xmlns:m="http://schemas.openxmlformats.org/officeDocument/2006/math" xmlns:v="urn:schemas-microsoft-com:vml" xmlns:wp14="http://schemas.microsoft.com/office/word/2010/wordprocessingDrawing" xmlns:wp="http://schemas.openxmlformats.org/drawingml/2006/wordprocessingDrawing" xmlns:w10="urn:schemas-microsoft-com:office:word" xmlns:w="http://schemas.openxmlformats.org/wordprocessingml/2006/main" xmlns:w14="http://schemas.microsoft.com/office/word/2010/wordml" xmlns:w15="http://schemas.microsoft.com/office/word/2012/wordml" xmlns:w16cex="http://schemas.microsoft.com/office/word/2018/wordml/cex" xmlns:w16cid="http://schemas.microsoft.com/office/word/2016/wordml/cid" xmlns:w16="http://schemas.microsoft.com/office/word/2018/wordml" xmlns:w16du="http://schemas.microsoft.com/office/word/2023/wordml/word16du" xmlns:w16sdtdh="http://schemas.microsoft.com/office/word/2020/wordml/sdtdatahash" xmlns:w16sdtfl="http://schemas.microsoft.com/office/word/2024/wordml/sdtformatlock" xmlns:w16se="http://schemas.microsoft.com/office/word/2015/wordml/symex" xmlns:wpg="http://schemas.microsoft.com/office/word/2010/wordprocessingGroup" xmlns:wpi="http://schemas.microsoft.com/office/word/2010/wordprocessingInk" xmlns:wne="http://schemas.microsoft.com/office/word/2006/wordml" xmlns:wps="http://schemas.microsoft.com/office/word/2010/wordprocessingShape" mc:Ignorable="w14 w15 w16se w16cid w16 w16cex w16sdtdh w16sdtfl w16du wp14">
   <w:body>
     <w:p>
       <w:pPr>
         <w:pStyle w:val="Heading1"/>
         <w:keepNext w:val="0"/>
         <w:keepLines w:val="0"/>
-        <w:spacing w:after="120" w:before="480" w:line="240" w:lineRule="auto"/>
-        <w:ind w:left="0" w:firstLine="0"/>
-        <w:rPr>
-          <w:rFonts w:ascii="Arial" w:cs="Arial" w:eastAsia="Arial" w:hAnsi="Arial"/>
+        <w:spacing w:before="480" w:after="120" w:line="240" w:lineRule="auto"/>
+        <w:rPr>
+          <w:rFonts w:ascii="Arial" w:eastAsia="Arial" w:hAnsi="Arial" w:cs="Arial"/>
           <w:color w:val="000000"/>
           <w:sz w:val="46"/>
           <w:szCs w:val="46"/>
         </w:rPr>
       </w:pPr>
-      <w:bookmarkStart w:colFirst="0" w:colLast="0" w:name="_heading=h.nhtvza1qga7h" w:id="0"/>
+      <w:bookmarkStart w:id="0" w:name="_heading=h.nhtvza1qga7h" w:colFirst="0" w:colLast="0"/>
       <w:bookmarkEnd w:id="0"/>
       <w:r>
         <w:rPr>
-          <w:rFonts w:ascii="Arial" w:cs="Arial" w:eastAsia="Arial" w:hAnsi="Arial"/>
+          <w:rFonts w:ascii="Arial" w:eastAsia="Arial" w:hAnsi="Arial" w:cs="Arial"/>
           <w:color w:val="000000"/>
           <w:sz w:val="46"/>
           <w:szCs w:val="46"/>
-          <w:rtl w:val="0"/>
-        </w:rPr>
-        <w:t xml:space="preserve">SIHLE KALOLO</w:t>
-      </w:r>
-    </w:p>
-    <w:p>
-      <w:pPr>
-        <w:keepNext w:val="1"/>
-        <w:spacing w:after="240" w:before="0" w:line="240" w:lineRule="auto"/>
-        <w:rPr/>
-      </w:pPr>
-      <w:r>
-        <w:rPr>
-          <w:rtl w:val="0"/>
-        </w:rPr>
-        <w:t xml:space="preserve">South Africa (On-site / Hybrid / Remote Ready)</w:t>
-        <w:br w:type="textWrapping"/>
-        <w:t xml:space="preserve">+27 63 433 2340</w:t>
-        <w:br w:type="textWrapping"/>
+        </w:rPr>
+        <w:t>SIHLE KALOLO</w:t>
+      </w:r>
+    </w:p>
+    <w:p>
+      <w:pPr>
+        <w:keepNext/>
+        <w:spacing w:after="240" w:line="240" w:lineRule="auto"/>
+      </w:pPr>
+      <w:r>
+        <w:t>South Africa (On-site / Hybrid / Remote Ready)</w:t>
+      </w:r>
+      <w:r>
+        <w:br/>
+        <w:t>+27 63 433 2340</w:t>
+      </w:r>
+      <w:r>
+        <w:br/>
+      </w:r>
+      <w:hyperlink r:id="rId6">
+        <w:r>
+          <w:rPr>
+            <w:color w:val="1155CC"/>
+            <w:u w:val="single"/>
+          </w:rPr>
+          <w:t>kalolohlesi@gmail.com</w:t>
+        </w:r>
+      </w:hyperlink>
+    </w:p>
+    <w:p>
+      <w:pPr>
+        <w:keepNext/>
+        <w:spacing w:after="240" w:line="240" w:lineRule="auto"/>
+        <w:rPr>
+          <w:color w:val="1155CC"/>
+          <w:u w:val="single"/>
+        </w:rPr>
+      </w:pPr>
+      <w:r>
+        <w:t>Portfolio:</w:t>
       </w:r>
       <w:hyperlink r:id="rId7">
         <w:r>
           <w:rPr>
-            <w:color w:val="1155cc"/>
+            <w:color w:val="1155CC"/>
             <w:u w:val="single"/>
-            <w:rtl w:val="0"/>
           </w:rPr>
-          <w:t xml:space="preserve">kalolohlesi@gmail.com</w:t>
+          <w:t>https://sihle-kalolo-portfolio-b8a92czy0-kalolohlesi-5041s-projects.vercel.app/</w:t>
         </w:r>
       </w:hyperlink>
       <w:r>
-        <w:rPr>
-          <w:rtl w:val="0"/>
-        </w:rPr>
-      </w:r>
-    </w:p>
-    <w:p>
-      <w:pPr>
-        <w:keepNext w:val="1"/>
-        <w:spacing w:after="240" w:before="0" w:line="240" w:lineRule="auto"/>
-        <w:rPr>
-          <w:color w:val="1155cc"/>
-          <w:u w:val="single"/>
-        </w:rPr>
-      </w:pPr>
-      <w:r>
-        <w:rPr>
-          <w:rtl w:val="0"/>
-        </w:rPr>
-        <w:t xml:space="preserve">Portfolio:</w:t>
+        <w:br/>
+        <w:t>GitHub:</w:t>
       </w:r>
       <w:hyperlink r:id="rId8">
         <w:r>
-          <w:rPr>
-            <w:color w:val="1155cc"/>
-            <w:u w:val="single"/>
-            <w:rtl w:val="0"/>
-          </w:rPr>
-          <w:t xml:space="preserve">https://sihle-kalolo-portfolio-b8a92czy0-kalolohlesi-5041s-projects.vercel.app/</w:t>
+          <w:t xml:space="preserve"> </w:t>
         </w:r>
       </w:hyperlink>
-      <w:r>
-        <w:rPr>
-          <w:rtl w:val="0"/>
-        </w:rPr>
-        <w:br w:type="textWrapping"/>
-        <w:t xml:space="preserve">GitHub:</w:t>
-      </w:r>
       <w:hyperlink r:id="rId9">
         <w:r>
           <w:rPr>
-            <w:rtl w:val="0"/>
+            <w:color w:val="1155CC"/>
+            <w:u w:val="single"/>
           </w:rPr>
-          <w:t xml:space="preserve"> </w:t>
+          <w:t>https://github.com/Toni8</w:t>
         </w:r>
       </w:hyperlink>
-      <w:hyperlink r:id="rId10">
-        <w:r>
-          <w:rPr>
-            <w:color w:val="1155cc"/>
-            <w:u w:val="single"/>
-            <w:rtl w:val="0"/>
-          </w:rPr>
-          <w:t xml:space="preserve">https://github.com/Toni8</w:t>
-        </w:r>
-      </w:hyperlink>
-      <w:r>
-        <w:rPr>
-          <w:rtl w:val="0"/>
-        </w:rPr>
-      </w:r>
     </w:p>
     <w:p>
       <w:pPr>
         <w:spacing w:after="0" w:line="240" w:lineRule="auto"/>
         <w:ind w:left="720" w:hanging="360"/>
-        <w:rPr/>
-      </w:pPr>
-      <w:r>
-        <w:pict>
-          <v:rect style="width:0.0pt;height:1.5pt" o:hr="t" o:hrstd="t" o:hralign="center" fillcolor="#A0A0A0" stroked="f"/>
+      </w:pPr>
+      <w:r>
+        <w:pict w14:anchorId="24E1A7A4">
+          <v:rect id="_x0000_i1025" style="width:0;height:1.5pt" o:hralign="center" o:hrstd="t" o:hr="t" fillcolor="#a0a0a0" stroked="f"/>
         </w:pict>
-      </w:r>
-      <w:r>
-        <w:rPr>
-          <w:rtl w:val="0"/>
-        </w:rPr>
       </w:r>
     </w:p>
     <w:p>
@@ -139,66 +109,50 @@
         <w:keepNext w:val="0"/>
         <w:keepLines w:val="0"/>
         <w:spacing w:before="360" w:line="240" w:lineRule="auto"/>
-        <w:ind w:left="0" w:firstLine="0"/>
-        <w:rPr>
-          <w:rFonts w:ascii="Arial" w:cs="Arial" w:eastAsia="Arial" w:hAnsi="Arial"/>
+        <w:rPr>
+          <w:rFonts w:ascii="Arial" w:eastAsia="Arial" w:hAnsi="Arial" w:cs="Arial"/>
           <w:color w:val="000000"/>
           <w:sz w:val="34"/>
           <w:szCs w:val="34"/>
         </w:rPr>
       </w:pPr>
-      <w:bookmarkStart w:colFirst="0" w:colLast="0" w:name="_heading=h.ous9pj7hwfvh" w:id="1"/>
+      <w:bookmarkStart w:id="1" w:name="_heading=h.ous9pj7hwfvh" w:colFirst="0" w:colLast="0"/>
       <w:bookmarkEnd w:id="1"/>
       <w:r>
         <w:rPr>
-          <w:rFonts w:ascii="Arial" w:cs="Arial" w:eastAsia="Arial" w:hAnsi="Arial"/>
+          <w:rFonts w:ascii="Arial" w:eastAsia="Arial" w:hAnsi="Arial" w:cs="Arial"/>
           <w:color w:val="000000"/>
           <w:sz w:val="34"/>
           <w:szCs w:val="34"/>
-          <w:rtl w:val="0"/>
-        </w:rPr>
-        <w:t xml:space="preserve">PROFESSIONAL SUMMARY</w:t>
-      </w:r>
-    </w:p>
-    <w:p>
-      <w:pPr>
-        <w:spacing w:after="240" w:before="240" w:line="240" w:lineRule="auto"/>
-        <w:rPr/>
-      </w:pPr>
-      <w:r>
-        <w:rPr>
-          <w:rtl w:val="0"/>
-        </w:rPr>
-        <w:t xml:space="preserve">Passionate and industry-experienced Data Analyst &amp; Data Scientist with professional data analytics experience and proven expertise in training, mentoring, and simplifying complex technical concepts. Strong proficiency in SQL, Excel, Power BI, and Python, with hands-on experience delivering real-world data projects involving large datasets (1.5M+ records).</w:t>
-      </w:r>
-    </w:p>
-    <w:p>
-      <w:pPr>
-        <w:spacing w:after="240" w:before="240" w:line="240" w:lineRule="auto"/>
-        <w:rPr/>
-      </w:pPr>
-      <w:r>
-        <w:rPr>
-          <w:rtl w:val="0"/>
-        </w:rPr>
-        <w:t xml:space="preserve">Experienced in conducting live sessions, facilitating workshops, mentoring learners, and guiding students through practical projects aligned with industry standards. Committed to building confident, job-ready data analysts through structured learning, clear communication, and practical application.</w:t>
+        </w:rPr>
+        <w:t>PROFESSIONAL SUMMARY</w:t>
+      </w:r>
+    </w:p>
+    <w:p>
+      <w:pPr>
+        <w:spacing w:before="240" w:after="240" w:line="240" w:lineRule="auto"/>
+      </w:pPr>
+      <w:r>
+        <w:t>Motivated and hands-on Data Analyst &amp; aspiring Data Scientist with practical experience building and deploying real world data solutions. Strong foundation in Python, SQL, and problem-solving, with a focus on writing clean, efficient code and delivering working solutions.</w:t>
+      </w:r>
+    </w:p>
+    <w:p>
+      <w:pPr>
+        <w:spacing w:before="240" w:after="240" w:line="240" w:lineRule="auto"/>
+      </w:pPr>
+      <w:r>
+        <w:t>Completed a Data Science qualification and gained industry exposure through Sand Technology, working on production-level data projects. Thrives in fast-paced, execution-driven environments and eager to contribute to real engineering teams while continuously improving through building and feedback.</w:t>
       </w:r>
     </w:p>
     <w:p>
       <w:pPr>
         <w:spacing w:after="0" w:line="240" w:lineRule="auto"/>
         <w:ind w:left="720" w:hanging="360"/>
-        <w:rPr/>
-      </w:pPr>
-      <w:r>
-        <w:pict>
-          <v:rect style="width:0.0pt;height:1.5pt" o:hr="t" o:hrstd="t" o:hralign="center" fillcolor="#A0A0A0" stroked="f"/>
+      </w:pPr>
+      <w:r>
+        <w:pict w14:anchorId="3E78D50E">
+          <v:rect id="_x0000_i1026" style="width:0;height:1.5pt" o:hralign="center" o:hrstd="t" o:hr="t" fillcolor="#a0a0a0" stroked="f"/>
         </w:pict>
-      </w:r>
-      <w:r>
-        <w:rPr>
-          <w:rtl w:val="0"/>
-        </w:rPr>
       </w:r>
     </w:p>
     <w:p>
@@ -207,25 +161,23 @@
         <w:keepNext w:val="0"/>
         <w:keepLines w:val="0"/>
         <w:spacing w:before="360" w:line="240" w:lineRule="auto"/>
-        <w:ind w:left="0" w:firstLine="0"/>
-        <w:rPr>
-          <w:rFonts w:ascii="Arial" w:cs="Arial" w:eastAsia="Arial" w:hAnsi="Arial"/>
+        <w:rPr>
+          <w:rFonts w:ascii="Arial" w:eastAsia="Arial" w:hAnsi="Arial" w:cs="Arial"/>
           <w:color w:val="000000"/>
           <w:sz w:val="34"/>
           <w:szCs w:val="34"/>
         </w:rPr>
       </w:pPr>
-      <w:bookmarkStart w:colFirst="0" w:colLast="0" w:name="_heading=h.mo69vg26kgkp" w:id="2"/>
+      <w:bookmarkStart w:id="2" w:name="_heading=h.mo69vg26kgkp" w:colFirst="0" w:colLast="0"/>
       <w:bookmarkEnd w:id="2"/>
       <w:r>
         <w:rPr>
-          <w:rFonts w:ascii="Arial" w:cs="Arial" w:eastAsia="Arial" w:hAnsi="Arial"/>
+          <w:rFonts w:ascii="Arial" w:eastAsia="Arial" w:hAnsi="Arial" w:cs="Arial"/>
           <w:color w:val="000000"/>
           <w:sz w:val="34"/>
           <w:szCs w:val="34"/>
-          <w:rtl w:val="0"/>
-        </w:rPr>
-        <w:t xml:space="preserve">TECHNICAL SKILLS</w:t>
+        </w:rPr>
+        <w:t>TECHNICAL SKILLS</w:t>
       </w:r>
     </w:p>
     <w:p>
@@ -236,23 +188,22 @@
         <w:spacing w:before="280" w:line="240" w:lineRule="auto"/>
         <w:ind w:left="720" w:hanging="360"/>
         <w:rPr>
-          <w:rFonts w:ascii="Arial" w:cs="Arial" w:eastAsia="Arial" w:hAnsi="Arial"/>
+          <w:rFonts w:ascii="Arial" w:eastAsia="Arial" w:hAnsi="Arial" w:cs="Arial"/>
           <w:color w:val="000000"/>
           <w:sz w:val="26"/>
           <w:szCs w:val="26"/>
         </w:rPr>
       </w:pPr>
-      <w:bookmarkStart w:colFirst="0" w:colLast="0" w:name="_heading=h.6r0be99xu4ht" w:id="3"/>
+      <w:bookmarkStart w:id="3" w:name="_heading=h.6r0be99xu4ht" w:colFirst="0" w:colLast="0"/>
       <w:bookmarkEnd w:id="3"/>
       <w:r>
         <w:rPr>
-          <w:rFonts w:ascii="Arial" w:cs="Arial" w:eastAsia="Arial" w:hAnsi="Arial"/>
+          <w:rFonts w:ascii="Arial" w:eastAsia="Arial" w:hAnsi="Arial" w:cs="Arial"/>
           <w:color w:val="000000"/>
           <w:sz w:val="26"/>
           <w:szCs w:val="26"/>
-          <w:rtl w:val="0"/>
-        </w:rPr>
-        <w:t xml:space="preserve">Data Analysis Tools</w:t>
+        </w:rPr>
+        <w:t>Data Analysis Tools</w:t>
       </w:r>
     </w:p>
     <w:p>
@@ -261,15 +212,10 @@
           <w:ilvl w:val="0"/>
           <w:numId w:val="7"/>
         </w:numPr>
-        <w:spacing w:after="0" w:afterAutospacing="0" w:before="240" w:line="240" w:lineRule="auto"/>
-        <w:ind w:left="720" w:hanging="360"/>
-        <w:rPr/>
-      </w:pPr>
-      <w:r>
-        <w:rPr>
-          <w:rtl w:val="0"/>
-        </w:rPr>
-        <w:t xml:space="preserve">SQL (joins, subqueries, CTEs, window functions)</w:t>
+        <w:spacing w:before="240" w:after="0" w:line="240" w:lineRule="auto"/>
+      </w:pPr>
+      <w:r>
+        <w:t>SQL (joins, subqueries, CTEs, window functions)</w:t>
       </w:r>
     </w:p>
     <w:p>
@@ -278,15 +224,10 @@
           <w:ilvl w:val="0"/>
           <w:numId w:val="7"/>
         </w:numPr>
-        <w:spacing w:after="0" w:afterAutospacing="0" w:before="0" w:beforeAutospacing="0" w:line="240" w:lineRule="auto"/>
-        <w:ind w:left="720" w:hanging="360"/>
-        <w:rPr/>
-      </w:pPr>
-      <w:r>
-        <w:rPr>
-          <w:rtl w:val="0"/>
-        </w:rPr>
-        <w:t xml:space="preserve">Excel (PivotTables, XLOOKUP, dashboards, data cleaning)</w:t>
+        <w:spacing w:after="0" w:line="240" w:lineRule="auto"/>
+      </w:pPr>
+      <w:r>
+        <w:t>Excel (PivotTables, XLOOKUP, dashboards, data cleaning)</w:t>
       </w:r>
     </w:p>
     <w:p>
@@ -295,15 +236,10 @@
           <w:ilvl w:val="0"/>
           <w:numId w:val="7"/>
         </w:numPr>
-        <w:spacing w:after="0" w:afterAutospacing="0" w:before="0" w:beforeAutospacing="0" w:line="240" w:lineRule="auto"/>
-        <w:ind w:left="720" w:hanging="360"/>
-        <w:rPr/>
-      </w:pPr>
-      <w:r>
-        <w:rPr>
-          <w:rtl w:val="0"/>
-        </w:rPr>
-        <w:t xml:space="preserve">Power BI (Dashboards, KPIs, DAX basics, business reporting)</w:t>
+        <w:spacing w:after="0" w:line="240" w:lineRule="auto"/>
+      </w:pPr>
+      <w:r>
+        <w:t>Power BI (Dashboards, KPIs, DAX basics, business reporting)</w:t>
       </w:r>
     </w:p>
     <w:p>
@@ -312,15 +248,10 @@
           <w:ilvl w:val="0"/>
           <w:numId w:val="7"/>
         </w:numPr>
-        <w:spacing w:after="0" w:afterAutospacing="0" w:before="0" w:beforeAutospacing="0" w:line="240" w:lineRule="auto"/>
-        <w:ind w:left="720" w:hanging="360"/>
-        <w:rPr/>
-      </w:pPr>
-      <w:r>
-        <w:rPr>
-          <w:rtl w:val="0"/>
-        </w:rPr>
-        <w:t xml:space="preserve">Python (Pandas, NumPy, EDA, data cleaning)</w:t>
+        <w:spacing w:after="0" w:line="240" w:lineRule="auto"/>
+      </w:pPr>
+      <w:r>
+        <w:t>Python (Pandas, NumPy, EDA, data cleaning)</w:t>
       </w:r>
     </w:p>
     <w:p>
@@ -329,25 +260,15 @@
           <w:ilvl w:val="0"/>
           <w:numId w:val="7"/>
         </w:numPr>
-        <w:spacing w:after="240" w:before="0" w:beforeAutospacing="0" w:line="240" w:lineRule="auto"/>
-        <w:ind w:left="720" w:hanging="360"/>
-        <w:rPr>
-          <w:u w:val="none"/>
-        </w:rPr>
-      </w:pPr>
-      <w:r>
-        <w:rPr>
-          <w:rFonts w:ascii="Roboto" w:cs="Roboto" w:eastAsia="Roboto" w:hAnsi="Roboto"/>
-          <w:color w:val="0f1115"/>
+        <w:spacing w:after="240" w:line="240" w:lineRule="auto"/>
+      </w:pPr>
+      <w:r>
+        <w:rPr>
+          <w:rFonts w:eastAsia="Roboto"/>
+          <w:color w:val="0F1115"/>
           <w:highlight w:val="white"/>
-          <w:rtl w:val="0"/>
-        </w:rPr>
-        <w:t xml:space="preserve">Data Validation &amp; Quality Assurance</w:t>
-      </w:r>
-      <w:r>
-        <w:rPr>
-          <w:rtl w:val="0"/>
-        </w:rPr>
+        </w:rPr>
+        <w:t>Data Validation &amp; Quality Assurance</w:t>
       </w:r>
     </w:p>
     <w:p>
@@ -358,23 +279,22 @@
         <w:spacing w:before="280" w:line="240" w:lineRule="auto"/>
         <w:ind w:left="720" w:hanging="360"/>
         <w:rPr>
-          <w:rFonts w:ascii="Arial" w:cs="Arial" w:eastAsia="Arial" w:hAnsi="Arial"/>
+          <w:rFonts w:ascii="Arial" w:eastAsia="Arial" w:hAnsi="Arial" w:cs="Arial"/>
           <w:color w:val="000000"/>
           <w:sz w:val="26"/>
           <w:szCs w:val="26"/>
         </w:rPr>
       </w:pPr>
-      <w:bookmarkStart w:colFirst="0" w:colLast="0" w:name="_heading=h.u6lylnfmzqn6" w:id="4"/>
+      <w:bookmarkStart w:id="4" w:name="_heading=h.u6lylnfmzqn6" w:colFirst="0" w:colLast="0"/>
       <w:bookmarkEnd w:id="4"/>
       <w:r>
         <w:rPr>
-          <w:rFonts w:ascii="Arial" w:cs="Arial" w:eastAsia="Arial" w:hAnsi="Arial"/>
+          <w:rFonts w:ascii="Arial" w:eastAsia="Arial" w:hAnsi="Arial" w:cs="Arial"/>
           <w:color w:val="000000"/>
           <w:sz w:val="26"/>
           <w:szCs w:val="26"/>
-          <w:rtl w:val="0"/>
-        </w:rPr>
-        <w:t xml:space="preserve">Data Concepts</w:t>
+        </w:rPr>
+        <w:t>Data Concepts</w:t>
       </w:r>
     </w:p>
     <w:p>
@@ -383,15 +303,10 @@
           <w:ilvl w:val="0"/>
           <w:numId w:val="3"/>
         </w:numPr>
-        <w:spacing w:after="0" w:afterAutospacing="0" w:before="240" w:line="240" w:lineRule="auto"/>
-        <w:ind w:left="720" w:hanging="360"/>
-        <w:rPr/>
-      </w:pPr>
-      <w:r>
-        <w:rPr>
-          <w:rtl w:val="0"/>
-        </w:rPr>
-        <w:t xml:space="preserve">Data Cleaning &amp; Transformation</w:t>
+        <w:spacing w:before="240" w:after="0" w:line="240" w:lineRule="auto"/>
+      </w:pPr>
+      <w:r>
+        <w:t>Data Cleaning &amp; Transformation</w:t>
       </w:r>
     </w:p>
     <w:p>
@@ -400,15 +315,10 @@
           <w:ilvl w:val="0"/>
           <w:numId w:val="3"/>
         </w:numPr>
-        <w:spacing w:after="0" w:afterAutospacing="0" w:before="0" w:beforeAutospacing="0" w:line="240" w:lineRule="auto"/>
-        <w:ind w:left="720" w:hanging="360"/>
-        <w:rPr/>
-      </w:pPr>
-      <w:r>
-        <w:rPr>
-          <w:rtl w:val="0"/>
-        </w:rPr>
-        <w:t xml:space="preserve">Exploratory Data Analysis (EDA)</w:t>
+        <w:spacing w:after="0" w:line="240" w:lineRule="auto"/>
+      </w:pPr>
+      <w:r>
+        <w:t>Exploratory Data Analysis (EDA)</w:t>
       </w:r>
     </w:p>
     <w:p>
@@ -417,15 +327,10 @@
           <w:ilvl w:val="0"/>
           <w:numId w:val="3"/>
         </w:numPr>
-        <w:spacing w:after="0" w:afterAutospacing="0" w:before="0" w:beforeAutospacing="0" w:line="240" w:lineRule="auto"/>
-        <w:ind w:left="720" w:hanging="360"/>
-        <w:rPr/>
-      </w:pPr>
-      <w:r>
-        <w:rPr>
-          <w:rtl w:val="0"/>
-        </w:rPr>
-        <w:t xml:space="preserve">KPI Development &amp; Business Reporting</w:t>
+        <w:spacing w:after="0" w:line="240" w:lineRule="auto"/>
+      </w:pPr>
+      <w:r>
+        <w:t>KPI Development &amp; Business Reporting</w:t>
       </w:r>
     </w:p>
     <w:p>
@@ -434,15 +339,10 @@
           <w:ilvl w:val="0"/>
           <w:numId w:val="3"/>
         </w:numPr>
-        <w:spacing w:after="0" w:afterAutospacing="0" w:before="0" w:beforeAutospacing="0" w:line="240" w:lineRule="auto"/>
-        <w:ind w:left="720" w:hanging="360"/>
-        <w:rPr/>
-      </w:pPr>
-      <w:r>
-        <w:rPr>
-          <w:rtl w:val="0"/>
-        </w:rPr>
-        <w:t xml:space="preserve">Dashboard Design &amp; Data Storytelling</w:t>
+        <w:spacing w:after="0" w:line="240" w:lineRule="auto"/>
+      </w:pPr>
+      <w:r>
+        <w:t>Dashboard Design &amp; Data Storytelling</w:t>
       </w:r>
     </w:p>
     <w:p>
@@ -451,19 +351,17 @@
           <w:ilvl w:val="0"/>
           <w:numId w:val="3"/>
         </w:numPr>
-        <w:shd w:fill="ffffff" w:val="clear"/>
-        <w:spacing w:after="0" w:afterAutospacing="0" w:before="0" w:beforeAutospacing="0" w:line="240" w:lineRule="auto"/>
-        <w:ind w:left="720" w:hanging="360"/>
-        <w:rPr>
-          <w:color w:val="0f1115"/>
-        </w:rPr>
-      </w:pPr>
-      <w:r>
-        <w:rPr>
-          <w:color w:val="0f1115"/>
-          <w:rtl w:val="0"/>
-        </w:rPr>
-        <w:t xml:space="preserve">Predictive Model Development (87% accuracy)</w:t>
+        <w:shd w:val="clear" w:color="auto" w:fill="FFFFFF"/>
+        <w:spacing w:after="0" w:line="240" w:lineRule="auto"/>
+        <w:rPr>
+          <w:color w:val="0F1115"/>
+        </w:rPr>
+      </w:pPr>
+      <w:r>
+        <w:rPr>
+          <w:color w:val="0F1115"/>
+        </w:rPr>
+        <w:t>Predictive Model Development</w:t>
       </w:r>
     </w:p>
     <w:p>
@@ -472,19 +370,17 @@
           <w:ilvl w:val="0"/>
           <w:numId w:val="3"/>
         </w:numPr>
-        <w:shd w:fill="ffffff" w:val="clear"/>
-        <w:spacing w:after="0" w:afterAutospacing="0" w:before="0" w:beforeAutospacing="0" w:line="240" w:lineRule="auto"/>
-        <w:ind w:left="720" w:hanging="360"/>
-        <w:rPr>
-          <w:color w:val="0f1115"/>
-        </w:rPr>
-      </w:pPr>
-      <w:r>
-        <w:rPr>
-          <w:color w:val="0f1115"/>
-          <w:rtl w:val="0"/>
-        </w:rPr>
-        <w:t xml:space="preserve">Model Training &amp; Selection</w:t>
+        <w:shd w:val="clear" w:color="auto" w:fill="FFFFFF"/>
+        <w:spacing w:after="0" w:line="240" w:lineRule="auto"/>
+        <w:rPr>
+          <w:color w:val="0F1115"/>
+        </w:rPr>
+      </w:pPr>
+      <w:r>
+        <w:rPr>
+          <w:color w:val="0F1115"/>
+        </w:rPr>
+        <w:t>Model Training &amp; Selection</w:t>
       </w:r>
     </w:p>
     <w:p>
@@ -493,19 +389,17 @@
           <w:ilvl w:val="0"/>
           <w:numId w:val="3"/>
         </w:numPr>
-        <w:shd w:fill="ffffff" w:val="clear"/>
-        <w:spacing w:after="0" w:afterAutospacing="0" w:before="0" w:beforeAutospacing="0" w:line="240" w:lineRule="auto"/>
-        <w:ind w:left="720" w:hanging="360"/>
-        <w:rPr>
-          <w:color w:val="0f1115"/>
-        </w:rPr>
-      </w:pPr>
-      <w:r>
-        <w:rPr>
-          <w:color w:val="0f1115"/>
-          <w:rtl w:val="0"/>
-        </w:rPr>
-        <w:t xml:space="preserve">Feature Engineering</w:t>
+        <w:shd w:val="clear" w:color="auto" w:fill="FFFFFF"/>
+        <w:spacing w:after="0" w:line="240" w:lineRule="auto"/>
+        <w:rPr>
+          <w:color w:val="0F1115"/>
+        </w:rPr>
+      </w:pPr>
+      <w:r>
+        <w:rPr>
+          <w:color w:val="0F1115"/>
+        </w:rPr>
+        <w:t>Feature Engineering</w:t>
       </w:r>
     </w:p>
     <w:p>
@@ -514,19 +408,17 @@
           <w:ilvl w:val="0"/>
           <w:numId w:val="3"/>
         </w:numPr>
-        <w:shd w:fill="ffffff" w:val="clear"/>
-        <w:spacing w:after="0" w:afterAutospacing="0" w:before="0" w:beforeAutospacing="0" w:line="240" w:lineRule="auto"/>
-        <w:ind w:left="720" w:hanging="360"/>
-        <w:rPr>
-          <w:color w:val="0f1115"/>
-        </w:rPr>
-      </w:pPr>
-      <w:r>
-        <w:rPr>
-          <w:color w:val="0f1115"/>
-          <w:rtl w:val="0"/>
-        </w:rPr>
-        <w:t xml:space="preserve">Evaluation Metrics (precision, recall, F1, RMSE)</w:t>
+        <w:shd w:val="clear" w:color="auto" w:fill="FFFFFF"/>
+        <w:spacing w:after="0" w:line="240" w:lineRule="auto"/>
+        <w:rPr>
+          <w:color w:val="0F1115"/>
+        </w:rPr>
+      </w:pPr>
+      <w:r>
+        <w:rPr>
+          <w:color w:val="0F1115"/>
+        </w:rPr>
+        <w:t>Evaluation Metrics (precision, recall, F1, RMSE)</w:t>
       </w:r>
     </w:p>
     <w:p>
@@ -535,24 +427,17 @@
           <w:ilvl w:val="0"/>
           <w:numId w:val="3"/>
         </w:numPr>
-        <w:shd w:fill="ffffff" w:val="clear"/>
-        <w:spacing w:after="240" w:before="0" w:beforeAutospacing="0" w:line="240" w:lineRule="auto"/>
-        <w:ind w:left="720" w:hanging="360"/>
-        <w:rPr>
-          <w:color w:val="0f1115"/>
-        </w:rPr>
-      </w:pPr>
-      <w:r>
-        <w:rPr>
-          <w:color w:val="0f1115"/>
-          <w:rtl w:val="0"/>
-        </w:rPr>
-        <w:t xml:space="preserve">Model Deployment</w:t>
-      </w:r>
-      <w:r>
-        <w:rPr>
-          <w:rtl w:val="0"/>
-        </w:rPr>
+        <w:shd w:val="clear" w:color="auto" w:fill="FFFFFF"/>
+        <w:spacing w:after="240" w:line="240" w:lineRule="auto"/>
+        <w:rPr>
+          <w:color w:val="0F1115"/>
+        </w:rPr>
+      </w:pPr>
+      <w:r>
+        <w:rPr>
+          <w:color w:val="0F1115"/>
+        </w:rPr>
+        <w:t>Model Deployment</w:t>
       </w:r>
     </w:p>
     <w:p>
@@ -563,23 +448,23 @@
         <w:spacing w:before="280" w:line="240" w:lineRule="auto"/>
         <w:ind w:left="720" w:hanging="360"/>
         <w:rPr>
-          <w:rFonts w:ascii="Arial" w:cs="Arial" w:eastAsia="Arial" w:hAnsi="Arial"/>
+          <w:rFonts w:ascii="Arial" w:eastAsia="Arial" w:hAnsi="Arial" w:cs="Arial"/>
           <w:color w:val="000000"/>
           <w:sz w:val="26"/>
           <w:szCs w:val="26"/>
         </w:rPr>
       </w:pPr>
-      <w:bookmarkStart w:colFirst="0" w:colLast="0" w:name="_heading=h.9y2kazany44m" w:id="5"/>
+      <w:bookmarkStart w:id="5" w:name="_heading=h.9y2kazany44m" w:colFirst="0" w:colLast="0"/>
       <w:bookmarkEnd w:id="5"/>
       <w:r>
         <w:rPr>
-          <w:rFonts w:ascii="Arial" w:cs="Arial" w:eastAsia="Arial" w:hAnsi="Arial"/>
+          <w:rFonts w:ascii="Arial" w:eastAsia="Arial" w:hAnsi="Arial" w:cs="Arial"/>
           <w:color w:val="000000"/>
           <w:sz w:val="26"/>
           <w:szCs w:val="26"/>
-          <w:rtl w:val="0"/>
-        </w:rPr>
-        <w:t xml:space="preserve">Tools &amp; Platforms</w:t>
+        </w:rPr>
+        <w:lastRenderedPageBreak/>
+        <w:t>Tools &amp; Platforms</w:t>
       </w:r>
     </w:p>
     <w:p>
@@ -588,15 +473,10 @@
           <w:ilvl w:val="0"/>
           <w:numId w:val="5"/>
         </w:numPr>
-        <w:spacing w:after="0" w:afterAutospacing="0" w:before="240" w:line="240" w:lineRule="auto"/>
-        <w:ind w:left="720" w:hanging="360"/>
-        <w:rPr/>
-      </w:pPr>
-      <w:r>
-        <w:rPr>
-          <w:rtl w:val="0"/>
-        </w:rPr>
-        <w:t xml:space="preserve">AWS S3</w:t>
+        <w:spacing w:before="240" w:after="0" w:line="240" w:lineRule="auto"/>
+      </w:pPr>
+      <w:r>
+        <w:t>AWS S3</w:t>
       </w:r>
     </w:p>
     <w:p>
@@ -605,15 +485,10 @@
           <w:ilvl w:val="0"/>
           <w:numId w:val="5"/>
         </w:numPr>
-        <w:spacing w:after="0" w:afterAutospacing="0" w:before="0" w:beforeAutospacing="0" w:line="240" w:lineRule="auto"/>
-        <w:ind w:left="720" w:hanging="360"/>
-        <w:rPr/>
-      </w:pPr>
-      <w:r>
-        <w:rPr>
-          <w:rtl w:val="0"/>
-        </w:rPr>
-        <w:t xml:space="preserve">Git &amp; GitHub</w:t>
+        <w:spacing w:after="0" w:line="240" w:lineRule="auto"/>
+      </w:pPr>
+      <w:r>
+        <w:t>Git &amp; GitHub</w:t>
       </w:r>
     </w:p>
     <w:p>
@@ -622,15 +497,10 @@
           <w:ilvl w:val="0"/>
           <w:numId w:val="5"/>
         </w:numPr>
-        <w:spacing w:after="0" w:afterAutospacing="0" w:before="0" w:beforeAutospacing="0" w:line="240" w:lineRule="auto"/>
-        <w:ind w:left="720" w:hanging="360"/>
-        <w:rPr/>
-      </w:pPr>
-      <w:r>
-        <w:rPr>
-          <w:rtl w:val="0"/>
-        </w:rPr>
-        <w:t xml:space="preserve">Jupyter Notebook</w:t>
+        <w:spacing w:after="0" w:line="240" w:lineRule="auto"/>
+      </w:pPr>
+      <w:r>
+        <w:t>Jupyter Notebook</w:t>
       </w:r>
     </w:p>
     <w:p>
@@ -639,16 +509,16 @@
           <w:ilvl w:val="0"/>
           <w:numId w:val="5"/>
         </w:numPr>
-        <w:spacing w:after="240" w:before="0" w:beforeAutospacing="0" w:line="240" w:lineRule="auto"/>
-        <w:ind w:left="720" w:hanging="360"/>
-        <w:rPr/>
-      </w:pPr>
-      <w:r>
-        <w:rPr>
-          <w:rtl w:val="0"/>
-        </w:rPr>
-        <w:t xml:space="preserve">Google Colab</w:t>
-      </w:r>
+        <w:spacing w:after="240" w:line="240" w:lineRule="auto"/>
+      </w:pPr>
+      <w:r>
+        <w:t xml:space="preserve">Google </w:t>
+      </w:r>
+      <w:proofErr w:type="spellStart"/>
+      <w:r>
+        <w:t>Colab</w:t>
+      </w:r>
+      <w:proofErr w:type="spellEnd"/>
     </w:p>
     <w:p>
       <w:pPr>
@@ -658,23 +528,22 @@
         <w:spacing w:before="280" w:line="240" w:lineRule="auto"/>
         <w:ind w:left="720" w:hanging="360"/>
         <w:rPr>
-          <w:rFonts w:ascii="Arial" w:cs="Arial" w:eastAsia="Arial" w:hAnsi="Arial"/>
+          <w:rFonts w:ascii="Arial" w:eastAsia="Arial" w:hAnsi="Arial" w:cs="Arial"/>
           <w:color w:val="000000"/>
           <w:sz w:val="26"/>
           <w:szCs w:val="26"/>
         </w:rPr>
       </w:pPr>
-      <w:bookmarkStart w:colFirst="0" w:colLast="0" w:name="_heading=h.xy2nf1uvc19f" w:id="6"/>
+      <w:bookmarkStart w:id="6" w:name="_heading=h.xy2nf1uvc19f" w:colFirst="0" w:colLast="0"/>
       <w:bookmarkEnd w:id="6"/>
       <w:r>
         <w:rPr>
-          <w:rFonts w:ascii="Arial" w:cs="Arial" w:eastAsia="Arial" w:hAnsi="Arial"/>
+          <w:rFonts w:ascii="Arial" w:eastAsia="Arial" w:hAnsi="Arial" w:cs="Arial"/>
           <w:color w:val="000000"/>
           <w:sz w:val="26"/>
           <w:szCs w:val="26"/>
-          <w:rtl w:val="0"/>
-        </w:rPr>
-        <w:t xml:space="preserve">Training &amp; Communication</w:t>
+        </w:rPr>
+        <w:t>Training &amp; Communication</w:t>
       </w:r>
     </w:p>
     <w:p>
@@ -683,100 +552,69 @@
           <w:ilvl w:val="0"/>
           <w:numId w:val="6"/>
         </w:numPr>
-        <w:spacing w:after="0" w:afterAutospacing="0" w:before="240" w:line="240" w:lineRule="auto"/>
+        <w:spacing w:before="240" w:after="0" w:line="240" w:lineRule="auto"/>
+      </w:pPr>
+      <w:r>
+        <w:t>Curriculum Development</w:t>
+      </w:r>
+    </w:p>
+    <w:p>
+      <w:pPr>
+        <w:numPr>
+          <w:ilvl w:val="0"/>
+          <w:numId w:val="6"/>
+        </w:numPr>
+        <w:spacing w:after="0" w:line="240" w:lineRule="auto"/>
+      </w:pPr>
+      <w:r>
+        <w:t>Workshop Facilitation</w:t>
+      </w:r>
+    </w:p>
+    <w:p>
+      <w:pPr>
+        <w:numPr>
+          <w:ilvl w:val="0"/>
+          <w:numId w:val="6"/>
+        </w:numPr>
+        <w:spacing w:after="0" w:line="240" w:lineRule="auto"/>
+      </w:pPr>
+      <w:r>
+        <w:t>Live Session Delivery (Online &amp; In-person)</w:t>
+      </w:r>
+    </w:p>
+    <w:p>
+      <w:pPr>
+        <w:numPr>
+          <w:ilvl w:val="0"/>
+          <w:numId w:val="6"/>
+        </w:numPr>
+        <w:spacing w:after="0" w:line="240" w:lineRule="auto"/>
+      </w:pPr>
+      <w:r>
+        <w:t>Student Mentorship</w:t>
+      </w:r>
+    </w:p>
+    <w:p>
+      <w:pPr>
+        <w:numPr>
+          <w:ilvl w:val="0"/>
+          <w:numId w:val="6"/>
+        </w:numPr>
+        <w:spacing w:after="240" w:line="240" w:lineRule="auto"/>
+      </w:pPr>
+      <w:r>
+        <w:t>Assignment Evaluation &amp; Feedback</w:t>
+      </w:r>
+    </w:p>
+    <w:p>
+      <w:pPr>
+        <w:spacing w:after="0" w:line="240" w:lineRule="auto"/>
         <w:ind w:left="720" w:hanging="360"/>
-        <w:rPr/>
-      </w:pPr>
-      <w:r>
-        <w:rPr>
-          <w:rtl w:val="0"/>
-        </w:rPr>
-        <w:t xml:space="preserve">Curriculum Development</w:t>
-      </w:r>
-    </w:p>
-    <w:p>
-      <w:pPr>
-        <w:numPr>
-          <w:ilvl w:val="0"/>
-          <w:numId w:val="6"/>
-        </w:numPr>
-        <w:spacing w:after="0" w:afterAutospacing="0" w:before="0" w:beforeAutospacing="0" w:line="240" w:lineRule="auto"/>
-        <w:ind w:left="720" w:hanging="360"/>
-        <w:rPr/>
-      </w:pPr>
-      <w:r>
-        <w:rPr>
-          <w:rtl w:val="0"/>
-        </w:rPr>
-        <w:t xml:space="preserve">Workshop Facilitation</w:t>
-      </w:r>
-    </w:p>
-    <w:p>
-      <w:pPr>
-        <w:numPr>
-          <w:ilvl w:val="0"/>
-          <w:numId w:val="6"/>
-        </w:numPr>
-        <w:spacing w:after="0" w:afterAutospacing="0" w:before="0" w:beforeAutospacing="0" w:line="240" w:lineRule="auto"/>
-        <w:ind w:left="720" w:hanging="360"/>
-        <w:rPr/>
-      </w:pPr>
-      <w:r>
-        <w:rPr>
-          <w:rtl w:val="0"/>
-        </w:rPr>
-        <w:t xml:space="preserve">Live Session Delivery (Online &amp; In-person)</w:t>
-      </w:r>
-    </w:p>
-    <w:p>
-      <w:pPr>
-        <w:numPr>
-          <w:ilvl w:val="0"/>
-          <w:numId w:val="6"/>
-        </w:numPr>
-        <w:spacing w:after="0" w:afterAutospacing="0" w:before="0" w:beforeAutospacing="0" w:line="240" w:lineRule="auto"/>
-        <w:ind w:left="720" w:hanging="360"/>
-        <w:rPr/>
-      </w:pPr>
-      <w:r>
-        <w:rPr>
-          <w:rtl w:val="0"/>
-        </w:rPr>
-        <w:t xml:space="preserve">Student Mentorship</w:t>
-      </w:r>
-    </w:p>
-    <w:p>
-      <w:pPr>
-        <w:numPr>
-          <w:ilvl w:val="0"/>
-          <w:numId w:val="6"/>
-        </w:numPr>
-        <w:spacing w:after="240" w:before="0" w:beforeAutospacing="0" w:line="240" w:lineRule="auto"/>
-        <w:ind w:left="720" w:hanging="360"/>
-        <w:rPr/>
-      </w:pPr>
-      <w:r>
-        <w:rPr>
-          <w:rtl w:val="0"/>
-        </w:rPr>
-        <w:t xml:space="preserve">Assignment Evaluation &amp; Feedback</w:t>
-      </w:r>
-    </w:p>
-    <w:p>
-      <w:pPr>
-        <w:spacing w:after="0" w:line="240" w:lineRule="auto"/>
-        <w:ind w:left="720" w:hanging="360"/>
-        <w:rPr/>
-      </w:pPr>
-      <w:r>
-        <w:pict>
-          <v:rect style="width:0.0pt;height:1.5pt" o:hr="t" o:hrstd="t" o:hralign="center" fillcolor="#A0A0A0" stroked="f"/>
+      </w:pPr>
+      <w:r>
+        <w:pict w14:anchorId="3AA8D110">
+          <v:rect id="_x0000_i1027" style="width:0;height:1.5pt" o:hralign="center" o:hrstd="t" o:hr="t" fillcolor="#a0a0a0" stroked="f"/>
         </w:pict>
-      </w:r>
-      <w:r>
-        <w:rPr>
-          <w:rtl w:val="0"/>
-        </w:rPr>
       </w:r>
     </w:p>
     <w:p>
@@ -785,25 +623,23 @@
         <w:keepNext w:val="0"/>
         <w:keepLines w:val="0"/>
         <w:spacing w:before="360" w:line="240" w:lineRule="auto"/>
-        <w:ind w:left="0" w:firstLine="0"/>
-        <w:rPr>
-          <w:rFonts w:ascii="Arial" w:cs="Arial" w:eastAsia="Arial" w:hAnsi="Arial"/>
+        <w:rPr>
+          <w:rFonts w:ascii="Arial" w:eastAsia="Arial" w:hAnsi="Arial" w:cs="Arial"/>
           <w:color w:val="000000"/>
           <w:sz w:val="34"/>
           <w:szCs w:val="34"/>
         </w:rPr>
       </w:pPr>
-      <w:bookmarkStart w:colFirst="0" w:colLast="0" w:name="_heading=h.xqvfkbnyeely" w:id="7"/>
+      <w:bookmarkStart w:id="7" w:name="_heading=h.xqvfkbnyeely" w:colFirst="0" w:colLast="0"/>
       <w:bookmarkEnd w:id="7"/>
       <w:r>
         <w:rPr>
-          <w:rFonts w:ascii="Arial" w:cs="Arial" w:eastAsia="Arial" w:hAnsi="Arial"/>
+          <w:rFonts w:ascii="Arial" w:eastAsia="Arial" w:hAnsi="Arial" w:cs="Arial"/>
           <w:color w:val="000000"/>
           <w:sz w:val="34"/>
           <w:szCs w:val="34"/>
-          <w:rtl w:val="0"/>
-        </w:rPr>
-        <w:t xml:space="preserve">PROFESSIONAL EXPERIENCE</w:t>
+        </w:rPr>
+        <w:t>PROFESSIONAL EXPERIENCE</w:t>
       </w:r>
     </w:p>
     <w:p>
@@ -812,49 +648,48 @@
         <w:keepNext w:val="0"/>
         <w:keepLines w:val="0"/>
         <w:spacing w:before="280" w:line="240" w:lineRule="auto"/>
-        <w:ind w:left="0" w:firstLine="0"/>
-        <w:rPr>
-          <w:rFonts w:ascii="Arial" w:cs="Arial" w:eastAsia="Arial" w:hAnsi="Arial"/>
+        <w:rPr>
+          <w:rFonts w:ascii="Arial" w:eastAsia="Arial" w:hAnsi="Arial" w:cs="Arial"/>
           <w:color w:val="000000"/>
           <w:sz w:val="26"/>
           <w:szCs w:val="26"/>
         </w:rPr>
       </w:pPr>
-      <w:bookmarkStart w:colFirst="0" w:colLast="0" w:name="_heading=h.x1kslcxt1awh" w:id="8"/>
+      <w:bookmarkStart w:id="8" w:name="_heading=h.x1kslcxt1awh" w:colFirst="0" w:colLast="0"/>
       <w:bookmarkEnd w:id="8"/>
       <w:r>
         <w:rPr>
-          <w:rFonts w:ascii="Arial" w:cs="Arial" w:eastAsia="Arial" w:hAnsi="Arial"/>
+          <w:rFonts w:ascii="Arial" w:eastAsia="Arial" w:hAnsi="Arial" w:cs="Arial"/>
           <w:color w:val="000000"/>
           <w:sz w:val="26"/>
           <w:szCs w:val="26"/>
-          <w:rtl w:val="0"/>
-        </w:rPr>
-        <w:t xml:space="preserve">Data Analyst / Data Scientist</w:t>
-      </w:r>
-    </w:p>
-    <w:p>
-      <w:pPr>
-        <w:spacing w:after="240" w:before="240" w:line="240" w:lineRule="auto"/>
-        <w:rPr/>
-      </w:pPr>
-      <w:r>
-        <w:rPr>
-          <w:rtl w:val="0"/>
-        </w:rPr>
-        <w:t xml:space="preserve">Sand Technology (Remote)</w:t>
-      </w:r>
-    </w:p>
-    <w:p>
-      <w:pPr>
-        <w:spacing w:after="240" w:before="240" w:line="240" w:lineRule="auto"/>
-        <w:rPr/>
-      </w:pPr>
-      <w:r>
-        <w:rPr>
-          <w:rtl w:val="0"/>
-        </w:rPr>
-        <w:t xml:space="preserve">River Health Project – Thames Water (UK)</w:t>
+        </w:rPr>
+        <w:t>Data Analyst / Data Scientist</w:t>
+      </w:r>
+      <w:r>
+        <w:rPr>
+          <w:rFonts w:ascii="Arial" w:eastAsia="Arial" w:hAnsi="Arial" w:cs="Arial"/>
+          <w:color w:val="000000"/>
+          <w:sz w:val="26"/>
+          <w:szCs w:val="26"/>
+        </w:rPr>
+        <w:t xml:space="preserve"> intern</w:t>
+      </w:r>
+    </w:p>
+    <w:p>
+      <w:pPr>
+        <w:spacing w:before="240" w:after="240" w:line="240" w:lineRule="auto"/>
+      </w:pPr>
+      <w:r>
+        <w:t>Sand Technology (Remote)</w:t>
+      </w:r>
+    </w:p>
+    <w:p>
+      <w:pPr>
+        <w:spacing w:before="240" w:after="240" w:line="240" w:lineRule="auto"/>
+      </w:pPr>
+      <w:r>
+        <w:t>River Health Project – Thames Water (UK)</w:t>
       </w:r>
     </w:p>
     <w:p>
@@ -863,15 +698,10 @@
           <w:ilvl w:val="0"/>
           <w:numId w:val="1"/>
         </w:numPr>
-        <w:spacing w:after="0" w:afterAutospacing="0" w:before="240" w:line="240" w:lineRule="auto"/>
-        <w:ind w:left="720" w:hanging="360"/>
-        <w:rPr/>
-      </w:pPr>
-      <w:r>
-        <w:rPr>
-          <w:rtl w:val="0"/>
-        </w:rPr>
-        <w:t xml:space="preserve">Wrote complex SQL queries to extract and analyse 1.5M+ monthly operational records from 50+ monitoring stations.</w:t>
+        <w:spacing w:before="240" w:after="0" w:line="240" w:lineRule="auto"/>
+      </w:pPr>
+      <w:r>
+        <w:t>Wrote complex SQL queries to extract and analyse 1.5M+ monthly operational records from 50+ monitoring stations.</w:t>
       </w:r>
     </w:p>
     <w:p>
@@ -880,15 +710,10 @@
           <w:ilvl w:val="0"/>
           <w:numId w:val="1"/>
         </w:numPr>
-        <w:spacing w:after="0" w:afterAutospacing="0" w:before="0" w:beforeAutospacing="0" w:line="240" w:lineRule="auto"/>
-        <w:ind w:left="720" w:hanging="360"/>
-        <w:rPr/>
-      </w:pPr>
-      <w:r>
-        <w:rPr>
-          <w:rtl w:val="0"/>
-        </w:rPr>
-        <w:t xml:space="preserve">Built interactive Power BI dashboards used by stakeholders, reducing reporting time from 5 days to 3 hours.</w:t>
+        <w:spacing w:after="0" w:line="240" w:lineRule="auto"/>
+      </w:pPr>
+      <w:r>
+        <w:t>Built interactive Power BI dashboards used by stakeholders, reducing reporting time from 5 days to 3 hours.</w:t>
       </w:r>
     </w:p>
     <w:p>
@@ -897,15 +722,10 @@
           <w:ilvl w:val="0"/>
           <w:numId w:val="1"/>
         </w:numPr>
-        <w:spacing w:after="0" w:afterAutospacing="0" w:before="0" w:beforeAutospacing="0" w:line="240" w:lineRule="auto"/>
-        <w:ind w:left="720" w:hanging="360"/>
-        <w:rPr/>
-      </w:pPr>
-      <w:r>
-        <w:rPr>
-          <w:rtl w:val="0"/>
-        </w:rPr>
-        <w:t xml:space="preserve">Performed data cleaning and validation, resolving 8,500+ inconsistencies to improve data integrity and reliability.</w:t>
+        <w:spacing w:after="0" w:line="240" w:lineRule="auto"/>
+      </w:pPr>
+      <w:r>
+        <w:t>Performed data cleaning and validation, resolving 8,500+ inconsistencies to improve data integrity and reliability.</w:t>
       </w:r>
     </w:p>
     <w:p>
@@ -914,15 +734,10 @@
           <w:ilvl w:val="0"/>
           <w:numId w:val="1"/>
         </w:numPr>
-        <w:spacing w:after="0" w:afterAutospacing="0" w:before="0" w:beforeAutospacing="0" w:line="240" w:lineRule="auto"/>
-        <w:ind w:left="720" w:hanging="360"/>
-        <w:rPr/>
-      </w:pPr>
-      <w:r>
-        <w:rPr>
-          <w:rtl w:val="0"/>
-        </w:rPr>
-        <w:t xml:space="preserve">Conducted EDA and trend analysis to help predict sewage discharge events up to 48 hours in advance.</w:t>
+        <w:spacing w:after="0" w:line="240" w:lineRule="auto"/>
+      </w:pPr>
+      <w:r>
+        <w:t>Conducted EDA and trend analysis to help predict sewage discharge events in advance.</w:t>
       </w:r>
     </w:p>
     <w:p>
@@ -931,19 +746,17 @@
           <w:ilvl w:val="0"/>
           <w:numId w:val="1"/>
         </w:numPr>
-        <w:shd w:fill="ffffff" w:val="clear"/>
-        <w:spacing w:after="0" w:afterAutospacing="0" w:before="0" w:beforeAutospacing="0" w:line="240" w:lineRule="auto"/>
-        <w:ind w:left="720" w:hanging="360"/>
-        <w:rPr>
-          <w:color w:val="0f1115"/>
-        </w:rPr>
-      </w:pPr>
-      <w:r>
-        <w:rPr>
-          <w:color w:val="0f1115"/>
-          <w:rtl w:val="0"/>
-        </w:rPr>
-        <w:t xml:space="preserve">Built and deployed predictive AI models using Python (Scikit-Learn) to forecast sewage discharge events in advance, achieving 87% accuracy.</w:t>
+        <w:shd w:val="clear" w:color="auto" w:fill="FFFFFF"/>
+        <w:spacing w:after="0" w:line="240" w:lineRule="auto"/>
+        <w:rPr>
+          <w:color w:val="0F1115"/>
+        </w:rPr>
+      </w:pPr>
+      <w:r>
+        <w:rPr>
+          <w:color w:val="0F1115"/>
+        </w:rPr>
+        <w:t>Built and deployed predictive AI models using Python (Scikit-Learn) to forecast sewage discharge events in advance, achieving 87% accuracy.</w:t>
       </w:r>
     </w:p>
     <w:p>
@@ -952,19 +765,31 @@
           <w:ilvl w:val="0"/>
           <w:numId w:val="1"/>
         </w:numPr>
-        <w:shd w:fill="ffffff" w:val="clear"/>
-        <w:spacing w:after="0" w:afterAutospacing="0" w:before="0" w:beforeAutospacing="0" w:line="240" w:lineRule="auto"/>
-        <w:ind w:left="720" w:hanging="360"/>
-        <w:rPr>
-          <w:color w:val="0f1115"/>
-        </w:rPr>
-      </w:pPr>
-      <w:r>
-        <w:rPr>
-          <w:color w:val="0f1115"/>
-          <w:rtl w:val="0"/>
-        </w:rPr>
-        <w:t xml:space="preserve">Incorporated MLOps best practices across the model lifecycle:</w:t>
+        <w:shd w:val="clear" w:color="auto" w:fill="FFFFFF"/>
+        <w:spacing w:after="0" w:line="240" w:lineRule="auto"/>
+        <w:rPr>
+          <w:color w:val="0F1115"/>
+        </w:rPr>
+      </w:pPr>
+      <w:r>
+        <w:rPr>
+          <w:color w:val="0F1115"/>
+        </w:rPr>
+        <w:t xml:space="preserve">Incorporated </w:t>
+      </w:r>
+      <w:proofErr w:type="spellStart"/>
+      <w:r>
+        <w:rPr>
+          <w:color w:val="0F1115"/>
+        </w:rPr>
+        <w:t>MLOps</w:t>
+      </w:r>
+      <w:proofErr w:type="spellEnd"/>
+      <w:r>
+        <w:rPr>
+          <w:color w:val="0F1115"/>
+        </w:rPr>
+        <w:t xml:space="preserve"> best practices across the model lifecycle:</w:t>
       </w:r>
     </w:p>
     <w:p>
@@ -973,18 +798,16 @@
           <w:ilvl w:val="1"/>
           <w:numId w:val="1"/>
         </w:numPr>
-        <w:spacing w:after="0" w:afterAutospacing="0" w:before="0" w:beforeAutospacing="0" w:line="240" w:lineRule="auto"/>
-        <w:ind w:left="1440" w:hanging="360"/>
-        <w:rPr>
-          <w:color w:val="0f1115"/>
-        </w:rPr>
-      </w:pPr>
-      <w:r>
-        <w:rPr>
-          <w:color w:val="0f1115"/>
-          <w:rtl w:val="0"/>
-        </w:rPr>
-        <w:t xml:space="preserve">Data preparation: Cleaned and transformed raw sensor data for modelling</w:t>
+        <w:spacing w:after="0" w:line="240" w:lineRule="auto"/>
+        <w:rPr>
+          <w:color w:val="0F1115"/>
+        </w:rPr>
+      </w:pPr>
+      <w:r>
+        <w:rPr>
+          <w:color w:val="0F1115"/>
+        </w:rPr>
+        <w:t>Data preparation: Cleaned and transformed raw sensor data for modelling</w:t>
       </w:r>
     </w:p>
     <w:p>
@@ -993,18 +816,16 @@
           <w:ilvl w:val="1"/>
           <w:numId w:val="1"/>
         </w:numPr>
-        <w:spacing w:after="0" w:afterAutospacing="0" w:before="0" w:beforeAutospacing="0" w:line="240" w:lineRule="auto"/>
-        <w:ind w:left="1440" w:hanging="360"/>
-        <w:rPr>
-          <w:color w:val="0f1115"/>
-        </w:rPr>
-      </w:pPr>
-      <w:r>
-        <w:rPr>
-          <w:color w:val="0f1115"/>
-          <w:rtl w:val="0"/>
-        </w:rPr>
-        <w:t xml:space="preserve">Feature engineering: Created predictive features from time-series data</w:t>
+        <w:spacing w:after="0" w:line="240" w:lineRule="auto"/>
+        <w:rPr>
+          <w:color w:val="0F1115"/>
+        </w:rPr>
+      </w:pPr>
+      <w:r>
+        <w:rPr>
+          <w:color w:val="0F1115"/>
+        </w:rPr>
+        <w:t>Feature engineering: Created predictive features from time-series data</w:t>
       </w:r>
     </w:p>
     <w:p>
@@ -1013,18 +834,16 @@
           <w:ilvl w:val="1"/>
           <w:numId w:val="1"/>
         </w:numPr>
-        <w:spacing w:after="0" w:afterAutospacing="0" w:before="0" w:beforeAutospacing="0" w:line="240" w:lineRule="auto"/>
-        <w:ind w:left="1440" w:hanging="360"/>
-        <w:rPr>
-          <w:color w:val="0f1115"/>
-        </w:rPr>
-      </w:pPr>
-      <w:r>
-        <w:rPr>
-          <w:color w:val="0f1115"/>
-          <w:rtl w:val="0"/>
-        </w:rPr>
-        <w:t xml:space="preserve">Model training &amp; selection: Tested multiple algorithms; selected optimal model</w:t>
+        <w:spacing w:after="0" w:line="240" w:lineRule="auto"/>
+        <w:rPr>
+          <w:color w:val="0F1115"/>
+        </w:rPr>
+      </w:pPr>
+      <w:r>
+        <w:rPr>
+          <w:color w:val="0F1115"/>
+        </w:rPr>
+        <w:t>Model training &amp; selection: Tested multiple algorithms; selected optimal model</w:t>
       </w:r>
     </w:p>
     <w:p>
@@ -1033,18 +852,16 @@
           <w:ilvl w:val="1"/>
           <w:numId w:val="1"/>
         </w:numPr>
-        <w:spacing w:after="0" w:afterAutospacing="0" w:before="0" w:beforeAutospacing="0" w:line="240" w:lineRule="auto"/>
-        <w:ind w:left="1440" w:hanging="360"/>
-        <w:rPr>
-          <w:color w:val="0f1115"/>
-        </w:rPr>
-      </w:pPr>
-      <w:r>
-        <w:rPr>
-          <w:color w:val="0f1115"/>
-          <w:rtl w:val="0"/>
-        </w:rPr>
-        <w:t xml:space="preserve">Evaluation: Applied metrics including accuracy, precision, recall, F1-score, and RMSE</w:t>
+        <w:spacing w:after="0" w:line="240" w:lineRule="auto"/>
+        <w:rPr>
+          <w:color w:val="0F1115"/>
+        </w:rPr>
+      </w:pPr>
+      <w:r>
+        <w:rPr>
+          <w:color w:val="0F1115"/>
+        </w:rPr>
+        <w:t>Evaluation: Applied metrics including accuracy, precision, recall, F1-score, and RMSE</w:t>
       </w:r>
     </w:p>
     <w:p>
@@ -1053,40 +870,27 @@
           <w:ilvl w:val="1"/>
           <w:numId w:val="1"/>
         </w:numPr>
-        <w:spacing w:after="240" w:before="0" w:beforeAutospacing="0" w:line="240" w:lineRule="auto"/>
-        <w:ind w:left="1440" w:hanging="360"/>
-        <w:rPr>
-          <w:color w:val="0f1115"/>
-        </w:rPr>
-      </w:pPr>
-      <w:r>
-        <w:rPr>
-          <w:color w:val="0f1115"/>
-          <w:rtl w:val="0"/>
-        </w:rPr>
-        <w:t xml:space="preserve">Deployment: Integrated models into production pipelines for real-time predictions</w:t>
-      </w:r>
-      <w:r>
-        <w:rPr>
-          <w:rtl w:val="0"/>
-        </w:rPr>
+        <w:spacing w:after="240" w:line="240" w:lineRule="auto"/>
+        <w:rPr>
+          <w:color w:val="0F1115"/>
+        </w:rPr>
+      </w:pPr>
+      <w:r>
+        <w:rPr>
+          <w:color w:val="0F1115"/>
+        </w:rPr>
+        <w:t>Deployment: Integrated models into production pipelines for real-time predictions</w:t>
       </w:r>
     </w:p>
     <w:p>
       <w:pPr>
         <w:spacing w:after="0" w:line="240" w:lineRule="auto"/>
         <w:ind w:left="720" w:hanging="360"/>
-        <w:rPr/>
-      </w:pPr>
-      <w:r>
-        <w:pict>
-          <v:rect style="width:0.0pt;height:1.5pt" o:hr="t" o:hrstd="t" o:hralign="center" fillcolor="#A0A0A0" stroked="f"/>
+      </w:pPr>
+      <w:r>
+        <w:pict w14:anchorId="193E2763">
+          <v:rect id="_x0000_i1028" style="width:0;height:1.5pt" o:hralign="center" o:hrstd="t" o:hr="t" fillcolor="#a0a0a0" stroked="f"/>
         </w:pict>
-      </w:r>
-      <w:r>
-        <w:rPr>
-          <w:rtl w:val="0"/>
-        </w:rPr>
       </w:r>
     </w:p>
     <w:p>
@@ -1095,25 +899,23 @@
         <w:keepNext w:val="0"/>
         <w:keepLines w:val="0"/>
         <w:spacing w:before="360" w:line="240" w:lineRule="auto"/>
-        <w:ind w:left="0" w:firstLine="0"/>
-        <w:rPr>
-          <w:rFonts w:ascii="Arial" w:cs="Arial" w:eastAsia="Arial" w:hAnsi="Arial"/>
+        <w:rPr>
+          <w:rFonts w:ascii="Arial" w:eastAsia="Arial" w:hAnsi="Arial" w:cs="Arial"/>
           <w:color w:val="000000"/>
           <w:sz w:val="34"/>
           <w:szCs w:val="34"/>
         </w:rPr>
       </w:pPr>
-      <w:bookmarkStart w:colFirst="0" w:colLast="0" w:name="_heading=h.5ucf6mc9qn5d" w:id="9"/>
+      <w:bookmarkStart w:id="9" w:name="_heading=h.5ucf6mc9qn5d" w:colFirst="0" w:colLast="0"/>
       <w:bookmarkEnd w:id="9"/>
       <w:r>
         <w:rPr>
-          <w:rFonts w:ascii="Arial" w:cs="Arial" w:eastAsia="Arial" w:hAnsi="Arial"/>
+          <w:rFonts w:ascii="Arial" w:eastAsia="Arial" w:hAnsi="Arial" w:cs="Arial"/>
           <w:color w:val="000000"/>
           <w:sz w:val="34"/>
           <w:szCs w:val="34"/>
-          <w:rtl w:val="0"/>
-        </w:rPr>
-        <w:t xml:space="preserve">TECHNICAL MENTOR EXPERIENCE</w:t>
+        </w:rPr>
+        <w:t>TECHNICAL MENTOR EXPERIENCE</w:t>
       </w:r>
     </w:p>
     <w:p>
@@ -1122,49 +924,46 @@
         <w:keepNext w:val="0"/>
         <w:keepLines w:val="0"/>
         <w:spacing w:before="280" w:line="240" w:lineRule="auto"/>
-        <w:ind w:left="0" w:firstLine="0"/>
-        <w:rPr>
-          <w:rFonts w:ascii="Arial" w:cs="Arial" w:eastAsia="Arial" w:hAnsi="Arial"/>
+        <w:rPr>
+          <w:rFonts w:ascii="Arial" w:eastAsia="Arial" w:hAnsi="Arial" w:cs="Arial"/>
           <w:color w:val="000000"/>
           <w:sz w:val="26"/>
           <w:szCs w:val="26"/>
         </w:rPr>
       </w:pPr>
-      <w:bookmarkStart w:colFirst="0" w:colLast="0" w:name="_heading=h.tc8ovb34qa06" w:id="10"/>
+      <w:bookmarkStart w:id="10" w:name="_heading=h.tc8ovb34qa06" w:colFirst="0" w:colLast="0"/>
       <w:bookmarkEnd w:id="10"/>
       <w:r>
         <w:rPr>
-          <w:rFonts w:ascii="Arial" w:cs="Arial" w:eastAsia="Arial" w:hAnsi="Arial"/>
+          <w:rFonts w:ascii="Arial" w:eastAsia="Arial" w:hAnsi="Arial" w:cs="Arial"/>
           <w:color w:val="000000"/>
           <w:sz w:val="26"/>
           <w:szCs w:val="26"/>
-          <w:rtl w:val="0"/>
-        </w:rPr>
-        <w:t xml:space="preserve">Technical Mentor</w:t>
-      </w:r>
-    </w:p>
-    <w:p>
-      <w:pPr>
-        <w:spacing w:after="240" w:before="240" w:line="240" w:lineRule="auto"/>
-        <w:rPr>
-          <w:i w:val="1"/>
-          <w:iCs w:val="1"/>
-        </w:rPr>
-      </w:pPr>
-      <w:r>
-        <w:rPr>
-          <w:rtl w:val="0"/>
-        </w:rPr>
-        <w:t xml:space="preserve">WeThinkCode_ – Durban</w:t>
-        <w:br w:type="textWrapping"/>
-      </w:r>
-      <w:r>
-        <w:rPr>
-          <w:i w:val="1"/>
-          <w:iCs w:val="1"/>
-          <w:rtl w:val="0"/>
-        </w:rPr>
-        <w:t xml:space="preserve">September 2023 – December 2023</w:t>
+        </w:rPr>
+        <w:lastRenderedPageBreak/>
+        <w:t>Technical Mentor</w:t>
+      </w:r>
+    </w:p>
+    <w:p>
+      <w:pPr>
+        <w:spacing w:before="240" w:after="240" w:line="240" w:lineRule="auto"/>
+        <w:rPr>
+          <w:i/>
+          <w:iCs/>
+        </w:rPr>
+      </w:pPr>
+      <w:r>
+        <w:t>WeThinkCode_ – Durban</w:t>
+      </w:r>
+      <w:r>
+        <w:br/>
+      </w:r>
+      <w:r>
+        <w:rPr>
+          <w:i/>
+          <w:iCs/>
+        </w:rPr>
+        <w:t>September 2023 – December 2023</w:t>
       </w:r>
     </w:p>
     <w:p>
@@ -1173,117 +972,81 @@
           <w:ilvl w:val="0"/>
           <w:numId w:val="2"/>
         </w:numPr>
-        <w:spacing w:after="0" w:afterAutospacing="0" w:before="240" w:line="240" w:lineRule="auto"/>
+        <w:spacing w:before="240" w:after="0" w:line="240" w:lineRule="auto"/>
+      </w:pPr>
+      <w:r>
+        <w:t>Selected among a limited group of mentors to guide the 2023 cohort of aspiring software engineers.</w:t>
+      </w:r>
+    </w:p>
+    <w:p>
+      <w:pPr>
+        <w:numPr>
+          <w:ilvl w:val="0"/>
+          <w:numId w:val="2"/>
+        </w:numPr>
+        <w:spacing w:after="0" w:line="240" w:lineRule="auto"/>
+      </w:pPr>
+      <w:r>
+        <w:t>Mentored students in Python programming, problem-solving, and software development fundamentals.</w:t>
+      </w:r>
+    </w:p>
+    <w:p>
+      <w:pPr>
+        <w:numPr>
+          <w:ilvl w:val="0"/>
+          <w:numId w:val="2"/>
+        </w:numPr>
+        <w:spacing w:after="0" w:line="240" w:lineRule="auto"/>
+      </w:pPr>
+      <w:r>
+        <w:t>Facilitated induction sessions and technical workshops to equip students with essential industry skills.</w:t>
+      </w:r>
+    </w:p>
+    <w:p>
+      <w:pPr>
+        <w:numPr>
+          <w:ilvl w:val="0"/>
+          <w:numId w:val="2"/>
+        </w:numPr>
+        <w:spacing w:after="0" w:line="240" w:lineRule="auto"/>
+      </w:pPr>
+      <w:r>
+        <w:t>Provided structured one-on-one mentorship and career guidance to support professional growth.</w:t>
+      </w:r>
+    </w:p>
+    <w:p>
+      <w:pPr>
+        <w:numPr>
+          <w:ilvl w:val="0"/>
+          <w:numId w:val="2"/>
+        </w:numPr>
+        <w:spacing w:after="0" w:line="240" w:lineRule="auto"/>
+      </w:pPr>
+      <w:r>
+        <w:t>Evaluated student projects, provided constructive feedback, and helped learners improve code quality and analytical thinking.</w:t>
+      </w:r>
+    </w:p>
+    <w:p>
+      <w:pPr>
+        <w:numPr>
+          <w:ilvl w:val="0"/>
+          <w:numId w:val="2"/>
+        </w:numPr>
+        <w:spacing w:after="240" w:line="240" w:lineRule="auto"/>
+      </w:pPr>
+      <w:r>
+        <w:t>Collaborated with fellow mentors to design impactful learning experiences and technical training sessions.</w:t>
+      </w:r>
+    </w:p>
+    <w:p>
+      <w:pPr>
+        <w:spacing w:after="0" w:line="240" w:lineRule="auto"/>
         <w:ind w:left="720" w:hanging="360"/>
-        <w:rPr/>
-      </w:pPr>
-      <w:r>
-        <w:rPr>
-          <w:rtl w:val="0"/>
-        </w:rPr>
-        <w:t xml:space="preserve">Selected among a limited group of mentors to guide the 2023 cohort of aspiring software engineers.</w:t>
-      </w:r>
-    </w:p>
-    <w:p>
-      <w:pPr>
-        <w:numPr>
-          <w:ilvl w:val="0"/>
-          <w:numId w:val="2"/>
-        </w:numPr>
-        <w:spacing w:after="0" w:afterAutospacing="0" w:before="0" w:beforeAutospacing="0" w:line="240" w:lineRule="auto"/>
-        <w:ind w:left="720" w:hanging="360"/>
-        <w:rPr/>
-      </w:pPr>
-      <w:r>
-        <w:rPr>
-          <w:rtl w:val="0"/>
-        </w:rPr>
-        <w:t xml:space="preserve">Mentored students in Python programming, problem-solving, and software development fundamentals.</w:t>
-      </w:r>
-    </w:p>
-    <w:p>
-      <w:pPr>
-        <w:numPr>
-          <w:ilvl w:val="0"/>
-          <w:numId w:val="2"/>
-        </w:numPr>
-        <w:spacing w:after="0" w:afterAutospacing="0" w:before="0" w:beforeAutospacing="0" w:line="240" w:lineRule="auto"/>
-        <w:ind w:left="720" w:hanging="360"/>
-        <w:rPr/>
-      </w:pPr>
-      <w:r>
-        <w:rPr>
-          <w:rtl w:val="0"/>
-        </w:rPr>
-        <w:t xml:space="preserve">Facilitated induction sessions and technical workshops to equip students with essential industry skills.</w:t>
-      </w:r>
-    </w:p>
-    <w:p>
-      <w:pPr>
-        <w:numPr>
-          <w:ilvl w:val="0"/>
-          <w:numId w:val="2"/>
-        </w:numPr>
-        <w:spacing w:after="0" w:afterAutospacing="0" w:before="0" w:beforeAutospacing="0" w:line="240" w:lineRule="auto"/>
-        <w:ind w:left="720" w:hanging="360"/>
-        <w:rPr/>
-      </w:pPr>
-      <w:r>
-        <w:rPr>
-          <w:rtl w:val="0"/>
-        </w:rPr>
-        <w:t xml:space="preserve">Provided structured one-on-one mentorship and career guidance to support professional growth.</w:t>
-      </w:r>
-    </w:p>
-    <w:p>
-      <w:pPr>
-        <w:numPr>
-          <w:ilvl w:val="0"/>
-          <w:numId w:val="2"/>
-        </w:numPr>
-        <w:spacing w:after="0" w:afterAutospacing="0" w:before="0" w:beforeAutospacing="0" w:line="240" w:lineRule="auto"/>
-        <w:ind w:left="720" w:hanging="360"/>
-        <w:rPr/>
-      </w:pPr>
-      <w:r>
-        <w:rPr>
-          <w:rtl w:val="0"/>
-        </w:rPr>
-        <w:t xml:space="preserve">Evaluated student projects, provided constructive feedback, and helped learners improve code quality and analytical thinking.</w:t>
-      </w:r>
-    </w:p>
-    <w:p>
-      <w:pPr>
-        <w:numPr>
-          <w:ilvl w:val="0"/>
-          <w:numId w:val="2"/>
-        </w:numPr>
-        <w:spacing w:after="240" w:before="0" w:beforeAutospacing="0" w:line="240" w:lineRule="auto"/>
-        <w:ind w:left="720" w:hanging="360"/>
-        <w:rPr/>
-      </w:pPr>
-      <w:r>
-        <w:rPr>
-          <w:rtl w:val="0"/>
-        </w:rPr>
-        <w:t xml:space="preserve">Collaborated with fellow mentors to design impactful learning experiences and technical training sessions.</w:t>
-      </w:r>
-    </w:p>
-    <w:p>
-      <w:pPr>
-        <w:spacing w:after="0" w:line="240" w:lineRule="auto"/>
-        <w:ind w:left="720" w:hanging="360"/>
-        <w:rPr/>
-      </w:pPr>
-      <w:r>
-        <w:pict>
-          <v:rect style="width:0.0pt;height:1.5pt" o:hr="t" o:hrstd="t" o:hralign="center" fillcolor="#A0A0A0" stroked="f"/>
+      </w:pPr>
+      <w:r>
+        <w:pict w14:anchorId="7DF6AF49">
+          <v:rect id="_x0000_i1029" style="width:0;height:1.5pt" o:hralign="center" o:hrstd="t" o:hr="t" fillcolor="#a0a0a0" stroked="f"/>
         </w:pict>
-      </w:r>
-      <w:r>
-        <w:rPr>
-          <w:rtl w:val="0"/>
-        </w:rPr>
       </w:r>
     </w:p>
     <w:p>
@@ -1292,84 +1055,70 @@
         <w:keepNext w:val="0"/>
         <w:keepLines w:val="0"/>
         <w:spacing w:before="360" w:line="240" w:lineRule="auto"/>
-        <w:ind w:left="0" w:firstLine="0"/>
-        <w:rPr>
-          <w:rFonts w:ascii="Arial" w:cs="Arial" w:eastAsia="Arial" w:hAnsi="Arial"/>
+        <w:rPr>
+          <w:rFonts w:ascii="Arial" w:eastAsia="Arial" w:hAnsi="Arial" w:cs="Arial"/>
           <w:color w:val="000000"/>
           <w:sz w:val="34"/>
           <w:szCs w:val="34"/>
         </w:rPr>
       </w:pPr>
-      <w:bookmarkStart w:colFirst="0" w:colLast="0" w:name="_heading=h.iga02ud4itu9" w:id="11"/>
+      <w:bookmarkStart w:id="11" w:name="_heading=h.iga02ud4itu9" w:colFirst="0" w:colLast="0"/>
       <w:bookmarkEnd w:id="11"/>
       <w:r>
         <w:rPr>
-          <w:rFonts w:ascii="Arial" w:cs="Arial" w:eastAsia="Arial" w:hAnsi="Arial"/>
+          <w:rFonts w:ascii="Arial" w:eastAsia="Arial" w:hAnsi="Arial" w:cs="Arial"/>
           <w:color w:val="000000"/>
           <w:sz w:val="34"/>
           <w:szCs w:val="34"/>
-          <w:rtl w:val="0"/>
-        </w:rPr>
-        <w:t xml:space="preserve">EDUCATION</w:t>
-      </w:r>
-    </w:p>
-    <w:p>
-      <w:pPr>
-        <w:spacing w:after="240" w:before="240" w:line="240" w:lineRule="auto"/>
-        <w:rPr/>
-      </w:pPr>
-      <w:r>
-        <w:rPr>
-          <w:rtl w:val="0"/>
-        </w:rPr>
-        <w:t xml:space="preserve">Bachelor of Science in Computer Science &amp; Applied Mathematics</w:t>
-        <w:br w:type="textWrapping"/>
-        <w:t xml:space="preserve">University of Fort Hare</w:t>
-      </w:r>
-    </w:p>
-    <w:p>
-      <w:pPr>
-        <w:spacing w:after="240" w:before="240" w:line="240" w:lineRule="auto"/>
-        <w:rPr/>
-      </w:pPr>
-      <w:r>
-        <w:rPr>
-          <w:rtl w:val="0"/>
-        </w:rPr>
-        <w:t xml:space="preserve">Software Engineering Programme</w:t>
-        <w:br w:type="textWrapping"/>
-        <w:t xml:space="preserve">WeThinkCode_</w:t>
-      </w:r>
-    </w:p>
-    <w:p>
-      <w:pPr>
-        <w:spacing w:after="240" w:before="240" w:line="240" w:lineRule="auto"/>
-        <w:rPr/>
-      </w:pPr>
-      <w:r>
-        <w:rPr>
-          <w:rtl w:val="0"/>
-        </w:rPr>
-        <w:t xml:space="preserve">Data Science Programme</w:t>
-        <w:br w:type="textWrapping"/>
-        <w:t xml:space="preserve">ExploreAI Academy</w:t>
+        </w:rPr>
+        <w:t>EDUCATION</w:t>
+      </w:r>
+    </w:p>
+    <w:p>
+      <w:pPr>
+        <w:spacing w:before="240" w:after="240" w:line="240" w:lineRule="auto"/>
+      </w:pPr>
+      <w:r>
+        <w:t>Bachelor of Science in Computer Science &amp; Applied Mathematics</w:t>
+      </w:r>
+      <w:r>
+        <w:br/>
+        <w:t>University of Fort Hare</w:t>
+      </w:r>
+    </w:p>
+    <w:p>
+      <w:pPr>
+        <w:spacing w:before="240" w:after="240" w:line="240" w:lineRule="auto"/>
+      </w:pPr>
+      <w:r>
+        <w:t>Software Engineering Programme</w:t>
+      </w:r>
+      <w:r>
+        <w:br/>
+        <w:t>WeThinkCode_</w:t>
+      </w:r>
+    </w:p>
+    <w:p>
+      <w:pPr>
+        <w:spacing w:before="240" w:after="240" w:line="240" w:lineRule="auto"/>
+      </w:pPr>
+      <w:r>
+        <w:t>Data Science Programme</w:t>
+      </w:r>
+      <w:r>
+        <w:br/>
+        <w:t>ExploreAI Academy</w:t>
       </w:r>
     </w:p>
     <w:p>
       <w:pPr>
         <w:spacing w:after="0" w:line="240" w:lineRule="auto"/>
         <w:ind w:left="720" w:hanging="360"/>
-        <w:rPr/>
-      </w:pPr>
-      <w:r>
-        <w:pict>
-          <v:rect style="width:0.0pt;height:1.5pt" o:hr="t" o:hrstd="t" o:hralign="center" fillcolor="#A0A0A0" stroked="f"/>
+      </w:pPr>
+      <w:r>
+        <w:pict w14:anchorId="1626F409">
+          <v:rect id="_x0000_i1030" style="width:0;height:1.5pt" o:hralign="center" o:hrstd="t" o:hr="t" fillcolor="#a0a0a0" stroked="f"/>
         </w:pict>
-      </w:r>
-      <w:r>
-        <w:rPr>
-          <w:rtl w:val="0"/>
-        </w:rPr>
       </w:r>
     </w:p>
     <w:p>
@@ -1378,25 +1127,23 @@
         <w:keepNext w:val="0"/>
         <w:keepLines w:val="0"/>
         <w:spacing w:before="360" w:line="240" w:lineRule="auto"/>
-        <w:ind w:left="0" w:firstLine="0"/>
-        <w:rPr>
-          <w:rFonts w:ascii="Arial" w:cs="Arial" w:eastAsia="Arial" w:hAnsi="Arial"/>
+        <w:rPr>
+          <w:rFonts w:ascii="Arial" w:eastAsia="Arial" w:hAnsi="Arial" w:cs="Arial"/>
           <w:color w:val="000000"/>
           <w:sz w:val="34"/>
           <w:szCs w:val="34"/>
         </w:rPr>
       </w:pPr>
-      <w:bookmarkStart w:colFirst="0" w:colLast="0" w:name="_heading=h.xknf1qvwn24q" w:id="12"/>
+      <w:bookmarkStart w:id="12" w:name="_heading=h.xknf1qvwn24q" w:colFirst="0" w:colLast="0"/>
       <w:bookmarkEnd w:id="12"/>
       <w:r>
         <w:rPr>
-          <w:rFonts w:ascii="Arial" w:cs="Arial" w:eastAsia="Arial" w:hAnsi="Arial"/>
+          <w:rFonts w:ascii="Arial" w:eastAsia="Arial" w:hAnsi="Arial" w:cs="Arial"/>
           <w:color w:val="000000"/>
           <w:sz w:val="34"/>
           <w:szCs w:val="34"/>
-          <w:rtl w:val="0"/>
-        </w:rPr>
-        <w:t xml:space="preserve">CORE COMPETENCIES</w:t>
+        </w:rPr>
+        <w:t>CORE COMPETENCIES</w:t>
       </w:r>
     </w:p>
     <w:p>
@@ -1405,168 +1152,117 @@
           <w:ilvl w:val="0"/>
           <w:numId w:val="4"/>
         </w:numPr>
-        <w:spacing w:after="0" w:afterAutospacing="0" w:before="240" w:line="240" w:lineRule="auto"/>
+        <w:spacing w:before="240" w:after="0" w:line="240" w:lineRule="auto"/>
+      </w:pPr>
+      <w:r>
+        <w:t>SQL Querying &amp; Database Exploration</w:t>
+      </w:r>
+    </w:p>
+    <w:p>
+      <w:pPr>
+        <w:numPr>
+          <w:ilvl w:val="0"/>
+          <w:numId w:val="4"/>
+        </w:numPr>
+        <w:spacing w:after="0" w:line="240" w:lineRule="auto"/>
+      </w:pPr>
+      <w:r>
+        <w:t>Excel &amp; Business Reporting</w:t>
+      </w:r>
+    </w:p>
+    <w:p>
+      <w:pPr>
+        <w:numPr>
+          <w:ilvl w:val="0"/>
+          <w:numId w:val="4"/>
+        </w:numPr>
+        <w:spacing w:after="0" w:line="240" w:lineRule="auto"/>
+      </w:pPr>
+      <w:r>
+        <w:t>Power BI Dashboard Development</w:t>
+      </w:r>
+    </w:p>
+    <w:p>
+      <w:pPr>
+        <w:numPr>
+          <w:ilvl w:val="0"/>
+          <w:numId w:val="4"/>
+        </w:numPr>
+        <w:spacing w:after="0" w:line="240" w:lineRule="auto"/>
+      </w:pPr>
+      <w:r>
+        <w:t>Python for Data Analysis</w:t>
+      </w:r>
+    </w:p>
+    <w:p>
+      <w:pPr>
+        <w:numPr>
+          <w:ilvl w:val="0"/>
+          <w:numId w:val="4"/>
+        </w:numPr>
+        <w:spacing w:after="0" w:line="240" w:lineRule="auto"/>
+      </w:pPr>
+      <w:r>
+        <w:t>Data Cleaning &amp; EDA</w:t>
+      </w:r>
+    </w:p>
+    <w:p>
+      <w:pPr>
+        <w:numPr>
+          <w:ilvl w:val="0"/>
+          <w:numId w:val="4"/>
+        </w:numPr>
+        <w:spacing w:after="0" w:line="240" w:lineRule="auto"/>
+      </w:pPr>
+      <w:r>
+        <w:t>KPI Development</w:t>
+      </w:r>
+    </w:p>
+    <w:p>
+      <w:pPr>
+        <w:numPr>
+          <w:ilvl w:val="0"/>
+          <w:numId w:val="4"/>
+        </w:numPr>
+        <w:spacing w:after="0" w:line="240" w:lineRule="auto"/>
+      </w:pPr>
+      <w:r>
+        <w:t>Predictive Model Development</w:t>
+      </w:r>
+    </w:p>
+    <w:p>
+      <w:pPr>
+        <w:numPr>
+          <w:ilvl w:val="0"/>
+          <w:numId w:val="4"/>
+        </w:numPr>
+        <w:spacing w:after="0" w:line="240" w:lineRule="auto"/>
+      </w:pPr>
+      <w:r>
+        <w:t>Live Training &amp; Mentorship</w:t>
+      </w:r>
+    </w:p>
+    <w:p>
+      <w:pPr>
+        <w:numPr>
+          <w:ilvl w:val="0"/>
+          <w:numId w:val="4"/>
+        </w:numPr>
+        <w:spacing w:after="240" w:line="240" w:lineRule="auto"/>
+      </w:pPr>
+      <w:r>
+        <w:t>Strong Communication Skills</w:t>
+      </w:r>
+    </w:p>
+    <w:p>
+      <w:pPr>
+        <w:spacing w:after="0" w:line="240" w:lineRule="auto"/>
         <w:ind w:left="720" w:hanging="360"/>
-        <w:rPr/>
-      </w:pPr>
-      <w:r>
-        <w:rPr>
-          <w:rtl w:val="0"/>
-        </w:rPr>
-        <w:t xml:space="preserve">SQL Querying &amp; Database Exploration</w:t>
-      </w:r>
-    </w:p>
-    <w:p>
-      <w:pPr>
-        <w:numPr>
-          <w:ilvl w:val="0"/>
-          <w:numId w:val="4"/>
-        </w:numPr>
-        <w:spacing w:after="0" w:afterAutospacing="0" w:before="0" w:beforeAutospacing="0" w:line="240" w:lineRule="auto"/>
-        <w:ind w:left="720" w:hanging="360"/>
-        <w:rPr/>
-      </w:pPr>
-      <w:r>
-        <w:rPr>
-          <w:rtl w:val="0"/>
-        </w:rPr>
-        <w:t xml:space="preserve">Excel &amp; Business Reporting</w:t>
-      </w:r>
-    </w:p>
-    <w:p>
-      <w:pPr>
-        <w:numPr>
-          <w:ilvl w:val="0"/>
-          <w:numId w:val="4"/>
-        </w:numPr>
-        <w:spacing w:after="0" w:afterAutospacing="0" w:before="0" w:beforeAutospacing="0" w:line="240" w:lineRule="auto"/>
-        <w:ind w:left="720" w:hanging="360"/>
-        <w:rPr/>
-      </w:pPr>
-      <w:r>
-        <w:rPr>
-          <w:rtl w:val="0"/>
-        </w:rPr>
-        <w:t xml:space="preserve">Power BI Dashboard Development</w:t>
-      </w:r>
-    </w:p>
-    <w:p>
-      <w:pPr>
-        <w:numPr>
-          <w:ilvl w:val="0"/>
-          <w:numId w:val="4"/>
-        </w:numPr>
-        <w:spacing w:after="0" w:afterAutospacing="0" w:before="0" w:beforeAutospacing="0" w:line="240" w:lineRule="auto"/>
-        <w:ind w:left="720" w:hanging="360"/>
-        <w:rPr/>
-      </w:pPr>
-      <w:r>
-        <w:rPr>
-          <w:rtl w:val="0"/>
-        </w:rPr>
-        <w:t xml:space="preserve">Python for Data Analysis</w:t>
-      </w:r>
-    </w:p>
-    <w:p>
-      <w:pPr>
-        <w:numPr>
-          <w:ilvl w:val="0"/>
-          <w:numId w:val="4"/>
-        </w:numPr>
-        <w:spacing w:after="0" w:afterAutospacing="0" w:before="0" w:beforeAutospacing="0" w:line="240" w:lineRule="auto"/>
-        <w:ind w:left="720" w:hanging="360"/>
-        <w:rPr/>
-      </w:pPr>
-      <w:r>
-        <w:rPr>
-          <w:rtl w:val="0"/>
-        </w:rPr>
-        <w:t xml:space="preserve">Data Cleaning &amp; EDA</w:t>
-      </w:r>
-    </w:p>
-    <w:p>
-      <w:pPr>
-        <w:numPr>
-          <w:ilvl w:val="0"/>
-          <w:numId w:val="4"/>
-        </w:numPr>
-        <w:spacing w:after="0" w:afterAutospacing="0" w:before="0" w:beforeAutospacing="0" w:line="240" w:lineRule="auto"/>
-        <w:ind w:left="720" w:hanging="360"/>
-        <w:rPr/>
-      </w:pPr>
-      <w:r>
-        <w:rPr>
-          <w:rtl w:val="0"/>
-        </w:rPr>
-        <w:t xml:space="preserve">KPI Development</w:t>
-      </w:r>
-    </w:p>
-    <w:p>
-      <w:pPr>
-        <w:numPr>
-          <w:ilvl w:val="0"/>
-          <w:numId w:val="4"/>
-        </w:numPr>
-        <w:spacing w:after="0" w:afterAutospacing="0" w:before="0" w:beforeAutospacing="0" w:line="240" w:lineRule="auto"/>
-        <w:ind w:left="720" w:hanging="360"/>
-        <w:rPr/>
-      </w:pPr>
-      <w:r>
-        <w:rPr>
-          <w:rtl w:val="0"/>
-        </w:rPr>
-        <w:t xml:space="preserve">Predictive Model Development</w:t>
-      </w:r>
-    </w:p>
-    <w:p>
-      <w:pPr>
-        <w:numPr>
-          <w:ilvl w:val="0"/>
-          <w:numId w:val="4"/>
-        </w:numPr>
-        <w:spacing w:after="0" w:afterAutospacing="0" w:before="0" w:beforeAutospacing="0" w:line="240" w:lineRule="auto"/>
-        <w:ind w:left="720" w:hanging="360"/>
-        <w:rPr/>
-      </w:pPr>
-      <w:r>
-        <w:rPr>
-          <w:rtl w:val="0"/>
-        </w:rPr>
-        <w:t xml:space="preserve">Live Training &amp; Mentorship</w:t>
-      </w:r>
-    </w:p>
-    <w:p>
-      <w:pPr>
-        <w:numPr>
-          <w:ilvl w:val="0"/>
-          <w:numId w:val="4"/>
-        </w:numPr>
-        <w:spacing w:after="240" w:before="0" w:beforeAutospacing="0" w:line="240" w:lineRule="auto"/>
-        <w:ind w:left="720" w:hanging="360"/>
-        <w:rPr/>
-      </w:pPr>
-      <w:r>
-        <w:rPr>
-          <w:rtl w:val="0"/>
-        </w:rPr>
-        <w:t xml:space="preserve">Strong Communication Skills</w:t>
-      </w:r>
-    </w:p>
-    <w:p>
-      <w:pPr>
-        <w:spacing w:after="0" w:line="240" w:lineRule="auto"/>
-        <w:ind w:left="720" w:hanging="360"/>
-        <w:rPr/>
-      </w:pPr>
-      <w:r>
-        <w:pict>
-          <v:rect style="width:0.0pt;height:1.5pt" o:hr="t" o:hrstd="t" o:hralign="center" fillcolor="#A0A0A0" stroked="f"/>
+      </w:pPr>
+      <w:r>
+        <w:pict w14:anchorId="014E6285">
+          <v:rect id="_x0000_i1031" style="width:0;height:1.5pt" o:hralign="center" o:hrstd="t" o:hr="t" fillcolor="#a0a0a0" stroked="f"/>
         </w:pict>
-      </w:r>
-      <w:r>
-        <w:rPr>
-          <w:rtl w:val="0"/>
-        </w:rPr>
       </w:r>
     </w:p>
     <w:p>
@@ -1575,25 +1271,23 @@
         <w:keepNext w:val="0"/>
         <w:keepLines w:val="0"/>
         <w:spacing w:before="360" w:line="240" w:lineRule="auto"/>
-        <w:ind w:left="0" w:firstLine="0"/>
-        <w:rPr>
-          <w:rFonts w:ascii="Arial" w:cs="Arial" w:eastAsia="Arial" w:hAnsi="Arial"/>
+        <w:rPr>
+          <w:rFonts w:ascii="Arial" w:eastAsia="Arial" w:hAnsi="Arial" w:cs="Arial"/>
           <w:color w:val="000000"/>
           <w:sz w:val="34"/>
           <w:szCs w:val="34"/>
         </w:rPr>
       </w:pPr>
-      <w:bookmarkStart w:colFirst="0" w:colLast="0" w:name="_heading=h.of1lprilrrq2" w:id="13"/>
+      <w:bookmarkStart w:id="13" w:name="_heading=h.of1lprilrrq2" w:colFirst="0" w:colLast="0"/>
       <w:bookmarkEnd w:id="13"/>
       <w:r>
         <w:rPr>
-          <w:rFonts w:ascii="Arial" w:cs="Arial" w:eastAsia="Arial" w:hAnsi="Arial"/>
+          <w:rFonts w:ascii="Arial" w:eastAsia="Arial" w:hAnsi="Arial" w:cs="Arial"/>
           <w:color w:val="000000"/>
           <w:sz w:val="34"/>
           <w:szCs w:val="34"/>
-          <w:rtl w:val="0"/>
-        </w:rPr>
-        <w:t xml:space="preserve">PERSONAL ATTRIBUTES</w:t>
+        </w:rPr>
+        <w:t>PERSONAL ATTRIBUTES</w:t>
       </w:r>
     </w:p>
     <w:p>
@@ -1602,15 +1296,11 @@
           <w:ilvl w:val="0"/>
           <w:numId w:val="8"/>
         </w:numPr>
-        <w:spacing w:after="0" w:afterAutospacing="0" w:before="240" w:line="240" w:lineRule="auto"/>
-        <w:ind w:left="720" w:hanging="360"/>
-        <w:rPr/>
-      </w:pPr>
-      <w:r>
-        <w:rPr>
-          <w:rtl w:val="0"/>
-        </w:rPr>
-        <w:t xml:space="preserve">Patient and supportive mentor for learners at all skill levels</w:t>
+        <w:spacing w:before="240" w:after="0" w:line="240" w:lineRule="auto"/>
+      </w:pPr>
+      <w:r>
+        <w:lastRenderedPageBreak/>
+        <w:t>Patient and supportive mentor for learners at all skill levels</w:t>
       </w:r>
     </w:p>
     <w:p>
@@ -1619,15 +1309,10 @@
           <w:ilvl w:val="0"/>
           <w:numId w:val="8"/>
         </w:numPr>
-        <w:spacing w:after="0" w:afterAutospacing="0" w:before="0" w:beforeAutospacing="0" w:line="240" w:lineRule="auto"/>
-        <w:ind w:left="720" w:hanging="360"/>
-        <w:rPr/>
-      </w:pPr>
-      <w:r>
-        <w:rPr>
-          <w:rtl w:val="0"/>
-        </w:rPr>
-        <w:t xml:space="preserve">Strong ability to explain complex technical concepts in simple, structured ways</w:t>
+        <w:spacing w:after="0" w:line="240" w:lineRule="auto"/>
+      </w:pPr>
+      <w:r>
+        <w:t>Strong ability to explain complex technical concepts in simple, structured ways</w:t>
       </w:r>
     </w:p>
     <w:p>
@@ -1636,15 +1321,10 @@
           <w:ilvl w:val="0"/>
           <w:numId w:val="8"/>
         </w:numPr>
-        <w:spacing w:after="0" w:afterAutospacing="0" w:before="0" w:beforeAutospacing="0" w:line="240" w:lineRule="auto"/>
-        <w:ind w:left="720" w:hanging="360"/>
-        <w:rPr/>
-      </w:pPr>
-      <w:r>
-        <w:rPr>
-          <w:rtl w:val="0"/>
-        </w:rPr>
-        <w:t xml:space="preserve">Analytical thinker with excellent problem-solving skills</w:t>
+        <w:spacing w:after="0" w:line="240" w:lineRule="auto"/>
+      </w:pPr>
+      <w:r>
+        <w:t>Analytical thinker with excellent problem-solving skills</w:t>
       </w:r>
     </w:p>
     <w:p>
@@ -1653,15 +1333,10 @@
           <w:ilvl w:val="0"/>
           <w:numId w:val="8"/>
         </w:numPr>
-        <w:spacing w:after="0" w:afterAutospacing="0" w:before="0" w:beforeAutospacing="0" w:line="240" w:lineRule="auto"/>
-        <w:ind w:left="720" w:hanging="360"/>
-        <w:rPr/>
-      </w:pPr>
-      <w:r>
-        <w:rPr>
-          <w:rtl w:val="0"/>
-        </w:rPr>
-        <w:t xml:space="preserve">Comfortable delivering sessions both online and in-person</w:t>
+        <w:spacing w:after="0" w:line="240" w:lineRule="auto"/>
+      </w:pPr>
+      <w:r>
+        <w:t>Comfortable delivering sessions both online and in-person</w:t>
       </w:r>
     </w:p>
     <w:p>
@@ -1670,54 +1345,41 @@
           <w:ilvl w:val="0"/>
           <w:numId w:val="8"/>
         </w:numPr>
-        <w:spacing w:after="240" w:before="0" w:beforeAutospacing="0" w:line="240" w:lineRule="auto"/>
-        <w:ind w:left="720" w:hanging="360"/>
-        <w:rPr/>
-      </w:pPr>
-      <w:r>
-        <w:rPr>
-          <w:rtl w:val="0"/>
-        </w:rPr>
-        <w:t xml:space="preserve">Available for full-time, on-site work</w:t>
-      </w:r>
-    </w:p>
-    <w:p>
-      <w:pPr>
-        <w:keepNext w:val="0"/>
-        <w:keepLines w:val="0"/>
-        <w:pageBreakBefore w:val="0"/>
-        <w:widowControl w:val="1"/>
+        <w:spacing w:after="240" w:line="240" w:lineRule="auto"/>
+      </w:pPr>
+      <w:r>
+        <w:t>Available for full-time, on-site work</w:t>
+      </w:r>
+    </w:p>
+    <w:p>
+      <w:pPr>
         <w:pBdr>
-          <w:top w:space="0" w:sz="0" w:val="nil"/>
-          <w:left w:space="0" w:sz="0" w:val="nil"/>
-          <w:bottom w:space="0" w:sz="0" w:val="nil"/>
-          <w:right w:space="0" w:sz="0" w:val="nil"/>
-          <w:between w:space="0" w:sz="0" w:val="nil"/>
+          <w:top w:val="nil"/>
+          <w:left w:val="nil"/>
+          <w:bottom w:val="nil"/>
+          <w:right w:val="nil"/>
+          <w:between w:val="nil"/>
         </w:pBdr>
-        <w:shd w:fill="auto" w:val="clear"/>
-        <w:spacing w:after="0" w:before="0" w:line="240" w:lineRule="auto"/>
-        <w:ind w:left="720" w:right="0" w:firstLine="0"/>
-        <w:jc w:val="left"/>
-        <w:rPr/>
-      </w:pPr>
-      <w:r>
-        <w:rPr>
-          <w:rtl w:val="0"/>
-        </w:rPr>
-      </w:r>
+        <w:spacing w:after="0" w:line="240" w:lineRule="auto"/>
+        <w:ind w:left="720"/>
+      </w:pPr>
     </w:p>
     <w:sectPr>
-      <w:pgSz w:h="16838" w:w="11906" w:orient="portrait"/>
-      <w:pgMar w:bottom="1440" w:top="1440" w:left="1440" w:right="1440" w:header="708" w:footer="708"/>
+      <w:pgSz w:w="11906" w:h="16838"/>
+      <w:pgMar w:top="1440" w:right="1440" w:bottom="1440" w:left="1440" w:header="708" w:footer="708" w:gutter="0"/>
       <w:pgNumType w:start="1"/>
+      <w:cols w:space="720"/>
     </w:sectPr>
   </w:body>
 </w:document>
 </file>
 
 <file path=word/numbering.xml><?xml version="1.0" encoding="utf-8"?>
-<w:numbering xmlns:mc="http://schemas.openxmlformats.org/markup-compatibility/2006" xmlns:o="urn:schemas-microsoft-com:office:office" xmlns:r="http://schemas.openxmlformats.org/officeDocument/2006/relationships" xmlns:m="http://schemas.openxmlformats.org/officeDocument/2006/math" xmlns:v="urn:schemas-microsoft-com:vml" xmlns:wp="http://schemas.openxmlformats.org/drawingml/2006/wordprocessingDrawing" xmlns:w10="urn:schemas-microsoft-com:office:word" xmlns:w="http://schemas.openxmlformats.org/wordprocessingml/2006/main" xmlns:wne="http://schemas.microsoft.com/office/word/2006/wordml" xmlns:sl="http://schemas.openxmlformats.org/schemaLibrary/2006/main" xmlns:a="http://schemas.openxmlformats.org/drawingml/2006/main" xmlns:pic="http://schemas.openxmlformats.org/drawingml/2006/picture" xmlns:c="http://schemas.openxmlformats.org/drawingml/2006/chart" xmlns:lc="http://schemas.openxmlformats.org/drawingml/2006/lockedCanvas" xmlns:dgm="http://schemas.openxmlformats.org/drawingml/2006/diagram" xmlns:wps="http://schemas.microsoft.com/office/word/2010/wordprocessingShape" xmlns:wpg="http://schemas.microsoft.com/office/word/2010/wordprocessingGroup" xmlns:w14="http://schemas.microsoft.com/office/word/2010/wordml" xmlns:w15="http://schemas.microsoft.com/office/word/2012/wordml" xmlns:w16="http://schemas.microsoft.com/office/word/2018/wordml" xmlns:w16cex="http://schemas.microsoft.com/office/word/2018/wordml/cex" xmlns:w16cid="http://schemas.microsoft.com/office/word/2016/wordml/cid" xmlns="http://schemas.microsoft.com/office/tasks/2019/documenttasks" xmlns:cr="http://schemas.microsoft.com/office/comments/2020/reactions">
-  <w:abstractNum w:abstractNumId="1">
+<w:numbering xmlns:wpc="http://schemas.microsoft.com/office/word/2010/wordprocessingCanvas" xmlns:cx="http://schemas.microsoft.com/office/drawing/2014/chartex" xmlns:cx1="http://schemas.microsoft.com/office/drawing/2015/9/8/chartex" xmlns:cx2="http://schemas.microsoft.com/office/drawing/2015/10/21/chartex" xmlns:cx3="http://schemas.microsoft.com/office/drawing/2016/5/9/chartex" xmlns:cx4="http://schemas.microsoft.com/office/drawing/2016/5/10/chartex" xmlns:cx5="http://schemas.microsoft.com/office/drawing/2016/5/11/chartex" xmlns:cx6="http://schemas.microsoft.com/office/drawing/2016/5/12/chartex" xmlns:cx7="http://schemas.microsoft.com/office/drawing/2016/5/13/chartex" xmlns:cx8="http://schemas.microsoft.com/office/drawing/2016/5/14/chartex" xmlns:mc="http://schemas.openxmlformats.org/markup-compatibility/2006" xmlns:aink="http://schemas.microsoft.com/office/drawing/2016/ink" xmlns:am3d="http://schemas.microsoft.com/office/drawing/2017/model3d" xmlns:o="urn:schemas-microsoft-com:office:office" xmlns:oel="http://schemas.microsoft.com/office/2019/extlst" xmlns:r="http://schemas.openxmlformats.org/officeDocument/2006/relationships" xmlns:m="http://schemas.openxmlformats.org/officeDocument/2006/math" xmlns:v="urn:schemas-microsoft-com:vml" xmlns:wp14="http://schemas.microsoft.com/office/word/2010/wordprocessingDrawing" xmlns:wp="http://schemas.openxmlformats.org/drawingml/2006/wordprocessingDrawing" xmlns:w10="urn:schemas-microsoft-com:office:word" xmlns:w="http://schemas.openxmlformats.org/wordprocessingml/2006/main" xmlns:w14="http://schemas.microsoft.com/office/word/2010/wordml" xmlns:w15="http://schemas.microsoft.com/office/word/2012/wordml" xmlns:w16cex="http://schemas.microsoft.com/office/word/2018/wordml/cex" xmlns:w16cid="http://schemas.microsoft.com/office/word/2016/wordml/cid" xmlns:w16="http://schemas.microsoft.com/office/word/2018/wordml" xmlns:w16du="http://schemas.microsoft.com/office/word/2023/wordml/word16du" xmlns:w16sdtdh="http://schemas.microsoft.com/office/word/2020/wordml/sdtdatahash" xmlns:w16sdtfl="http://schemas.microsoft.com/office/word/2024/wordml/sdtformatlock" xmlns:w16se="http://schemas.microsoft.com/office/word/2015/wordml/symex" xmlns:wpg="http://schemas.microsoft.com/office/word/2010/wordprocessingGroup" xmlns:wpi="http://schemas.microsoft.com/office/word/2010/wordprocessingInk" xmlns:wne="http://schemas.microsoft.com/office/word/2006/wordml" xmlns:wps="http://schemas.microsoft.com/office/word/2010/wordprocessingShape" mc:Ignorable="w14 w15 w16se w16cid w16 w16cex w16sdtdh w16sdtfl w16du wp14">
+  <w:abstractNum w:abstractNumId="0" w15:restartNumberingAfterBreak="0">
+    <w:nsid w:val="04D6439E"/>
+    <w:multiLevelType w:val="multilevel"/>
+    <w:tmpl w:val="8B8AA2C0"/>
     <w:lvl w:ilvl="0">
       <w:start w:val="1"/>
       <w:numFmt w:val="bullet"/>
@@ -1827,7 +1489,10 @@
       </w:rPr>
     </w:lvl>
   </w:abstractNum>
-  <w:abstractNum w:abstractNumId="2">
+  <w:abstractNum w:abstractNumId="1" w15:restartNumberingAfterBreak="0">
+    <w:nsid w:val="09CA29FE"/>
+    <w:multiLevelType w:val="multilevel"/>
+    <w:tmpl w:val="3C725120"/>
     <w:lvl w:ilvl="0">
       <w:start w:val="1"/>
       <w:numFmt w:val="bullet"/>
@@ -1937,7 +1602,10 @@
       </w:rPr>
     </w:lvl>
   </w:abstractNum>
-  <w:abstractNum w:abstractNumId="3">
+  <w:abstractNum w:abstractNumId="2" w15:restartNumberingAfterBreak="0">
+    <w:nsid w:val="13BC4F68"/>
+    <w:multiLevelType w:val="multilevel"/>
+    <w:tmpl w:val="FD5EACA4"/>
     <w:lvl w:ilvl="0">
       <w:start w:val="1"/>
       <w:numFmt w:val="bullet"/>
@@ -2047,7 +1715,10 @@
       </w:rPr>
     </w:lvl>
   </w:abstractNum>
-  <w:abstractNum w:abstractNumId="4">
+  <w:abstractNum w:abstractNumId="3" w15:restartNumberingAfterBreak="0">
+    <w:nsid w:val="30EF79B9"/>
+    <w:multiLevelType w:val="multilevel"/>
+    <w:tmpl w:val="0C684C90"/>
     <w:lvl w:ilvl="0">
       <w:start w:val="1"/>
       <w:numFmt w:val="bullet"/>
@@ -2157,7 +1828,10 @@
       </w:rPr>
     </w:lvl>
   </w:abstractNum>
-  <w:abstractNum w:abstractNumId="5">
+  <w:abstractNum w:abstractNumId="4" w15:restartNumberingAfterBreak="0">
+    <w:nsid w:val="54C43D4D"/>
+    <w:multiLevelType w:val="multilevel"/>
+    <w:tmpl w:val="0C9AB0E6"/>
     <w:lvl w:ilvl="0">
       <w:start w:val="1"/>
       <w:numFmt w:val="bullet"/>
@@ -2267,7 +1941,10 @@
       </w:rPr>
     </w:lvl>
   </w:abstractNum>
-  <w:abstractNum w:abstractNumId="6">
+  <w:abstractNum w:abstractNumId="5" w15:restartNumberingAfterBreak="0">
+    <w:nsid w:val="598E5FDD"/>
+    <w:multiLevelType w:val="multilevel"/>
+    <w:tmpl w:val="D2F802F0"/>
     <w:lvl w:ilvl="0">
       <w:start w:val="1"/>
       <w:numFmt w:val="bullet"/>
@@ -2377,7 +2054,10 @@
       </w:rPr>
     </w:lvl>
   </w:abstractNum>
-  <w:abstractNum w:abstractNumId="7">
+  <w:abstractNum w:abstractNumId="6" w15:restartNumberingAfterBreak="0">
+    <w:nsid w:val="76671BE6"/>
+    <w:multiLevelType w:val="multilevel"/>
+    <w:tmpl w:val="92762182"/>
     <w:lvl w:ilvl="0">
       <w:start w:val="1"/>
       <w:numFmt w:val="bullet"/>
@@ -2487,7 +2167,10 @@
       </w:rPr>
     </w:lvl>
   </w:abstractNum>
-  <w:abstractNum w:abstractNumId="8">
+  <w:abstractNum w:abstractNumId="7" w15:restartNumberingAfterBreak="0">
+    <w:nsid w:val="76946657"/>
+    <w:multiLevelType w:val="multilevel"/>
+    <w:tmpl w:val="DC9C02C2"/>
     <w:lvl w:ilvl="0">
       <w:start w:val="1"/>
       <w:numFmt w:val="bullet"/>
@@ -2597,42 +2280,42 @@
       </w:rPr>
     </w:lvl>
   </w:abstractNum>
-  <w:num w:numId="1">
+  <w:num w:numId="1" w16cid:durableId="693574131">
+    <w:abstractNumId w:val="6"/>
+  </w:num>
+  <w:num w:numId="2" w16cid:durableId="1819305421">
+    <w:abstractNumId w:val="4"/>
+  </w:num>
+  <w:num w:numId="3" w16cid:durableId="1243416748">
+    <w:abstractNumId w:val="7"/>
+  </w:num>
+  <w:num w:numId="4" w16cid:durableId="253170121">
+    <w:abstractNumId w:val="3"/>
+  </w:num>
+  <w:num w:numId="5" w16cid:durableId="1064259405">
     <w:abstractNumId w:val="1"/>
   </w:num>
-  <w:num w:numId="2">
+  <w:num w:numId="6" w16cid:durableId="1747726364">
     <w:abstractNumId w:val="2"/>
   </w:num>
-  <w:num w:numId="3">
-    <w:abstractNumId w:val="3"/>
-  </w:num>
-  <w:num w:numId="4">
-    <w:abstractNumId w:val="4"/>
-  </w:num>
-  <w:num w:numId="5">
+  <w:num w:numId="7" w16cid:durableId="213733484">
     <w:abstractNumId w:val="5"/>
   </w:num>
-  <w:num w:numId="6">
-    <w:abstractNumId w:val="6"/>
-  </w:num>
-  <w:num w:numId="7">
-    <w:abstractNumId w:val="7"/>
-  </w:num>
-  <w:num w:numId="8">
-    <w:abstractNumId w:val="8"/>
+  <w:num w:numId="8" w16cid:durableId="1664818171">
+    <w:abstractNumId w:val="0"/>
   </w:num>
 </w:numbering>
 </file>
 
 <file path=word/styles.xml><?xml version="1.0" encoding="utf-8"?>
-<w:styles xmlns:mc="http://schemas.openxmlformats.org/markup-compatibility/2006" xmlns:o="urn:schemas-microsoft-com:office:office" xmlns:r="http://schemas.openxmlformats.org/officeDocument/2006/relationships" xmlns:m="http://schemas.openxmlformats.org/officeDocument/2006/math" xmlns:v="urn:schemas-microsoft-com:vml" xmlns:wp="http://schemas.openxmlformats.org/drawingml/2006/wordprocessingDrawing" xmlns:w10="urn:schemas-microsoft-com:office:word" xmlns:w="http://schemas.openxmlformats.org/wordprocessingml/2006/main" xmlns:wne="http://schemas.microsoft.com/office/word/2006/wordml" xmlns:sl="http://schemas.openxmlformats.org/schemaLibrary/2006/main" xmlns:a="http://schemas.openxmlformats.org/drawingml/2006/main" xmlns:pic="http://schemas.openxmlformats.org/drawingml/2006/picture" xmlns:c="http://schemas.openxmlformats.org/drawingml/2006/chart" xmlns:lc="http://schemas.openxmlformats.org/drawingml/2006/lockedCanvas" xmlns:dgm="http://schemas.openxmlformats.org/drawingml/2006/diagram" xmlns:wps="http://schemas.microsoft.com/office/word/2010/wordprocessingShape" xmlns:wpg="http://schemas.microsoft.com/office/word/2010/wordprocessingGroup" xmlns:w14="http://schemas.microsoft.com/office/word/2010/wordml" xmlns:w15="http://schemas.microsoft.com/office/word/2012/wordml" xmlns:w16="http://schemas.microsoft.com/office/word/2018/wordml" xmlns:w16cex="http://schemas.microsoft.com/office/word/2018/wordml/cex" xmlns:w16cid="http://schemas.microsoft.com/office/word/2016/wordml/cid" xmlns="http://schemas.microsoft.com/office/tasks/2019/documenttasks" xmlns:cr="http://schemas.microsoft.com/office/comments/2020/reactions">
+<w:styles xmlns:mc="http://schemas.openxmlformats.org/markup-compatibility/2006" xmlns:r="http://schemas.openxmlformats.org/officeDocument/2006/relationships" xmlns:w="http://schemas.openxmlformats.org/wordprocessingml/2006/main" xmlns:w14="http://schemas.microsoft.com/office/word/2010/wordml" xmlns:w15="http://schemas.microsoft.com/office/word/2012/wordml" xmlns:w16cex="http://schemas.microsoft.com/office/word/2018/wordml/cex" xmlns:w16cid="http://schemas.microsoft.com/office/word/2016/wordml/cid" xmlns:w16="http://schemas.microsoft.com/office/word/2018/wordml" xmlns:w16du="http://schemas.microsoft.com/office/word/2023/wordml/word16du" xmlns:w16sdtdh="http://schemas.microsoft.com/office/word/2020/wordml/sdtdatahash" xmlns:w16sdtfl="http://schemas.microsoft.com/office/word/2024/wordml/sdtformatlock" xmlns:w16se="http://schemas.microsoft.com/office/word/2015/wordml/symex" mc:Ignorable="w14 w15 w16se w16cid w16 w16cex w16sdtdh w16sdtfl w16du">
   <w:docDefaults>
     <w:rPrDefault>
       <w:rPr>
-        <w:rFonts w:ascii="Arial" w:cs="Arial" w:eastAsia="Arial" w:hAnsi="Arial"/>
+        <w:rFonts w:ascii="Arial" w:eastAsia="Arial" w:hAnsi="Arial" w:cs="Arial"/>
         <w:sz w:val="24"/>
         <w:szCs w:val="24"/>
-        <w:lang w:val="en-ZA"/>
+        <w:lang w:val="en-ZA" w:eastAsia="en-ZA" w:bidi="ar-SA"/>
       </w:rPr>
     </w:rPrDefault>
     <w:pPrDefault>
@@ -2641,32 +2324,404 @@
       </w:pPr>
     </w:pPrDefault>
   </w:docDefaults>
-  <w:style w:type="table" w:styleId="TableNormal" w:default="1">
-    <w:name w:val="TableNormal"/>
-    <w:tblPr>
-      <w:tblCellMar>
-        <w:top w:w="100.0" w:type="dxa"/>
-        <w:left w:w="100.0" w:type="dxa"/>
-        <w:bottom w:w="100.0" w:type="dxa"/>
-        <w:right w:w="100.0" w:type="dxa"/>
-      </w:tblCellMar>
-    </w:tblPr>
-  </w:style>
-  <w:style w:type="paragraph" w:styleId="Normal" w:default="1">
-    <w:name w:val="normal"/>
+  <w:latentStyles w:defLockedState="0" w:defUIPriority="99" w:defSemiHidden="0" w:defUnhideWhenUsed="0" w:defQFormat="0" w:count="376">
+    <w:lsdException w:name="Normal" w:uiPriority="0" w:qFormat="1"/>
+    <w:lsdException w:name="heading 1" w:uiPriority="9" w:qFormat="1"/>
+    <w:lsdException w:name="heading 2" w:semiHidden="1" w:uiPriority="9" w:unhideWhenUsed="1" w:qFormat="1"/>
+    <w:lsdException w:name="heading 3" w:semiHidden="1" w:uiPriority="9" w:unhideWhenUsed="1" w:qFormat="1"/>
+    <w:lsdException w:name="heading 4" w:semiHidden="1" w:uiPriority="9" w:unhideWhenUsed="1" w:qFormat="1"/>
+    <w:lsdException w:name="heading 5" w:semiHidden="1" w:uiPriority="9" w:unhideWhenUsed="1" w:qFormat="1"/>
+    <w:lsdException w:name="heading 6" w:semiHidden="1" w:uiPriority="9" w:unhideWhenUsed="1" w:qFormat="1"/>
+    <w:lsdException w:name="heading 7" w:semiHidden="1" w:uiPriority="9" w:unhideWhenUsed="1" w:qFormat="1"/>
+    <w:lsdException w:name="heading 8" w:semiHidden="1" w:uiPriority="9" w:unhideWhenUsed="1" w:qFormat="1"/>
+    <w:lsdException w:name="heading 9" w:semiHidden="1" w:uiPriority="9" w:unhideWhenUsed="1" w:qFormat="1"/>
+    <w:lsdException w:name="index 1" w:semiHidden="1" w:unhideWhenUsed="1"/>
+    <w:lsdException w:name="index 2" w:semiHidden="1" w:unhideWhenUsed="1"/>
+    <w:lsdException w:name="index 3" w:semiHidden="1" w:unhideWhenUsed="1"/>
+    <w:lsdException w:name="index 4" w:semiHidden="1" w:unhideWhenUsed="1"/>
+    <w:lsdException w:name="index 5" w:semiHidden="1" w:unhideWhenUsed="1"/>
+    <w:lsdException w:name="index 6" w:semiHidden="1" w:unhideWhenUsed="1"/>
+    <w:lsdException w:name="index 7" w:semiHidden="1" w:unhideWhenUsed="1"/>
+    <w:lsdException w:name="index 8" w:semiHidden="1" w:unhideWhenUsed="1"/>
+    <w:lsdException w:name="index 9" w:semiHidden="1" w:unhideWhenUsed="1"/>
+    <w:lsdException w:name="toc 1" w:semiHidden="1" w:uiPriority="39" w:unhideWhenUsed="1"/>
+    <w:lsdException w:name="toc 2" w:semiHidden="1" w:uiPriority="39" w:unhideWhenUsed="1"/>
+    <w:lsdException w:name="toc 3" w:semiHidden="1" w:uiPriority="39" w:unhideWhenUsed="1"/>
+    <w:lsdException w:name="toc 4" w:semiHidden="1" w:uiPriority="39" w:unhideWhenUsed="1"/>
+    <w:lsdException w:name="toc 5" w:semiHidden="1" w:uiPriority="39" w:unhideWhenUsed="1"/>
+    <w:lsdException w:name="toc 6" w:semiHidden="1" w:uiPriority="39" w:unhideWhenUsed="1"/>
+    <w:lsdException w:name="toc 7" w:semiHidden="1" w:uiPriority="39" w:unhideWhenUsed="1"/>
+    <w:lsdException w:name="toc 8" w:semiHidden="1" w:uiPriority="39" w:unhideWhenUsed="1"/>
+    <w:lsdException w:name="toc 9" w:semiHidden="1" w:uiPriority="39" w:unhideWhenUsed="1"/>
+    <w:lsdException w:name="Normal Indent" w:semiHidden="1" w:unhideWhenUsed="1"/>
+    <w:lsdException w:name="footnote text" w:semiHidden="1" w:unhideWhenUsed="1"/>
+    <w:lsdException w:name="annotation text" w:semiHidden="1" w:unhideWhenUsed="1"/>
+    <w:lsdException w:name="header" w:semiHidden="1" w:unhideWhenUsed="1"/>
+    <w:lsdException w:name="footer" w:semiHidden="1" w:unhideWhenUsed="1"/>
+    <w:lsdException w:name="index heading" w:semiHidden="1" w:unhideWhenUsed="1"/>
+    <w:lsdException w:name="caption" w:semiHidden="1" w:uiPriority="35" w:unhideWhenUsed="1" w:qFormat="1"/>
+    <w:lsdException w:name="table of figures" w:semiHidden="1" w:unhideWhenUsed="1"/>
+    <w:lsdException w:name="envelope address" w:semiHidden="1" w:unhideWhenUsed="1"/>
+    <w:lsdException w:name="envelope return" w:semiHidden="1" w:unhideWhenUsed="1"/>
+    <w:lsdException w:name="footnote reference" w:semiHidden="1" w:unhideWhenUsed="1"/>
+    <w:lsdException w:name="annotation reference" w:semiHidden="1" w:unhideWhenUsed="1"/>
+    <w:lsdException w:name="line number" w:semiHidden="1" w:unhideWhenUsed="1"/>
+    <w:lsdException w:name="page number" w:semiHidden="1" w:unhideWhenUsed="1"/>
+    <w:lsdException w:name="endnote reference" w:semiHidden="1" w:unhideWhenUsed="1"/>
+    <w:lsdException w:name="endnote text" w:semiHidden="1" w:unhideWhenUsed="1"/>
+    <w:lsdException w:name="table of authorities" w:semiHidden="1" w:unhideWhenUsed="1"/>
+    <w:lsdException w:name="macro" w:semiHidden="1" w:unhideWhenUsed="1"/>
+    <w:lsdException w:name="toa heading" w:semiHidden="1" w:unhideWhenUsed="1"/>
+    <w:lsdException w:name="List" w:semiHidden="1" w:unhideWhenUsed="1"/>
+    <w:lsdException w:name="List Bullet" w:semiHidden="1" w:unhideWhenUsed="1"/>
+    <w:lsdException w:name="List Number" w:semiHidden="1" w:unhideWhenUsed="1"/>
+    <w:lsdException w:name="List 2" w:semiHidden="1" w:unhideWhenUsed="1"/>
+    <w:lsdException w:name="List 3" w:semiHidden="1" w:unhideWhenUsed="1"/>
+    <w:lsdException w:name="List 4" w:semiHidden="1" w:unhideWhenUsed="1"/>
+    <w:lsdException w:name="List 5" w:semiHidden="1" w:unhideWhenUsed="1"/>
+    <w:lsdException w:name="List Bullet 2" w:semiHidden="1" w:unhideWhenUsed="1"/>
+    <w:lsdException w:name="List Bullet 3" w:semiHidden="1" w:unhideWhenUsed="1"/>
+    <w:lsdException w:name="List Bullet 4" w:semiHidden="1" w:unhideWhenUsed="1"/>
+    <w:lsdException w:name="List Bullet 5" w:semiHidden="1" w:unhideWhenUsed="1"/>
+    <w:lsdException w:name="List Number 2" w:semiHidden="1" w:unhideWhenUsed="1"/>
+    <w:lsdException w:name="List Number 3" w:semiHidden="1" w:unhideWhenUsed="1"/>
+    <w:lsdException w:name="List Number 4" w:semiHidden="1" w:unhideWhenUsed="1"/>
+    <w:lsdException w:name="List Number 5" w:semiHidden="1" w:unhideWhenUsed="1"/>
+    <w:lsdException w:name="Title" w:uiPriority="10" w:qFormat="1"/>
+    <w:lsdException w:name="Closing" w:semiHidden="1" w:unhideWhenUsed="1"/>
+    <w:lsdException w:name="Signature" w:semiHidden="1" w:unhideWhenUsed="1"/>
+    <w:lsdException w:name="Default Paragraph Font" w:semiHidden="1" w:uiPriority="1" w:unhideWhenUsed="1"/>
+    <w:lsdException w:name="Body Text" w:semiHidden="1" w:unhideWhenUsed="1"/>
+    <w:lsdException w:name="Body Text Indent" w:semiHidden="1" w:unhideWhenUsed="1"/>
+    <w:lsdException w:name="List Continue" w:semiHidden="1" w:unhideWhenUsed="1"/>
+    <w:lsdException w:name="List Continue 2" w:semiHidden="1" w:unhideWhenUsed="1"/>
+    <w:lsdException w:name="List Continue 3" w:semiHidden="1" w:unhideWhenUsed="1"/>
+    <w:lsdException w:name="List Continue 4" w:semiHidden="1" w:unhideWhenUsed="1"/>
+    <w:lsdException w:name="List Continue 5" w:semiHidden="1" w:unhideWhenUsed="1"/>
+    <w:lsdException w:name="Message Header" w:semiHidden="1" w:unhideWhenUsed="1"/>
+    <w:lsdException w:name="Subtitle" w:uiPriority="11" w:qFormat="1"/>
+    <w:lsdException w:name="Salutation" w:semiHidden="1" w:unhideWhenUsed="1"/>
+    <w:lsdException w:name="Date" w:semiHidden="1" w:unhideWhenUsed="1"/>
+    <w:lsdException w:name="Body Text First Indent" w:semiHidden="1" w:unhideWhenUsed="1"/>
+    <w:lsdException w:name="Body Text First Indent 2" w:semiHidden="1" w:unhideWhenUsed="1"/>
+    <w:lsdException w:name="Note Heading" w:semiHidden="1" w:unhideWhenUsed="1"/>
+    <w:lsdException w:name="Body Text 2" w:semiHidden="1" w:unhideWhenUsed="1"/>
+    <w:lsdException w:name="Body Text 3" w:semiHidden="1" w:unhideWhenUsed="1"/>
+    <w:lsdException w:name="Body Text Indent 2" w:semiHidden="1" w:unhideWhenUsed="1"/>
+    <w:lsdException w:name="Body Text Indent 3" w:semiHidden="1" w:unhideWhenUsed="1"/>
+    <w:lsdException w:name="Block Text" w:semiHidden="1" w:unhideWhenUsed="1"/>
+    <w:lsdException w:name="Hyperlink" w:semiHidden="1" w:unhideWhenUsed="1"/>
+    <w:lsdException w:name="FollowedHyperlink" w:semiHidden="1" w:unhideWhenUsed="1"/>
+    <w:lsdException w:name="Strong" w:uiPriority="22" w:qFormat="1"/>
+    <w:lsdException w:name="Emphasis" w:uiPriority="20" w:qFormat="1"/>
+    <w:lsdException w:name="Document Map" w:semiHidden="1" w:unhideWhenUsed="1"/>
+    <w:lsdException w:name="Plain Text" w:semiHidden="1" w:unhideWhenUsed="1"/>
+    <w:lsdException w:name="E-mail Signature" w:semiHidden="1" w:unhideWhenUsed="1"/>
+    <w:lsdException w:name="HTML Top of Form" w:semiHidden="1" w:unhideWhenUsed="1"/>
+    <w:lsdException w:name="HTML Bottom of Form" w:semiHidden="1" w:unhideWhenUsed="1"/>
+    <w:lsdException w:name="Normal (Web)" w:semiHidden="1" w:unhideWhenUsed="1"/>
+    <w:lsdException w:name="HTML Acronym" w:semiHidden="1" w:unhideWhenUsed="1"/>
+    <w:lsdException w:name="HTML Address" w:semiHidden="1" w:unhideWhenUsed="1"/>
+    <w:lsdException w:name="HTML Cite" w:semiHidden="1" w:unhideWhenUsed="1"/>
+    <w:lsdException w:name="HTML Code" w:semiHidden="1" w:unhideWhenUsed="1"/>
+    <w:lsdException w:name="HTML Definition" w:semiHidden="1" w:unhideWhenUsed="1"/>
+    <w:lsdException w:name="HTML Keyboard" w:semiHidden="1" w:unhideWhenUsed="1"/>
+    <w:lsdException w:name="HTML Preformatted" w:semiHidden="1" w:unhideWhenUsed="1"/>
+    <w:lsdException w:name="HTML Sample" w:semiHidden="1" w:unhideWhenUsed="1"/>
+    <w:lsdException w:name="HTML Typewriter" w:semiHidden="1" w:unhideWhenUsed="1"/>
+    <w:lsdException w:name="HTML Variable" w:semiHidden="1" w:unhideWhenUsed="1"/>
+    <w:lsdException w:name="Normal Table" w:semiHidden="1" w:unhideWhenUsed="1"/>
+    <w:lsdException w:name="annotation subject" w:semiHidden="1" w:unhideWhenUsed="1"/>
+    <w:lsdException w:name="No List" w:semiHidden="1" w:unhideWhenUsed="1"/>
+    <w:lsdException w:name="Outline List 1" w:semiHidden="1" w:unhideWhenUsed="1"/>
+    <w:lsdException w:name="Outline List 2" w:semiHidden="1" w:unhideWhenUsed="1"/>
+    <w:lsdException w:name="Outline List 3" w:semiHidden="1" w:unhideWhenUsed="1"/>
+    <w:lsdException w:name="Table Simple 1" w:semiHidden="1" w:unhideWhenUsed="1"/>
+    <w:lsdException w:name="Table Simple 2" w:semiHidden="1" w:unhideWhenUsed="1"/>
+    <w:lsdException w:name="Table Simple 3" w:semiHidden="1" w:unhideWhenUsed="1"/>
+    <w:lsdException w:name="Table Classic 1" w:semiHidden="1" w:unhideWhenUsed="1"/>
+    <w:lsdException w:name="Table Classic 2" w:semiHidden="1" w:unhideWhenUsed="1"/>
+    <w:lsdException w:name="Table Classic 3" w:semiHidden="1" w:unhideWhenUsed="1"/>
+    <w:lsdException w:name="Table Classic 4" w:semiHidden="1" w:unhideWhenUsed="1"/>
+    <w:lsdException w:name="Table Colorful 1" w:semiHidden="1" w:unhideWhenUsed="1"/>
+    <w:lsdException w:name="Table Colorful 2" w:semiHidden="1" w:unhideWhenUsed="1"/>
+    <w:lsdException w:name="Table Colorful 3" w:semiHidden="1" w:unhideWhenUsed="1"/>
+    <w:lsdException w:name="Table Columns 1" w:semiHidden="1" w:unhideWhenUsed="1"/>
+    <w:lsdException w:name="Table Columns 2" w:semiHidden="1" w:unhideWhenUsed="1"/>
+    <w:lsdException w:name="Table Columns 3" w:semiHidden="1" w:unhideWhenUsed="1"/>
+    <w:lsdException w:name="Table Columns 4" w:semiHidden="1" w:unhideWhenUsed="1"/>
+    <w:lsdException w:name="Table Columns 5" w:semiHidden="1" w:unhideWhenUsed="1"/>
+    <w:lsdException w:name="Table Grid 1" w:semiHidden="1" w:unhideWhenUsed="1"/>
+    <w:lsdException w:name="Table Grid 2" w:semiHidden="1" w:unhideWhenUsed="1"/>
+    <w:lsdException w:name="Table Grid 3" w:semiHidden="1" w:unhideWhenUsed="1"/>
+    <w:lsdException w:name="Table Grid 4" w:semiHidden="1" w:unhideWhenUsed="1"/>
+    <w:lsdException w:name="Table Grid 5" w:semiHidden="1" w:unhideWhenUsed="1"/>
+    <w:lsdException w:name="Table Grid 6" w:semiHidden="1" w:unhideWhenUsed="1"/>
+    <w:lsdException w:name="Table Grid 7" w:semiHidden="1" w:unhideWhenUsed="1"/>
+    <w:lsdException w:name="Table Grid 8" w:semiHidden="1" w:unhideWhenUsed="1"/>
+    <w:lsdException w:name="Table List 1" w:semiHidden="1" w:unhideWhenUsed="1"/>
+    <w:lsdException w:name="Table List 2" w:semiHidden="1" w:unhideWhenUsed="1"/>
+    <w:lsdException w:name="Table List 3" w:semiHidden="1" w:unhideWhenUsed="1"/>
+    <w:lsdException w:name="Table List 4" w:semiHidden="1" w:unhideWhenUsed="1"/>
+    <w:lsdException w:name="Table List 5" w:semiHidden="1" w:unhideWhenUsed="1"/>
+    <w:lsdException w:name="Table List 6" w:semiHidden="1" w:unhideWhenUsed="1"/>
+    <w:lsdException w:name="Table List 7" w:semiHidden="1" w:unhideWhenUsed="1"/>
+    <w:lsdException w:name="Table List 8" w:semiHidden="1" w:unhideWhenUsed="1"/>
+    <w:lsdException w:name="Table 3D effects 1" w:semiHidden="1" w:unhideWhenUsed="1"/>
+    <w:lsdException w:name="Table 3D effects 2" w:semiHidden="1" w:unhideWhenUsed="1"/>
+    <w:lsdException w:name="Table 3D effects 3" w:semiHidden="1" w:unhideWhenUsed="1"/>
+    <w:lsdException w:name="Table Contemporary" w:semiHidden="1" w:unhideWhenUsed="1"/>
+    <w:lsdException w:name="Table Elegant" w:semiHidden="1" w:unhideWhenUsed="1"/>
+    <w:lsdException w:name="Table Professional" w:semiHidden="1" w:unhideWhenUsed="1"/>
+    <w:lsdException w:name="Table Subtle 1" w:semiHidden="1" w:unhideWhenUsed="1"/>
+    <w:lsdException w:name="Table Subtle 2" w:semiHidden="1" w:unhideWhenUsed="1"/>
+    <w:lsdException w:name="Table Web 1" w:semiHidden="1" w:unhideWhenUsed="1"/>
+    <w:lsdException w:name="Table Web 2" w:semiHidden="1" w:unhideWhenUsed="1"/>
+    <w:lsdException w:name="Table Web 3" w:semiHidden="1" w:unhideWhenUsed="1"/>
+    <w:lsdException w:name="Balloon Text" w:semiHidden="1" w:unhideWhenUsed="1"/>
+    <w:lsdException w:name="Table Grid" w:uiPriority="39"/>
+    <w:lsdException w:name="Table Theme" w:semiHidden="1" w:unhideWhenUsed="1"/>
+    <w:lsdException w:name="Placeholder Text" w:semiHidden="1"/>
+    <w:lsdException w:name="No Spacing" w:uiPriority="1" w:qFormat="1"/>
+    <w:lsdException w:name="Light Shading" w:uiPriority="60"/>
+    <w:lsdException w:name="Light List" w:uiPriority="61"/>
+    <w:lsdException w:name="Light Grid" w:uiPriority="62"/>
+    <w:lsdException w:name="Medium Shading 1" w:uiPriority="63"/>
+    <w:lsdException w:name="Medium Shading 2" w:uiPriority="64"/>
+    <w:lsdException w:name="Medium List 1" w:uiPriority="65"/>
+    <w:lsdException w:name="Medium List 2" w:uiPriority="66"/>
+    <w:lsdException w:name="Medium Grid 1" w:uiPriority="67"/>
+    <w:lsdException w:name="Medium Grid 2" w:uiPriority="68"/>
+    <w:lsdException w:name="Medium Grid 3" w:uiPriority="69"/>
+    <w:lsdException w:name="Dark List" w:uiPriority="70"/>
+    <w:lsdException w:name="Colorful Shading" w:uiPriority="71"/>
+    <w:lsdException w:name="Colorful List" w:uiPriority="72"/>
+    <w:lsdException w:name="Colorful Grid" w:uiPriority="73"/>
+    <w:lsdException w:name="Light Shading Accent 1" w:uiPriority="60"/>
+    <w:lsdException w:name="Light List Accent 1" w:uiPriority="61"/>
+    <w:lsdException w:name="Light Grid Accent 1" w:uiPriority="62"/>
+    <w:lsdException w:name="Medium Shading 1 Accent 1" w:uiPriority="63"/>
+    <w:lsdException w:name="Medium Shading 2 Accent 1" w:uiPriority="64"/>
+    <w:lsdException w:name="Medium List 1 Accent 1" w:uiPriority="65"/>
+    <w:lsdException w:name="Revision" w:semiHidden="1"/>
+    <w:lsdException w:name="List Paragraph" w:uiPriority="34" w:qFormat="1"/>
+    <w:lsdException w:name="Quote" w:uiPriority="29" w:qFormat="1"/>
+    <w:lsdException w:name="Intense Quote" w:uiPriority="30" w:qFormat="1"/>
+    <w:lsdException w:name="Medium List 2 Accent 1" w:uiPriority="66"/>
+    <w:lsdException w:name="Medium Grid 1 Accent 1" w:uiPriority="67"/>
+    <w:lsdException w:name="Medium Grid 2 Accent 1" w:uiPriority="68"/>
+    <w:lsdException w:name="Medium Grid 3 Accent 1" w:uiPriority="69"/>
+    <w:lsdException w:name="Dark List Accent 1" w:uiPriority="70"/>
+    <w:lsdException w:name="Colorful Shading Accent 1" w:uiPriority="71"/>
+    <w:lsdException w:name="Colorful List Accent 1" w:uiPriority="72"/>
+    <w:lsdException w:name="Colorful Grid Accent 1" w:uiPriority="73"/>
+    <w:lsdException w:name="Light Shading Accent 2" w:uiPriority="60"/>
+    <w:lsdException w:name="Light List Accent 2" w:uiPriority="61"/>
+    <w:lsdException w:name="Light Grid Accent 2" w:uiPriority="62"/>
+    <w:lsdException w:name="Medium Shading 1 Accent 2" w:uiPriority="63"/>
+    <w:lsdException w:name="Medium Shading 2 Accent 2" w:uiPriority="64"/>
+    <w:lsdException w:name="Medium List 1 Accent 2" w:uiPriority="65"/>
+    <w:lsdException w:name="Medium List 2 Accent 2" w:uiPriority="66"/>
+    <w:lsdException w:name="Medium Grid 1 Accent 2" w:uiPriority="67"/>
+    <w:lsdException w:name="Medium Grid 2 Accent 2" w:uiPriority="68"/>
+    <w:lsdException w:name="Medium Grid 3 Accent 2" w:uiPriority="69"/>
+    <w:lsdException w:name="Dark List Accent 2" w:uiPriority="70"/>
+    <w:lsdException w:name="Colorful Shading Accent 2" w:uiPriority="71"/>
+    <w:lsdException w:name="Colorful List Accent 2" w:uiPriority="72"/>
+    <w:lsdException w:name="Colorful Grid Accent 2" w:uiPriority="73"/>
+    <w:lsdException w:name="Light Shading Accent 3" w:uiPriority="60"/>
+    <w:lsdException w:name="Light List Accent 3" w:uiPriority="61"/>
+    <w:lsdException w:name="Light Grid Accent 3" w:uiPriority="62"/>
+    <w:lsdException w:name="Medium Shading 1 Accent 3" w:uiPriority="63"/>
+    <w:lsdException w:name="Medium Shading 2 Accent 3" w:uiPriority="64"/>
+    <w:lsdException w:name="Medium List 1 Accent 3" w:uiPriority="65"/>
+    <w:lsdException w:name="Medium List 2 Accent 3" w:uiPriority="66"/>
+    <w:lsdException w:name="Medium Grid 1 Accent 3" w:uiPriority="67"/>
+    <w:lsdException w:name="Medium Grid 2 Accent 3" w:uiPriority="68"/>
+    <w:lsdException w:name="Medium Grid 3 Accent 3" w:uiPriority="69"/>
+    <w:lsdException w:name="Dark List Accent 3" w:uiPriority="70"/>
+    <w:lsdException w:name="Colorful Shading Accent 3" w:uiPriority="71"/>
+    <w:lsdException w:name="Colorful List Accent 3" w:uiPriority="72"/>
+    <w:lsdException w:name="Colorful Grid Accent 3" w:uiPriority="73"/>
+    <w:lsdException w:name="Light Shading Accent 4" w:uiPriority="60"/>
+    <w:lsdException w:name="Light List Accent 4" w:uiPriority="61"/>
+    <w:lsdException w:name="Light Grid Accent 4" w:uiPriority="62"/>
+    <w:lsdException w:name="Medium Shading 1 Accent 4" w:uiPriority="63"/>
+    <w:lsdException w:name="Medium Shading 2 Accent 4" w:uiPriority="64"/>
+    <w:lsdException w:name="Medium List 1 Accent 4" w:uiPriority="65"/>
+    <w:lsdException w:name="Medium List 2 Accent 4" w:uiPriority="66"/>
+    <w:lsdException w:name="Medium Grid 1 Accent 4" w:uiPriority="67"/>
+    <w:lsdException w:name="Medium Grid 2 Accent 4" w:uiPriority="68"/>
+    <w:lsdException w:name="Medium Grid 3 Accent 4" w:uiPriority="69"/>
+    <w:lsdException w:name="Dark List Accent 4" w:uiPriority="70"/>
+    <w:lsdException w:name="Colorful Shading Accent 4" w:uiPriority="71"/>
+    <w:lsdException w:name="Colorful List Accent 4" w:uiPriority="72"/>
+    <w:lsdException w:name="Colorful Grid Accent 4" w:uiPriority="73"/>
+    <w:lsdException w:name="Light Shading Accent 5" w:uiPriority="60"/>
+    <w:lsdException w:name="Light List Accent 5" w:uiPriority="61"/>
+    <w:lsdException w:name="Light Grid Accent 5" w:uiPriority="62"/>
+    <w:lsdException w:name="Medium Shading 1 Accent 5" w:uiPriority="63"/>
+    <w:lsdException w:name="Medium Shading 2 Accent 5" w:uiPriority="64"/>
+    <w:lsdException w:name="Medium List 1 Accent 5" w:uiPriority="65"/>
+    <w:lsdException w:name="Medium List 2 Accent 5" w:uiPriority="66"/>
+    <w:lsdException w:name="Medium Grid 1 Accent 5" w:uiPriority="67"/>
+    <w:lsdException w:name="Medium Grid 2 Accent 5" w:uiPriority="68"/>
+    <w:lsdException w:name="Medium Grid 3 Accent 5" w:uiPriority="69"/>
+    <w:lsdException w:name="Dark List Accent 5" w:uiPriority="70"/>
+    <w:lsdException w:name="Colorful Shading Accent 5" w:uiPriority="71"/>
+    <w:lsdException w:name="Colorful List Accent 5" w:uiPriority="72"/>
+    <w:lsdException w:name="Colorful Grid Accent 5" w:uiPriority="73"/>
+    <w:lsdException w:name="Light Shading Accent 6" w:uiPriority="60"/>
+    <w:lsdException w:name="Light List Accent 6" w:uiPriority="61"/>
+    <w:lsdException w:name="Light Grid Accent 6" w:uiPriority="62"/>
+    <w:lsdException w:name="Medium Shading 1 Accent 6" w:uiPriority="63"/>
+    <w:lsdException w:name="Medium Shading 2 Accent 6" w:uiPriority="64"/>
+    <w:lsdException w:name="Medium List 1 Accent 6" w:uiPriority="65"/>
+    <w:lsdException w:name="Medium List 2 Accent 6" w:uiPriority="66"/>
+    <w:lsdException w:name="Medium Grid 1 Accent 6" w:uiPriority="67"/>
+    <w:lsdException w:name="Medium Grid 2 Accent 6" w:uiPriority="68"/>
+    <w:lsdException w:name="Medium Grid 3 Accent 6" w:uiPriority="69"/>
+    <w:lsdException w:name="Dark List Accent 6" w:uiPriority="70"/>
+    <w:lsdException w:name="Colorful Shading Accent 6" w:uiPriority="71"/>
+    <w:lsdException w:name="Colorful List Accent 6" w:uiPriority="72"/>
+    <w:lsdException w:name="Colorful Grid Accent 6" w:uiPriority="73"/>
+    <w:lsdException w:name="Subtle Emphasis" w:uiPriority="19" w:qFormat="1"/>
+    <w:lsdException w:name="Intense Emphasis" w:uiPriority="21" w:qFormat="1"/>
+    <w:lsdException w:name="Subtle Reference" w:uiPriority="31" w:qFormat="1"/>
+    <w:lsdException w:name="Intense Reference" w:uiPriority="32" w:qFormat="1"/>
+    <w:lsdException w:name="Book Title" w:uiPriority="33" w:qFormat="1"/>
+    <w:lsdException w:name="Bibliography" w:semiHidden="1" w:uiPriority="37" w:unhideWhenUsed="1"/>
+    <w:lsdException w:name="TOC Heading" w:semiHidden="1" w:uiPriority="39" w:unhideWhenUsed="1" w:qFormat="1"/>
+    <w:lsdException w:name="Plain Table 1" w:uiPriority="41"/>
+    <w:lsdException w:name="Plain Table 2" w:uiPriority="42"/>
+    <w:lsdException w:name="Plain Table 3" w:uiPriority="43"/>
+    <w:lsdException w:name="Plain Table 4" w:uiPriority="44"/>
+    <w:lsdException w:name="Plain Table 5" w:uiPriority="45"/>
+    <w:lsdException w:name="Grid Table Light" w:uiPriority="40"/>
+    <w:lsdException w:name="Grid Table 1 Light" w:uiPriority="46"/>
+    <w:lsdException w:name="Grid Table 2" w:uiPriority="47"/>
+    <w:lsdException w:name="Grid Table 3" w:uiPriority="48"/>
+    <w:lsdException w:name="Grid Table 4" w:uiPriority="49"/>
+    <w:lsdException w:name="Grid Table 5 Dark" w:uiPriority="50"/>
+    <w:lsdException w:name="Grid Table 6 Colorful" w:uiPriority="51"/>
+    <w:lsdException w:name="Grid Table 7 Colorful" w:uiPriority="52"/>
+    <w:lsdException w:name="Grid Table 1 Light Accent 1" w:uiPriority="46"/>
+    <w:lsdException w:name="Grid Table 2 Accent 1" w:uiPriority="47"/>
+    <w:lsdException w:name="Grid Table 3 Accent 1" w:uiPriority="48"/>
+    <w:lsdException w:name="Grid Table 4 Accent 1" w:uiPriority="49"/>
+    <w:lsdException w:name="Grid Table 5 Dark Accent 1" w:uiPriority="50"/>
+    <w:lsdException w:name="Grid Table 6 Colorful Accent 1" w:uiPriority="51"/>
+    <w:lsdException w:name="Grid Table 7 Colorful Accent 1" w:uiPriority="52"/>
+    <w:lsdException w:name="Grid Table 1 Light Accent 2" w:uiPriority="46"/>
+    <w:lsdException w:name="Grid Table 2 Accent 2" w:uiPriority="47"/>
+    <w:lsdException w:name="Grid Table 3 Accent 2" w:uiPriority="48"/>
+    <w:lsdException w:name="Grid Table 4 Accent 2" w:uiPriority="49"/>
+    <w:lsdException w:name="Grid Table 5 Dark Accent 2" w:uiPriority="50"/>
+    <w:lsdException w:name="Grid Table 6 Colorful Accent 2" w:uiPriority="51"/>
+    <w:lsdException w:name="Grid Table 7 Colorful Accent 2" w:uiPriority="52"/>
+    <w:lsdException w:name="Grid Table 1 Light Accent 3" w:uiPriority="46"/>
+    <w:lsdException w:name="Grid Table 2 Accent 3" w:uiPriority="47"/>
+    <w:lsdException w:name="Grid Table 3 Accent 3" w:uiPriority="48"/>
+    <w:lsdException w:name="Grid Table 4 Accent 3" w:uiPriority="49"/>
+    <w:lsdException w:name="Grid Table 5 Dark Accent 3" w:uiPriority="50"/>
+    <w:lsdException w:name="Grid Table 6 Colorful Accent 3" w:uiPriority="51"/>
+    <w:lsdException w:name="Grid Table 7 Colorful Accent 3" w:uiPriority="52"/>
+    <w:lsdException w:name="Grid Table 1 Light Accent 4" w:uiPriority="46"/>
+    <w:lsdException w:name="Grid Table 2 Accent 4" w:uiPriority="47"/>
+    <w:lsdException w:name="Grid Table 3 Accent 4" w:uiPriority="48"/>
+    <w:lsdException w:name="Grid Table 4 Accent 4" w:uiPriority="49"/>
+    <w:lsdException w:name="Grid Table 5 Dark Accent 4" w:uiPriority="50"/>
+    <w:lsdException w:name="Grid Table 6 Colorful Accent 4" w:uiPriority="51"/>
+    <w:lsdException w:name="Grid Table 7 Colorful Accent 4" w:uiPriority="52"/>
+    <w:lsdException w:name="Grid Table 1 Light Accent 5" w:uiPriority="46"/>
+    <w:lsdException w:name="Grid Table 2 Accent 5" w:uiPriority="47"/>
+    <w:lsdException w:name="Grid Table 3 Accent 5" w:uiPriority="48"/>
+    <w:lsdException w:name="Grid Table 4 Accent 5" w:uiPriority="49"/>
+    <w:lsdException w:name="Grid Table 5 Dark Accent 5" w:uiPriority="50"/>
+    <w:lsdException w:name="Grid Table 6 Colorful Accent 5" w:uiPriority="51"/>
+    <w:lsdException w:name="Grid Table 7 Colorful Accent 5" w:uiPriority="52"/>
+    <w:lsdException w:name="Grid Table 1 Light Accent 6" w:uiPriority="46"/>
+    <w:lsdException w:name="Grid Table 2 Accent 6" w:uiPriority="47"/>
+    <w:lsdException w:name="Grid Table 3 Accent 6" w:uiPriority="48"/>
+    <w:lsdException w:name="Grid Table 4 Accent 6" w:uiPriority="49"/>
+    <w:lsdException w:name="Grid Table 5 Dark Accent 6" w:uiPriority="50"/>
+    <w:lsdException w:name="Grid Table 6 Colorful Accent 6" w:uiPriority="51"/>
+    <w:lsdException w:name="Grid Table 7 Colorful Accent 6" w:uiPriority="52"/>
+    <w:lsdException w:name="List Table 1 Light" w:uiPriority="46"/>
+    <w:lsdException w:name="List Table 2" w:uiPriority="47"/>
+    <w:lsdException w:name="List Table 3" w:uiPriority="48"/>
+    <w:lsdException w:name="List Table 4" w:uiPriority="49"/>
+    <w:lsdException w:name="List Table 5 Dark" w:uiPriority="50"/>
+    <w:lsdException w:name="List Table 6 Colorful" w:uiPriority="51"/>
+    <w:lsdException w:name="List Table 7 Colorful" w:uiPriority="52"/>
+    <w:lsdException w:name="List Table 1 Light Accent 1" w:uiPriority="46"/>
+    <w:lsdException w:name="List Table 2 Accent 1" w:uiPriority="47"/>
+    <w:lsdException w:name="List Table 3 Accent 1" w:uiPriority="48"/>
+    <w:lsdException w:name="List Table 4 Accent 1" w:uiPriority="49"/>
+    <w:lsdException w:name="List Table 5 Dark Accent 1" w:uiPriority="50"/>
+    <w:lsdException w:name="List Table 6 Colorful Accent 1" w:uiPriority="51"/>
+    <w:lsdException w:name="List Table 7 Colorful Accent 1" w:uiPriority="52"/>
+    <w:lsdException w:name="List Table 1 Light Accent 2" w:uiPriority="46"/>
+    <w:lsdException w:name="List Table 2 Accent 2" w:uiPriority="47"/>
+    <w:lsdException w:name="List Table 3 Accent 2" w:uiPriority="48"/>
+    <w:lsdException w:name="List Table 4 Accent 2" w:uiPriority="49"/>
+    <w:lsdException w:name="List Table 5 Dark Accent 2" w:uiPriority="50"/>
+    <w:lsdException w:name="List Table 6 Colorful Accent 2" w:uiPriority="51"/>
+    <w:lsdException w:name="List Table 7 Colorful Accent 2" w:uiPriority="52"/>
+    <w:lsdException w:name="List Table 1 Light Accent 3" w:uiPriority="46"/>
+    <w:lsdException w:name="List Table 2 Accent 3" w:uiPriority="47"/>
+    <w:lsdException w:name="List Table 3 Accent 3" w:uiPriority="48"/>
+    <w:lsdException w:name="List Table 4 Accent 3" w:uiPriority="49"/>
+    <w:lsdException w:name="List Table 5 Dark Accent 3" w:uiPriority="50"/>
+    <w:lsdException w:name="List Table 6 Colorful Accent 3" w:uiPriority="51"/>
+    <w:lsdException w:name="List Table 7 Colorful Accent 3" w:uiPriority="52"/>
+    <w:lsdException w:name="List Table 1 Light Accent 4" w:uiPriority="46"/>
+    <w:lsdException w:name="List Table 2 Accent 4" w:uiPriority="47"/>
+    <w:lsdException w:name="List Table 3 Accent 4" w:uiPriority="48"/>
+    <w:lsdException w:name="List Table 4 Accent 4" w:uiPriority="49"/>
+    <w:lsdException w:name="List Table 5 Dark Accent 4" w:uiPriority="50"/>
+    <w:lsdException w:name="List Table 6 Colorful Accent 4" w:uiPriority="51"/>
+    <w:lsdException w:name="List Table 7 Colorful Accent 4" w:uiPriority="52"/>
+    <w:lsdException w:name="List Table 1 Light Accent 5" w:uiPriority="46"/>
+    <w:lsdException w:name="List Table 2 Accent 5" w:uiPriority="47"/>
+    <w:lsdException w:name="List Table 3 Accent 5" w:uiPriority="48"/>
+    <w:lsdException w:name="List Table 4 Accent 5" w:uiPriority="49"/>
+    <w:lsdException w:name="List Table 5 Dark Accent 5" w:uiPriority="50"/>
+    <w:lsdException w:name="List Table 6 Colorful Accent 5" w:uiPriority="51"/>
+    <w:lsdException w:name="List Table 7 Colorful Accent 5" w:uiPriority="52"/>
+    <w:lsdException w:name="List Table 1 Light Accent 6" w:uiPriority="46"/>
+    <w:lsdException w:name="List Table 2 Accent 6" w:uiPriority="47"/>
+    <w:lsdException w:name="List Table 3 Accent 6" w:uiPriority="48"/>
+    <w:lsdException w:name="List Table 4 Accent 6" w:uiPriority="49"/>
+    <w:lsdException w:name="List Table 5 Dark Accent 6" w:uiPriority="50"/>
+    <w:lsdException w:name="List Table 6 Colorful Accent 6" w:uiPriority="51"/>
+    <w:lsdException w:name="List Table 7 Colorful Accent 6" w:uiPriority="52"/>
+    <w:lsdException w:name="Mention" w:semiHidden="1" w:unhideWhenUsed="1"/>
+    <w:lsdException w:name="Smart Hyperlink" w:semiHidden="1" w:unhideWhenUsed="1"/>
+    <w:lsdException w:name="Hashtag" w:semiHidden="1" w:unhideWhenUsed="1"/>
+    <w:lsdException w:name="Unresolved Mention" w:semiHidden="1" w:unhideWhenUsed="1"/>
+    <w:lsdException w:name="Smart Link" w:semiHidden="1" w:unhideWhenUsed="1"/>
+  </w:latentStyles>
+  <w:style w:type="paragraph" w:default="1" w:styleId="Normal">
+    <w:name w:val="Normal"/>
+    <w:qFormat/>
   </w:style>
   <w:style w:type="paragraph" w:styleId="Heading1">
     <w:name w:val="heading 1"/>
     <w:basedOn w:val="Normal"/>
     <w:next w:val="Normal"/>
+    <w:link w:val="Heading1Char"/>
+    <w:uiPriority w:val="9"/>
+    <w:qFormat/>
     <w:pPr>
-      <w:keepNext w:val="1"/>
-      <w:keepLines w:val="1"/>
-      <w:spacing w:after="80" w:before="360" w:lineRule="auto"/>
+      <w:keepNext/>
+      <w:keepLines/>
+      <w:spacing w:before="360" w:after="80"/>
+      <w:outlineLvl w:val="0"/>
     </w:pPr>
     <w:rPr>
-      <w:rFonts w:ascii="Play" w:cs="Play" w:eastAsia="Play" w:hAnsi="Play"/>
-      <w:color w:val="0f4761"/>
+      <w:rFonts w:ascii="Play" w:eastAsia="Play" w:hAnsi="Play" w:cs="Play"/>
+      <w:color w:val="0F4761"/>
       <w:sz w:val="40"/>
       <w:szCs w:val="40"/>
     </w:rPr>
@@ -2675,14 +2730,19 @@
     <w:name w:val="heading 2"/>
     <w:basedOn w:val="Normal"/>
     <w:next w:val="Normal"/>
+    <w:link w:val="Heading2Char"/>
+    <w:uiPriority w:val="9"/>
+    <w:unhideWhenUsed/>
+    <w:qFormat/>
     <w:pPr>
-      <w:keepNext w:val="1"/>
-      <w:keepLines w:val="1"/>
-      <w:spacing w:after="80" w:before="160" w:lineRule="auto"/>
+      <w:keepNext/>
+      <w:keepLines/>
+      <w:spacing w:before="160" w:after="80"/>
+      <w:outlineLvl w:val="1"/>
     </w:pPr>
     <w:rPr>
-      <w:rFonts w:ascii="Play" w:cs="Play" w:eastAsia="Play" w:hAnsi="Play"/>
-      <w:color w:val="0f4761"/>
+      <w:rFonts w:ascii="Play" w:eastAsia="Play" w:hAnsi="Play" w:cs="Play"/>
+      <w:color w:val="0F4761"/>
       <w:sz w:val="32"/>
       <w:szCs w:val="32"/>
     </w:rPr>
@@ -2691,14 +2751,19 @@
     <w:name w:val="heading 3"/>
     <w:basedOn w:val="Normal"/>
     <w:next w:val="Normal"/>
+    <w:link w:val="Heading3Char"/>
+    <w:uiPriority w:val="9"/>
+    <w:unhideWhenUsed/>
+    <w:qFormat/>
     <w:pPr>
-      <w:keepNext w:val="1"/>
-      <w:keepLines w:val="1"/>
-      <w:spacing w:after="80" w:before="160" w:lineRule="auto"/>
+      <w:keepNext/>
+      <w:keepLines/>
+      <w:spacing w:before="160" w:after="80"/>
+      <w:outlineLvl w:val="2"/>
     </w:pPr>
     <w:rPr>
-      <w:rFonts w:ascii="Aptos" w:cs="Aptos" w:eastAsia="Aptos" w:hAnsi="Aptos"/>
-      <w:color w:val="0f4761"/>
+      <w:rFonts w:ascii="Aptos" w:eastAsia="Aptos" w:hAnsi="Aptos" w:cs="Aptos"/>
+      <w:color w:val="0F4761"/>
       <w:sz w:val="28"/>
       <w:szCs w:val="28"/>
     </w:rPr>
@@ -2707,59 +2772,64 @@
     <w:name w:val="heading 4"/>
     <w:basedOn w:val="Normal"/>
     <w:next w:val="Normal"/>
+    <w:link w:val="Heading4Char"/>
+    <w:uiPriority w:val="9"/>
+    <w:semiHidden/>
+    <w:unhideWhenUsed/>
+    <w:qFormat/>
     <w:pPr>
-      <w:keepNext w:val="1"/>
-      <w:keepLines w:val="1"/>
-      <w:spacing w:after="40" w:before="80" w:lineRule="auto"/>
+      <w:keepNext/>
+      <w:keepLines/>
+      <w:spacing w:before="80" w:after="40"/>
+      <w:outlineLvl w:val="3"/>
     </w:pPr>
     <w:rPr>
-      <w:rFonts w:ascii="Aptos" w:cs="Aptos" w:eastAsia="Aptos" w:hAnsi="Aptos"/>
-      <w:i w:val="1"/>
-      <w:iCs w:val="1"/>
-      <w:color w:val="0f4761"/>
+      <w:rFonts w:ascii="Aptos" w:eastAsia="Aptos" w:hAnsi="Aptos" w:cs="Aptos"/>
+      <w:i/>
+      <w:iCs/>
+      <w:color w:val="0F4761"/>
     </w:rPr>
   </w:style>
   <w:style w:type="paragraph" w:styleId="Heading5">
     <w:name w:val="heading 5"/>
     <w:basedOn w:val="Normal"/>
     <w:next w:val="Normal"/>
+    <w:link w:val="Heading5Char"/>
+    <w:uiPriority w:val="9"/>
+    <w:semiHidden/>
+    <w:unhideWhenUsed/>
+    <w:qFormat/>
     <w:pPr>
-      <w:keepNext w:val="1"/>
-      <w:keepLines w:val="1"/>
-      <w:spacing w:after="40" w:before="80" w:lineRule="auto"/>
+      <w:keepNext/>
+      <w:keepLines/>
+      <w:spacing w:before="80" w:after="40"/>
+      <w:outlineLvl w:val="4"/>
     </w:pPr>
     <w:rPr>
-      <w:rFonts w:ascii="Aptos" w:cs="Aptos" w:eastAsia="Aptos" w:hAnsi="Aptos"/>
-      <w:color w:val="0f4761"/>
+      <w:rFonts w:ascii="Aptos" w:eastAsia="Aptos" w:hAnsi="Aptos" w:cs="Aptos"/>
+      <w:color w:val="0F4761"/>
     </w:rPr>
   </w:style>
   <w:style w:type="paragraph" w:styleId="Heading6">
     <w:name w:val="heading 6"/>
     <w:basedOn w:val="Normal"/>
     <w:next w:val="Normal"/>
+    <w:link w:val="Heading6Char"/>
+    <w:uiPriority w:val="9"/>
+    <w:semiHidden/>
+    <w:unhideWhenUsed/>
+    <w:qFormat/>
     <w:pPr>
-      <w:keepNext w:val="1"/>
-      <w:keepLines w:val="1"/>
-      <w:spacing w:after="0" w:before="40" w:lineRule="auto"/>
+      <w:keepNext/>
+      <w:keepLines/>
+      <w:spacing w:before="40" w:after="0"/>
+      <w:outlineLvl w:val="5"/>
     </w:pPr>
     <w:rPr>
-      <w:rFonts w:ascii="Aptos" w:cs="Aptos" w:eastAsia="Aptos" w:hAnsi="Aptos"/>
-      <w:i w:val="1"/>
-      <w:iCs w:val="1"/>
+      <w:rFonts w:ascii="Aptos" w:eastAsia="Aptos" w:hAnsi="Aptos" w:cs="Aptos"/>
+      <w:i/>
+      <w:iCs/>
       <w:color w:val="595959"/>
-    </w:rPr>
-  </w:style>
-  <w:style w:type="paragraph" w:styleId="Title">
-    <w:name w:val="Title"/>
-    <w:basedOn w:val="Normal"/>
-    <w:next w:val="Normal"/>
-    <w:pPr>
-      <w:spacing w:after="80" w:line="240" w:lineRule="auto"/>
-    </w:pPr>
-    <w:rPr>
-      <w:rFonts w:ascii="Play" w:cs="Play" w:eastAsia="Play" w:hAnsi="Play"/>
-      <w:sz w:val="56"/>
-      <w:szCs w:val="56"/>
     </w:rPr>
   </w:style>
   <w:style w:type="paragraph" w:styleId="Heading7">
@@ -2768,19 +2838,19 @@
     <w:next w:val="Normal"/>
     <w:link w:val="Heading7Char"/>
     <w:uiPriority w:val="9"/>
-    <w:semiHidden w:val="1"/>
-    <w:unhideWhenUsed w:val="1"/>
-    <w:qFormat w:val="1"/>
+    <w:semiHidden/>
+    <w:unhideWhenUsed/>
+    <w:qFormat/>
     <w:rsid w:val="002E4F4C"/>
     <w:pPr>
-      <w:keepNext w:val="1"/>
-      <w:keepLines w:val="1"/>
-      <w:spacing w:after="0" w:before="40"/>
+      <w:keepNext/>
+      <w:keepLines/>
+      <w:spacing w:before="40" w:after="0"/>
       <w:outlineLvl w:val="6"/>
     </w:pPr>
     <w:rPr>
-      <w:rFonts w:asciiTheme="minorHAnsi" w:cstheme="majorBidi" w:eastAsiaTheme="majorEastAsia" w:hAnsiTheme="minorHAnsi"/>
-      <w:color w:val="595959" w:themeColor="text1" w:themeTint="0000A6"/>
+      <w:rFonts w:asciiTheme="minorHAnsi" w:eastAsiaTheme="majorEastAsia" w:hAnsiTheme="minorHAnsi" w:cstheme="majorBidi"/>
+      <w:color w:val="595959" w:themeColor="text1" w:themeTint="A6"/>
     </w:rPr>
   </w:style>
   <w:style w:type="paragraph" w:styleId="Heading8">
@@ -2789,21 +2859,21 @@
     <w:next w:val="Normal"/>
     <w:link w:val="Heading8Char"/>
     <w:uiPriority w:val="9"/>
-    <w:semiHidden w:val="1"/>
-    <w:unhideWhenUsed w:val="1"/>
-    <w:qFormat w:val="1"/>
+    <w:semiHidden/>
+    <w:unhideWhenUsed/>
+    <w:qFormat/>
     <w:rsid w:val="002E4F4C"/>
     <w:pPr>
-      <w:keepNext w:val="1"/>
-      <w:keepLines w:val="1"/>
+      <w:keepNext/>
+      <w:keepLines/>
       <w:spacing w:after="0"/>
       <w:outlineLvl w:val="7"/>
     </w:pPr>
     <w:rPr>
-      <w:rFonts w:asciiTheme="minorHAnsi" w:cstheme="majorBidi" w:eastAsiaTheme="majorEastAsia" w:hAnsiTheme="minorHAnsi"/>
-      <w:i w:val="1"/>
-      <w:iCs w:val="1"/>
-      <w:color w:val="272727" w:themeColor="text1" w:themeTint="0000D8"/>
+      <w:rFonts w:asciiTheme="minorHAnsi" w:eastAsiaTheme="majorEastAsia" w:hAnsiTheme="minorHAnsi" w:cstheme="majorBidi"/>
+      <w:i/>
+      <w:iCs/>
+      <w:color w:val="272727" w:themeColor="text1" w:themeTint="D8"/>
     </w:rPr>
   </w:style>
   <w:style w:type="paragraph" w:styleId="Heading9">
@@ -2812,190 +2882,217 @@
     <w:next w:val="Normal"/>
     <w:link w:val="Heading9Char"/>
     <w:uiPriority w:val="9"/>
-    <w:semiHidden w:val="1"/>
-    <w:unhideWhenUsed w:val="1"/>
-    <w:qFormat w:val="1"/>
+    <w:semiHidden/>
+    <w:unhideWhenUsed/>
+    <w:qFormat/>
     <w:rsid w:val="002E4F4C"/>
     <w:pPr>
-      <w:keepNext w:val="1"/>
-      <w:keepLines w:val="1"/>
+      <w:keepNext/>
+      <w:keepLines/>
       <w:spacing w:after="0"/>
       <w:outlineLvl w:val="8"/>
     </w:pPr>
     <w:rPr>
-      <w:rFonts w:asciiTheme="minorHAnsi" w:cstheme="majorBidi" w:eastAsiaTheme="majorEastAsia" w:hAnsiTheme="minorHAnsi"/>
-      <w:color w:val="272727" w:themeColor="text1" w:themeTint="0000D8"/>
+      <w:rFonts w:asciiTheme="minorHAnsi" w:eastAsiaTheme="majorEastAsia" w:hAnsiTheme="minorHAnsi" w:cstheme="majorBidi"/>
+      <w:color w:val="272727" w:themeColor="text1" w:themeTint="D8"/>
     </w:rPr>
   </w:style>
-  <w:style w:type="character" w:styleId="DefaultParagraphFont" w:default="1">
+  <w:style w:type="character" w:default="1" w:styleId="DefaultParagraphFont">
     <w:name w:val="Default Paragraph Font"/>
     <w:uiPriority w:val="1"/>
-    <w:semiHidden w:val="1"/>
-    <w:unhideWhenUsed w:val="1"/>
-  </w:style>
-  <w:style w:type="table" w:styleId="TableNormal" w:default="1">
+    <w:semiHidden/>
+    <w:unhideWhenUsed/>
+  </w:style>
+  <w:style w:type="table" w:default="1" w:styleId="TableNormal">
     <w:name w:val="Normal Table"/>
     <w:uiPriority w:val="99"/>
-    <w:semiHidden w:val="1"/>
-    <w:unhideWhenUsed w:val="1"/>
+    <w:semiHidden/>
+    <w:unhideWhenUsed/>
     <w:tblPr>
-      <w:tblInd w:w="0.0" w:type="dxa"/>
+      <w:tblInd w:w="0" w:type="dxa"/>
       <w:tblCellMar>
-        <w:top w:w="0.0" w:type="dxa"/>
-        <w:left w:w="108.0" w:type="dxa"/>
-        <w:bottom w:w="0.0" w:type="dxa"/>
-        <w:right w:w="108.0" w:type="dxa"/>
+        <w:top w:w="0" w:type="dxa"/>
+        <w:left w:w="108" w:type="dxa"/>
+        <w:bottom w:w="0" w:type="dxa"/>
+        <w:right w:w="108" w:type="dxa"/>
       </w:tblCellMar>
     </w:tblPr>
   </w:style>
-  <w:style w:type="numbering" w:styleId="NoList" w:default="1">
+  <w:style w:type="numbering" w:default="1" w:styleId="NoList">
     <w:name w:val="No List"/>
     <w:uiPriority w:val="99"/>
-    <w:semiHidden w:val="1"/>
-    <w:unhideWhenUsed w:val="1"/>
-  </w:style>
-  <w:style w:type="character" w:styleId="Heading1Char" w:customStyle="1">
+    <w:semiHidden/>
+    <w:unhideWhenUsed/>
+  </w:style>
+  <w:style w:type="table" w:customStyle="1" w:styleId="TableNormal0">
+    <w:name w:val="TableNormal"/>
+    <w:tblPr>
+      <w:tblCellMar>
+        <w:top w:w="100" w:type="dxa"/>
+        <w:left w:w="100" w:type="dxa"/>
+        <w:bottom w:w="100" w:type="dxa"/>
+        <w:right w:w="100" w:type="dxa"/>
+      </w:tblCellMar>
+    </w:tblPr>
+  </w:style>
+  <w:style w:type="paragraph" w:styleId="Title">
+    <w:name w:val="Title"/>
+    <w:basedOn w:val="Normal"/>
+    <w:next w:val="Normal"/>
+    <w:link w:val="TitleChar"/>
+    <w:uiPriority w:val="10"/>
+    <w:qFormat/>
+    <w:pPr>
+      <w:spacing w:after="80" w:line="240" w:lineRule="auto"/>
+    </w:pPr>
+    <w:rPr>
+      <w:rFonts w:ascii="Play" w:eastAsia="Play" w:hAnsi="Play" w:cs="Play"/>
+      <w:sz w:val="56"/>
+      <w:szCs w:val="56"/>
+    </w:rPr>
+  </w:style>
+  <w:style w:type="character" w:customStyle="1" w:styleId="Heading1Char">
     <w:name w:val="Heading 1 Char"/>
     <w:basedOn w:val="DefaultParagraphFont"/>
     <w:link w:val="Heading1"/>
     <w:uiPriority w:val="9"/>
     <w:rsid w:val="002E4F4C"/>
     <w:rPr>
-      <w:rFonts w:asciiTheme="majorHAnsi" w:cstheme="majorBidi" w:eastAsiaTheme="majorEastAsia" w:hAnsiTheme="majorHAnsi"/>
-      <w:color w:val="0f4761" w:themeColor="accent1" w:themeShade="0000BF"/>
+      <w:rFonts w:asciiTheme="majorHAnsi" w:eastAsiaTheme="majorEastAsia" w:hAnsiTheme="majorHAnsi" w:cstheme="majorBidi"/>
+      <w:color w:val="0F4761" w:themeColor="accent1" w:themeShade="BF"/>
       <w:sz w:val="40"/>
       <w:szCs w:val="40"/>
     </w:rPr>
   </w:style>
-  <w:style w:type="character" w:styleId="Heading2Char" w:customStyle="1">
+  <w:style w:type="character" w:customStyle="1" w:styleId="Heading2Char">
     <w:name w:val="Heading 2 Char"/>
     <w:basedOn w:val="DefaultParagraphFont"/>
     <w:link w:val="Heading2"/>
     <w:uiPriority w:val="9"/>
-    <w:semiHidden w:val="1"/>
+    <w:semiHidden/>
     <w:rsid w:val="002E4F4C"/>
     <w:rPr>
-      <w:rFonts w:asciiTheme="majorHAnsi" w:cstheme="majorBidi" w:eastAsiaTheme="majorEastAsia" w:hAnsiTheme="majorHAnsi"/>
-      <w:color w:val="0f4761" w:themeColor="accent1" w:themeShade="0000BF"/>
+      <w:rFonts w:asciiTheme="majorHAnsi" w:eastAsiaTheme="majorEastAsia" w:hAnsiTheme="majorHAnsi" w:cstheme="majorBidi"/>
+      <w:color w:val="0F4761" w:themeColor="accent1" w:themeShade="BF"/>
       <w:sz w:val="32"/>
       <w:szCs w:val="32"/>
     </w:rPr>
   </w:style>
-  <w:style w:type="character" w:styleId="Heading3Char" w:customStyle="1">
+  <w:style w:type="character" w:customStyle="1" w:styleId="Heading3Char">
     <w:name w:val="Heading 3 Char"/>
     <w:basedOn w:val="DefaultParagraphFont"/>
     <w:link w:val="Heading3"/>
     <w:uiPriority w:val="9"/>
-    <w:semiHidden w:val="1"/>
+    <w:semiHidden/>
     <w:rsid w:val="002E4F4C"/>
     <w:rPr>
-      <w:rFonts w:asciiTheme="minorHAnsi" w:cstheme="majorBidi" w:eastAsiaTheme="majorEastAsia" w:hAnsiTheme="minorHAnsi"/>
-      <w:color w:val="0f4761" w:themeColor="accent1" w:themeShade="0000BF"/>
+      <w:rFonts w:asciiTheme="minorHAnsi" w:eastAsiaTheme="majorEastAsia" w:hAnsiTheme="minorHAnsi" w:cstheme="majorBidi"/>
+      <w:color w:val="0F4761" w:themeColor="accent1" w:themeShade="BF"/>
       <w:sz w:val="28"/>
       <w:szCs w:val="28"/>
     </w:rPr>
   </w:style>
-  <w:style w:type="character" w:styleId="Heading4Char" w:customStyle="1">
+  <w:style w:type="character" w:customStyle="1" w:styleId="Heading4Char">
     <w:name w:val="Heading 4 Char"/>
     <w:basedOn w:val="DefaultParagraphFont"/>
     <w:link w:val="Heading4"/>
     <w:uiPriority w:val="9"/>
-    <w:semiHidden w:val="1"/>
+    <w:semiHidden/>
     <w:rsid w:val="002E4F4C"/>
     <w:rPr>
-      <w:rFonts w:asciiTheme="minorHAnsi" w:cstheme="majorBidi" w:eastAsiaTheme="majorEastAsia" w:hAnsiTheme="minorHAnsi"/>
-      <w:i w:val="1"/>
-      <w:iCs w:val="1"/>
-      <w:color w:val="0f4761" w:themeColor="accent1" w:themeShade="0000BF"/>
+      <w:rFonts w:asciiTheme="minorHAnsi" w:eastAsiaTheme="majorEastAsia" w:hAnsiTheme="minorHAnsi" w:cstheme="majorBidi"/>
+      <w:i/>
+      <w:iCs/>
+      <w:color w:val="0F4761" w:themeColor="accent1" w:themeShade="BF"/>
     </w:rPr>
   </w:style>
-  <w:style w:type="character" w:styleId="Heading5Char" w:customStyle="1">
+  <w:style w:type="character" w:customStyle="1" w:styleId="Heading5Char">
     <w:name w:val="Heading 5 Char"/>
     <w:basedOn w:val="DefaultParagraphFont"/>
     <w:link w:val="Heading5"/>
     <w:uiPriority w:val="9"/>
-    <w:semiHidden w:val="1"/>
+    <w:semiHidden/>
     <w:rsid w:val="002E4F4C"/>
     <w:rPr>
-      <w:rFonts w:asciiTheme="minorHAnsi" w:cstheme="majorBidi" w:eastAsiaTheme="majorEastAsia" w:hAnsiTheme="minorHAnsi"/>
-      <w:color w:val="0f4761" w:themeColor="accent1" w:themeShade="0000BF"/>
+      <w:rFonts w:asciiTheme="minorHAnsi" w:eastAsiaTheme="majorEastAsia" w:hAnsiTheme="minorHAnsi" w:cstheme="majorBidi"/>
+      <w:color w:val="0F4761" w:themeColor="accent1" w:themeShade="BF"/>
     </w:rPr>
   </w:style>
-  <w:style w:type="character" w:styleId="Heading6Char" w:customStyle="1">
+  <w:style w:type="character" w:customStyle="1" w:styleId="Heading6Char">
     <w:name w:val="Heading 6 Char"/>
     <w:basedOn w:val="DefaultParagraphFont"/>
     <w:link w:val="Heading6"/>
     <w:uiPriority w:val="9"/>
-    <w:semiHidden w:val="1"/>
+    <w:semiHidden/>
     <w:rsid w:val="002E4F4C"/>
     <w:rPr>
-      <w:rFonts w:asciiTheme="minorHAnsi" w:cstheme="majorBidi" w:eastAsiaTheme="majorEastAsia" w:hAnsiTheme="minorHAnsi"/>
-      <w:i w:val="1"/>
-      <w:iCs w:val="1"/>
-      <w:color w:val="595959" w:themeColor="text1" w:themeTint="0000A6"/>
+      <w:rFonts w:asciiTheme="minorHAnsi" w:eastAsiaTheme="majorEastAsia" w:hAnsiTheme="minorHAnsi" w:cstheme="majorBidi"/>
+      <w:i/>
+      <w:iCs/>
+      <w:color w:val="595959" w:themeColor="text1" w:themeTint="A6"/>
     </w:rPr>
   </w:style>
-  <w:style w:type="character" w:styleId="Heading7Char" w:customStyle="1">
+  <w:style w:type="character" w:customStyle="1" w:styleId="Heading7Char">
     <w:name w:val="Heading 7 Char"/>
     <w:basedOn w:val="DefaultParagraphFont"/>
     <w:link w:val="Heading7"/>
     <w:uiPriority w:val="9"/>
-    <w:semiHidden w:val="1"/>
+    <w:semiHidden/>
     <w:rsid w:val="002E4F4C"/>
     <w:rPr>
-      <w:rFonts w:asciiTheme="minorHAnsi" w:cstheme="majorBidi" w:eastAsiaTheme="majorEastAsia" w:hAnsiTheme="minorHAnsi"/>
-      <w:color w:val="595959" w:themeColor="text1" w:themeTint="0000A6"/>
+      <w:rFonts w:asciiTheme="minorHAnsi" w:eastAsiaTheme="majorEastAsia" w:hAnsiTheme="minorHAnsi" w:cstheme="majorBidi"/>
+      <w:color w:val="595959" w:themeColor="text1" w:themeTint="A6"/>
     </w:rPr>
   </w:style>
-  <w:style w:type="character" w:styleId="Heading8Char" w:customStyle="1">
+  <w:style w:type="character" w:customStyle="1" w:styleId="Heading8Char">
     <w:name w:val="Heading 8 Char"/>
     <w:basedOn w:val="DefaultParagraphFont"/>
     <w:link w:val="Heading8"/>
     <w:uiPriority w:val="9"/>
-    <w:semiHidden w:val="1"/>
+    <w:semiHidden/>
     <w:rsid w:val="002E4F4C"/>
     <w:rPr>
-      <w:rFonts w:asciiTheme="minorHAnsi" w:cstheme="majorBidi" w:eastAsiaTheme="majorEastAsia" w:hAnsiTheme="minorHAnsi"/>
-      <w:i w:val="1"/>
-      <w:iCs w:val="1"/>
-      <w:color w:val="272727" w:themeColor="text1" w:themeTint="0000D8"/>
+      <w:rFonts w:asciiTheme="minorHAnsi" w:eastAsiaTheme="majorEastAsia" w:hAnsiTheme="minorHAnsi" w:cstheme="majorBidi"/>
+      <w:i/>
+      <w:iCs/>
+      <w:color w:val="272727" w:themeColor="text1" w:themeTint="D8"/>
     </w:rPr>
   </w:style>
-  <w:style w:type="character" w:styleId="Heading9Char" w:customStyle="1">
+  <w:style w:type="character" w:customStyle="1" w:styleId="Heading9Char">
     <w:name w:val="Heading 9 Char"/>
     <w:basedOn w:val="DefaultParagraphFont"/>
     <w:link w:val="Heading9"/>
     <w:uiPriority w:val="9"/>
-    <w:semiHidden w:val="1"/>
+    <w:semiHidden/>
     <w:rsid w:val="002E4F4C"/>
     <w:rPr>
-      <w:rFonts w:asciiTheme="minorHAnsi" w:cstheme="majorBidi" w:eastAsiaTheme="majorEastAsia" w:hAnsiTheme="minorHAnsi"/>
-      <w:color w:val="272727" w:themeColor="text1" w:themeTint="0000D8"/>
+      <w:rFonts w:asciiTheme="minorHAnsi" w:eastAsiaTheme="majorEastAsia" w:hAnsiTheme="minorHAnsi" w:cstheme="majorBidi"/>
+      <w:color w:val="272727" w:themeColor="text1" w:themeTint="D8"/>
     </w:rPr>
   </w:style>
-  <w:style w:type="character" w:styleId="TitleChar" w:customStyle="1">
+  <w:style w:type="character" w:customStyle="1" w:styleId="TitleChar">
     <w:name w:val="Title Char"/>
     <w:basedOn w:val="DefaultParagraphFont"/>
     <w:link w:val="Title"/>
     <w:uiPriority w:val="10"/>
     <w:rsid w:val="002E4F4C"/>
     <w:rPr>
-      <w:rFonts w:asciiTheme="majorHAnsi" w:cstheme="majorBidi" w:eastAsiaTheme="majorEastAsia" w:hAnsiTheme="majorHAnsi"/>
+      <w:rFonts w:asciiTheme="majorHAnsi" w:eastAsiaTheme="majorEastAsia" w:hAnsiTheme="majorHAnsi" w:cstheme="majorBidi"/>
       <w:spacing w:val="-10"/>
       <w:kern w:val="28"/>
       <w:sz w:val="56"/>
       <w:szCs w:val="56"/>
     </w:rPr>
   </w:style>
-  <w:style w:type="character" w:styleId="SubtitleChar" w:customStyle="1">
+  <w:style w:type="character" w:customStyle="1" w:styleId="SubtitleChar">
     <w:name w:val="Subtitle Char"/>
     <w:basedOn w:val="DefaultParagraphFont"/>
     <w:link w:val="Subtitle"/>
     <w:uiPriority w:val="11"/>
     <w:rsid w:val="002E4F4C"/>
     <w:rPr>
-      <w:rFonts w:asciiTheme="minorHAnsi" w:cstheme="majorBidi" w:eastAsiaTheme="majorEastAsia" w:hAnsiTheme="minorHAnsi"/>
-      <w:color w:val="595959" w:themeColor="text1" w:themeTint="0000A6"/>
+      <w:rFonts w:asciiTheme="minorHAnsi" w:eastAsiaTheme="majorEastAsia" w:hAnsiTheme="minorHAnsi" w:cstheme="majorBidi"/>
+      <w:color w:val="595959" w:themeColor="text1" w:themeTint="A6"/>
       <w:spacing w:val="15"/>
       <w:sz w:val="28"/>
       <w:szCs w:val="28"/>
@@ -3007,51 +3104,51 @@
     <w:next w:val="Normal"/>
     <w:link w:val="QuoteChar"/>
     <w:uiPriority w:val="29"/>
-    <w:qFormat w:val="1"/>
+    <w:qFormat/>
     <w:rsid w:val="002E4F4C"/>
     <w:pPr>
       <w:spacing w:before="160"/>
       <w:jc w:val="center"/>
     </w:pPr>
     <w:rPr>
-      <w:i w:val="1"/>
-      <w:iCs w:val="1"/>
-      <w:color w:val="404040" w:themeColor="text1" w:themeTint="0000BF"/>
+      <w:i/>
+      <w:iCs/>
+      <w:color w:val="404040" w:themeColor="text1" w:themeTint="BF"/>
     </w:rPr>
   </w:style>
-  <w:style w:type="character" w:styleId="QuoteChar" w:customStyle="1">
+  <w:style w:type="character" w:customStyle="1" w:styleId="QuoteChar">
     <w:name w:val="Quote Char"/>
     <w:basedOn w:val="DefaultParagraphFont"/>
     <w:link w:val="Quote"/>
     <w:uiPriority w:val="29"/>
     <w:rsid w:val="002E4F4C"/>
     <w:rPr>
-      <w:i w:val="1"/>
-      <w:iCs w:val="1"/>
-      <w:color w:val="404040" w:themeColor="text1" w:themeTint="0000BF"/>
+      <w:i/>
+      <w:iCs/>
+      <w:color w:val="404040" w:themeColor="text1" w:themeTint="BF"/>
     </w:rPr>
   </w:style>
   <w:style w:type="paragraph" w:styleId="ListParagraph">
     <w:name w:val="List Paragraph"/>
     <w:basedOn w:val="Normal"/>
     <w:uiPriority w:val="34"/>
-    <w:qFormat w:val="1"/>
+    <w:qFormat/>
     <w:rsid w:val="002E4F4C"/>
     <w:pPr>
       <w:ind w:left="720"/>
-      <w:contextualSpacing w:val="1"/>
+      <w:contextualSpacing/>
     </w:pPr>
   </w:style>
   <w:style w:type="character" w:styleId="IntenseEmphasis">
     <w:name w:val="Intense Emphasis"/>
     <w:basedOn w:val="DefaultParagraphFont"/>
     <w:uiPriority w:val="21"/>
-    <w:qFormat w:val="1"/>
+    <w:qFormat/>
     <w:rsid w:val="002E4F4C"/>
     <w:rPr>
-      <w:i w:val="1"/>
-      <w:iCs w:val="1"/>
-      <w:color w:val="0f4761" w:themeColor="accent1" w:themeShade="0000BF"/>
+      <w:i/>
+      <w:iCs/>
+      <w:color w:val="0F4761" w:themeColor="accent1" w:themeShade="BF"/>
     </w:rPr>
   </w:style>
   <w:style w:type="paragraph" w:styleId="IntenseQuote">
@@ -3060,68 +3157,68 @@
     <w:next w:val="Normal"/>
     <w:link w:val="IntenseQuoteChar"/>
     <w:uiPriority w:val="30"/>
-    <w:qFormat w:val="1"/>
+    <w:qFormat/>
     <w:rsid w:val="002E4F4C"/>
     <w:pPr>
       <w:pBdr>
-        <w:top w:color="0f4761" w:space="10" w:sz="4" w:themeColor="accent1" w:themeShade="0000BF" w:val="single"/>
-        <w:bottom w:color="0f4761" w:space="10" w:sz="4" w:themeColor="accent1" w:themeShade="0000BF" w:val="single"/>
+        <w:top w:val="single" w:sz="4" w:space="10" w:color="0F4761" w:themeColor="accent1" w:themeShade="BF"/>
+        <w:bottom w:val="single" w:sz="4" w:space="10" w:color="0F4761" w:themeColor="accent1" w:themeShade="BF"/>
       </w:pBdr>
-      <w:spacing w:after="360" w:before="360"/>
+      <w:spacing w:before="360" w:after="360"/>
       <w:ind w:left="864" w:right="864"/>
       <w:jc w:val="center"/>
     </w:pPr>
     <w:rPr>
-      <w:i w:val="1"/>
-      <w:iCs w:val="1"/>
-      <w:color w:val="0f4761" w:themeColor="accent1" w:themeShade="0000BF"/>
+      <w:i/>
+      <w:iCs/>
+      <w:color w:val="0F4761" w:themeColor="accent1" w:themeShade="BF"/>
     </w:rPr>
   </w:style>
-  <w:style w:type="character" w:styleId="IntenseQuoteChar" w:customStyle="1">
+  <w:style w:type="character" w:customStyle="1" w:styleId="IntenseQuoteChar">
     <w:name w:val="Intense Quote Char"/>
     <w:basedOn w:val="DefaultParagraphFont"/>
     <w:link w:val="IntenseQuote"/>
     <w:uiPriority w:val="30"/>
     <w:rsid w:val="002E4F4C"/>
     <w:rPr>
-      <w:i w:val="1"/>
-      <w:iCs w:val="1"/>
-      <w:color w:val="0f4761" w:themeColor="accent1" w:themeShade="0000BF"/>
+      <w:i/>
+      <w:iCs/>
+      <w:color w:val="0F4761" w:themeColor="accent1" w:themeShade="BF"/>
     </w:rPr>
   </w:style>
   <w:style w:type="character" w:styleId="IntenseReference">
     <w:name w:val="Intense Reference"/>
     <w:basedOn w:val="DefaultParagraphFont"/>
     <w:uiPriority w:val="32"/>
-    <w:qFormat w:val="1"/>
+    <w:qFormat/>
     <w:rsid w:val="002E4F4C"/>
     <w:rPr>
-      <w:b w:val="1"/>
-      <w:bCs w:val="1"/>
-      <w:smallCaps w:val="1"/>
-      <w:color w:val="0f4761" w:themeColor="accent1" w:themeShade="0000BF"/>
+      <w:b/>
+      <w:bCs/>
+      <w:smallCaps/>
+      <w:color w:val="0F4761" w:themeColor="accent1" w:themeShade="BF"/>
       <w:spacing w:val="5"/>
     </w:rPr>
   </w:style>
   <w:style w:type="paragraph" w:styleId="NoSpacing">
     <w:name w:val="No Spacing"/>
     <w:uiPriority w:val="1"/>
-    <w:qFormat w:val="1"/>
+    <w:qFormat/>
     <w:rsid w:val="002E4F4C"/>
     <w:pPr>
       <w:spacing w:after="0" w:line="240" w:lineRule="auto"/>
     </w:pPr>
   </w:style>
-  <w:style w:type="paragraph" w:styleId="Toni1" w:customStyle="1">
+  <w:style w:type="paragraph" w:customStyle="1" w:styleId="Toni1">
     <w:name w:val="Toni 1"/>
     <w:basedOn w:val="Normal"/>
     <w:next w:val="NoSpacing"/>
     <w:link w:val="Toni1Char"/>
-    <w:autoRedefine w:val="1"/>
-    <w:qFormat w:val="1"/>
+    <w:autoRedefine/>
+    <w:qFormat/>
     <w:rsid w:val="002E4F4C"/>
   </w:style>
-  <w:style w:type="character" w:styleId="Toni1Char" w:customStyle="1">
+  <w:style w:type="character" w:customStyle="1" w:styleId="Toni1Char">
     <w:name w:val="Toni 1 Char"/>
     <w:basedOn w:val="DefaultParagraphFont"/>
     <w:link w:val="Toni1"/>
@@ -3131,7 +3228,7 @@
     <w:name w:val="Hyperlink"/>
     <w:basedOn w:val="DefaultParagraphFont"/>
     <w:uiPriority w:val="99"/>
-    <w:unhideWhenUsed w:val="1"/>
+    <w:unhideWhenUsed/>
     <w:rsid w:val="002E4F4C"/>
     <w:rPr>
       <w:color w:val="467886" w:themeColor="hyperlink"/>
@@ -3142,21 +3239,23 @@
     <w:name w:val="Unresolved Mention"/>
     <w:basedOn w:val="DefaultParagraphFont"/>
     <w:uiPriority w:val="99"/>
-    <w:semiHidden w:val="1"/>
-    <w:unhideWhenUsed w:val="1"/>
+    <w:semiHidden/>
+    <w:unhideWhenUsed/>
     <w:rsid w:val="002E4F4C"/>
     <w:rPr>
-      <w:color w:val="605e5c"/>
-      <w:shd w:color="auto" w:fill="e1dfdd" w:val="clear"/>
+      <w:color w:val="605E5C"/>
+      <w:shd w:val="clear" w:color="auto" w:fill="E1DFDD"/>
     </w:rPr>
   </w:style>
   <w:style w:type="paragraph" w:styleId="Subtitle">
     <w:name w:val="Subtitle"/>
     <w:basedOn w:val="Normal"/>
     <w:next w:val="Normal"/>
-    <w:pPr/>
+    <w:link w:val="SubtitleChar"/>
+    <w:uiPriority w:val="11"/>
+    <w:qFormat/>
     <w:rPr>
-      <w:rFonts w:ascii="Aptos" w:cs="Aptos" w:eastAsia="Aptos" w:hAnsi="Aptos"/>
+      <w:rFonts w:ascii="Aptos" w:eastAsia="Aptos" w:hAnsi="Aptos" w:cs="Aptos"/>
       <w:color w:val="595959"/>
       <w:sz w:val="28"/>
       <w:szCs w:val="28"/>
@@ -3460,17 +3559,17 @@
 </a:theme>
 </file>
 
-<file path=customXML/item1.xml><?xml version="1.0" encoding="utf-8"?>
+<file path=customXml/item1.xml><?xml version="1.0" encoding="utf-8"?>
 <go:gDocsCustomXmlDataStorage xmlns:go="http://customooxmlschemas.google.com/" xmlns:r="http://schemas.openxmlformats.org/officeDocument/2006/relationships" uri="GoogleDocsCustomDataVersion2">
   <go:docsCustomData xmlns:go="http://customooxmlschemas.google.com/" roundtripDataSignature="AMtx7mhS9+G38yg9H+qZGhYYi67C5Awaeg==">CgMxLjAyDmgubmh0dnphMXFnYTdoMg5oLm91czlwajdod2Z2aDIOaC5tbzY5dmcyNmtna3AyDmguNnIwYmU5OXh1NGh0Mg5oLnU2bHlsbmZtenFuNjIOaC45eTJrYXphbnk0NG0yDmgueHkybmYxdXZjMTlmMg5oLnhxdmZrYm55ZWVseTIOaC54MWtzbGN4dDFhd2gyDmguNXVjZjZtYzlxbjVkMg5oLnRjOG92YjM0cWEwNjIOaC5pZ2EwMnVkNGl0dTkyDmgueGtuZjFxdnduMjRxMg5oLm9mMWxwcmlscnJxMjgAciExTHNCbnhNQ2FwU0RmOVFTSHk4Xy1BNzBGREM0YTIyM0g=</go:docsCustomData>
 </go:gDocsCustomXmlDataStorage>
 </file>
 
-<file path=customXML/itemProps1.xml><?xml version="1.0" encoding="utf-8"?>
+<file path=customXml/itemProps1.xml><?xml version="1.0" encoding="utf-8"?>
 <ds:datastoreItem xmlns:ds="http://schemas.openxmlformats.org/officeDocument/2006/customXml" ds:itemID="{11111111-1234-1234-1234-123412341234}">
   <ds:schemaRefs>
+    <ds:schemaRef ds:uri="http://customooxmlschemas.google.com/"/>
     <ds:schemaRef ds:uri="http://schemas.openxmlformats.org/officeDocument/2006/relationships"/>
-    <ds:schemaRef ds:uri="http://customooxmlschemas.google.com/"/>
   </ds:schemaRefs>
 </ds:datastoreItem>
 </file>
</xml_diff>

<commit_message>
Update portfolio with Crime project and new CV
</commit_message>
<xml_diff>
--- a/public/Sihle_Kalolo_CV.docx
+++ b/public/Sihle_Kalolo_CV.docx
@@ -133,7 +133,25 @@
         <w:spacing w:before="240" w:after="240" w:line="240" w:lineRule="auto"/>
       </w:pPr>
       <w:r>
-        <w:t>Motivated and hands-on Data Analyst &amp; aspiring Data Scientist with practical experience building and deploying real world data solutions. Strong foundation in Python, SQL, and problem-solving, with a focus on writing clean, efficient code and delivering working solutions.</w:t>
+        <w:t>Motivated and hands-on</w:t>
+      </w:r>
+      <w:r>
+        <w:t xml:space="preserve"> </w:t>
+      </w:r>
+      <w:r>
+        <w:t xml:space="preserve">Data </w:t>
+      </w:r>
+      <w:r>
+        <w:t>Scientist</w:t>
+      </w:r>
+      <w:r>
+        <w:t xml:space="preserve"> with practical experience building and deploying </w:t>
+      </w:r>
+      <w:r>
+        <w:t>real-world</w:t>
+      </w:r>
+      <w:r>
+        <w:t xml:space="preserve"> data solutions. Strong foundation in Python, SQL, and problem-solving, with a focus on writing clean, efficient code and delivering working solutions.</w:t>
       </w:r>
     </w:p>
     <w:p>
@@ -512,13 +530,8 @@
         <w:spacing w:after="240" w:line="240" w:lineRule="auto"/>
       </w:pPr>
       <w:r>
-        <w:t xml:space="preserve">Google </w:t>
-      </w:r>
-      <w:proofErr w:type="spellStart"/>
-      <w:r>
-        <w:t>Colab</w:t>
-      </w:r>
-      <w:proofErr w:type="spellEnd"/>
+        <w:t>Google Colab</w:t>
+      </w:r>
     </w:p>
     <w:p>
       <w:pPr>
@@ -664,16 +677,7 @@
           <w:sz w:val="26"/>
           <w:szCs w:val="26"/>
         </w:rPr>
-        <w:t>Data Analyst / Data Scientist</w:t>
-      </w:r>
-      <w:r>
-        <w:rPr>
-          <w:rFonts w:ascii="Arial" w:eastAsia="Arial" w:hAnsi="Arial" w:cs="Arial"/>
-          <w:color w:val="000000"/>
-          <w:sz w:val="26"/>
-          <w:szCs w:val="26"/>
-        </w:rPr>
-        <w:t xml:space="preserve"> intern</w:t>
+        <w:t>Data Scientist</w:t>
       </w:r>
     </w:p>
     <w:p>
@@ -701,7 +705,7 @@
         <w:spacing w:before="240" w:after="0" w:line="240" w:lineRule="auto"/>
       </w:pPr>
       <w:r>
-        <w:t>Wrote complex SQL queries to extract and analyse 1.5M+ monthly operational records from 50+ monitoring stations.</w:t>
+        <w:t>Wrote complex SQL queries to extract and analyse monthly operational records from monitoring stations.</w:t>
       </w:r>
     </w:p>
     <w:p>
@@ -713,7 +717,7 @@
         <w:spacing w:after="0" w:line="240" w:lineRule="auto"/>
       </w:pPr>
       <w:r>
-        <w:t>Built interactive Power BI dashboards used by stakeholders, reducing reporting time from 5 days to 3 hours.</w:t>
+        <w:t>Built interactive Power BI dashboards used by stakeholders, reducing reporting time.</w:t>
       </w:r>
     </w:p>
     <w:p>
@@ -775,21 +779,7 @@
         <w:rPr>
           <w:color w:val="0F1115"/>
         </w:rPr>
-        <w:t xml:space="preserve">Incorporated </w:t>
-      </w:r>
-      <w:proofErr w:type="spellStart"/>
-      <w:r>
-        <w:rPr>
-          <w:color w:val="0F1115"/>
-        </w:rPr>
-        <w:t>MLOps</w:t>
-      </w:r>
-      <w:proofErr w:type="spellEnd"/>
-      <w:r>
-        <w:rPr>
-          <w:color w:val="0F1115"/>
-        </w:rPr>
-        <w:t xml:space="preserve"> best practices across the model lifecycle:</w:t>
+        <w:t>Incorporated MLOps best practices across the model lifecycle:</w:t>
       </w:r>
     </w:p>
     <w:p>

</xml_diff>

<commit_message>
Add animated scroll indicator to hero section
</commit_message>
<xml_diff>
--- a/public/Sihle_Kalolo_CV.docx
+++ b/public/Sihle_Kalolo_CV.docx
@@ -147,6 +147,9 @@
         <w:t>Scientist</w:t>
       </w:r>
       <w:r>
+        <w:t xml:space="preserve"> and Data Analyst</w:t>
+      </w:r>
+      <w:r>
         <w:t xml:space="preserve"> with practical experience building and deploying </w:t>
       </w:r>
       <w:r>
@@ -483,6 +486,7 @@
           <w:sz w:val="26"/>
           <w:szCs w:val="26"/>
         </w:rPr>
+        <w:lastRenderedPageBreak/>
         <w:t>Tools &amp; Platforms</w:t>
       </w:r>
     </w:p>
@@ -495,7 +499,6 @@
         <w:spacing w:before="240" w:after="0" w:line="240" w:lineRule="auto"/>
       </w:pPr>
       <w:r>
-        <w:lastRenderedPageBreak/>
         <w:t>AWS S3</w:t>
       </w:r>
     </w:p>
@@ -532,8 +535,13 @@
         <w:spacing w:after="240" w:line="240" w:lineRule="auto"/>
       </w:pPr>
       <w:r>
-        <w:t>Google Colab</w:t>
-      </w:r>
+        <w:t xml:space="preserve">Google </w:t>
+      </w:r>
+      <w:proofErr w:type="spellStart"/>
+      <w:r>
+        <w:t>Colab</w:t>
+      </w:r>
+      <w:proofErr w:type="spellEnd"/>
     </w:p>
     <w:p>
       <w:pPr>
@@ -681,6 +689,15 @@
         </w:rPr>
         <w:t>Data Scientist</w:t>
       </w:r>
+      <w:r>
+        <w:rPr>
+          <w:rFonts w:ascii="Arial" w:eastAsia="Arial" w:hAnsi="Arial" w:cs="Arial"/>
+          <w:color w:val="000000"/>
+          <w:sz w:val="26"/>
+          <w:szCs w:val="26"/>
+        </w:rPr>
+        <w:t xml:space="preserve"> / Data Analyst</w:t>
+      </w:r>
     </w:p>
     <w:p>
       <w:pPr>
@@ -781,7 +798,21 @@
         <w:rPr>
           <w:color w:val="0F1115"/>
         </w:rPr>
-        <w:t>Incorporated MLOps best practices across the model lifecycle:</w:t>
+        <w:t xml:space="preserve">Incorporated </w:t>
+      </w:r>
+      <w:proofErr w:type="spellStart"/>
+      <w:r>
+        <w:rPr>
+          <w:color w:val="0F1115"/>
+        </w:rPr>
+        <w:t>MLOps</w:t>
+      </w:r>
+      <w:proofErr w:type="spellEnd"/>
+      <w:r>
+        <w:rPr>
+          <w:color w:val="0F1115"/>
+        </w:rPr>
+        <w:t xml:space="preserve"> best practices across the model lifecycle:</w:t>
       </w:r>
     </w:p>
     <w:p>
@@ -932,6 +963,7 @@
           <w:sz w:val="26"/>
           <w:szCs w:val="26"/>
         </w:rPr>
+        <w:lastRenderedPageBreak/>
         <w:t>Technical Mentor</w:t>
       </w:r>
     </w:p>
@@ -944,7 +976,6 @@
         </w:rPr>
       </w:pPr>
       <w:r>
-        <w:lastRenderedPageBreak/>
         <w:t>WeThinkCode_ – Durban</w:t>
       </w:r>
       <w:r>
@@ -1291,6 +1322,7 @@
         <w:spacing w:before="240" w:after="0" w:line="240" w:lineRule="auto"/>
       </w:pPr>
       <w:r>
+        <w:lastRenderedPageBreak/>
         <w:t>Patient and supportive mentor for learners at all skill levels</w:t>
       </w:r>
     </w:p>
@@ -1303,7 +1335,6 @@
         <w:spacing w:after="0" w:line="240" w:lineRule="auto"/>
       </w:pPr>
       <w:r>
-        <w:lastRenderedPageBreak/>
         <w:t>Strong ability to explain complex technical concepts in simple, structured ways</w:t>
       </w:r>
     </w:p>

</xml_diff>